<commit_message>
Thêm so sánh 5 mô hình hồi quy, cập nhật báo cáo và README
</commit_message>
<xml_diff>
--- a/Nhom08_Bao_cao.docx
+++ b/Nhom08_Bao_cao.docx
@@ -882,7 +882,7 @@
         <w:jc w:val="both"/>
       </w:pPr>
       <w:r>
-        <w:t xml:space="preserve">Đề tài phân tích thăm dò bộ dữ liệu Sleep Health and Lifestyle và xây dựng mô hình hồi quy dự đoán chất lượng giấc ngủ, với mục tiêu xác định những yếu tố lối sống và sức khỏe có liên hệ với giấc ngủ và đo mức độ dự đoán được của chất lượng giấc ngủ. Nhóm thực hiện theo quy trình gồm tiền xử lý dữ liệu, trực quan hóa và phân tích thăm dò, xây dựng các mô hình hồi quy tuyến tính, đa thức và Ridge, sau đó đánh giá mô hình bằng cách chia tập huấn luyện và kiểm tra kết hợp kiểm định chéo; toàn bộ kết quả được trình bày trên một dashboard tương tác viết bằng Streamlit. Kết quả cho thấy chất lượng giấc ngủ tương quan mạnh nhất với mức độ căng thẳng (r = −0.90) và thời lượng ngủ (r = 0.88); 93% người có chỉ số BMI bình thường không mắc rối loạn giấc ngủ, so với 13% ở nhóm thừa cân. Mô hình hồi quy tuyến tính bốn biến đạt R² = 0.914 trên tập kiểm tra và R² trung bình 0.875 qua kiểm định chéo 5 phần; mô hình Ridge trên đặc trưng đa thức bậc 3 đạt R² = 0.953 trên tập kiểm tra.</w:t>
+        <w:t xml:space="preserve">Đề tài phân tích thăm dò bộ dữ liệu Sleep Health and Lifestyle và xây dựng mô hình hồi quy dự đoán chất lượng giấc ngủ, với mục tiêu xác định những yếu tố lối sống và sức khỏe có liên hệ với giấc ngủ và đo mức độ dự đoán được của chất lượng giấc ngủ. Nhóm thực hiện theo quy trình gồm tiền xử lý dữ liệu, trực quan hóa và phân tích thăm dò, xây dựng bốn mô hình hồi quy (tuyến tính đơn, đa thức, tuyến tính đa biến, đa thức đa biến) cùng mô hình Ridge để so sánh, sau đó đánh giá các mô hình bằng cách chia tập huấn luyện và kiểm tra kết hợp kiểm định chéo; toàn bộ kết quả được trình bày trên một dashboard tương tác viết bằng Streamlit. Kết quả cho thấy chất lượng giấc ngủ tương quan mạnh nhất với mức độ căng thẳng (r = −0.90) và thời lượng ngủ (r = 0.88); khoảng 95% người mắc rối loạn giấc ngủ có huyết áp từ 130/85 mmHg trở lên, so với 28% ở nhóm không mắc. Trong năm mô hình được so sánh, mô hình đa thức bậc 2 trên bốn biến cho kết quả tốt nhất, với R² = 0.950 trên tập kiểm tra và R² trung bình 0.944 qua kiểm định chéo 5 phần; mô hình tuyến tính bốn biến đạt lần lượt 0.914 và 0.875.</w:t>
       </w:r>
     </w:p>
     <w:p>
@@ -2364,7 +2364,7 @@
         <w:jc w:val="both"/>
       </w:pPr>
       <w:r>
-        <w:t xml:space="preserve">Bộ dữ liệu có hai đặc điểm ảnh hưởng đến cách phân tích. Thứ nhất, 219 giá trị khuyết ở cột Sleep Disorder không phải là dữ liệu thiếu: file gốc ghi chữ “None” cho người không mắc rối loạn, và pandas mặc định hiểu chữ này là giá trị khuyết. Thứ hai, dữ liệu trùng lặp nhiều: trong 374 dòng chỉ có 132 hồ sơ khác nhau, các dòng còn lại giống hệt nhau ở mọi cột trừ Person ID. Ngoài ra, một số nhóm có rất ít quan sát: bốn nghề chỉ có từ 1 đến 4 người và nhóm BMI Obese chỉ có 10 người, nên nhóm không rút kết luận riêng cho các nhóm này.</w:t>
+        <w:t xml:space="preserve">Bộ dữ liệu có hai đặc điểm ảnh hưởng đến cách phân tích. Thứ nhất, 219 giá trị khuyết ở cột Sleep Disorder không phải là dữ liệu thiếu: file gốc ghi chữ “None” cho người không mắc rối loạn, và pandas mặc định hiểu chữ này là giá trị khuyết. Thứ hai, dữ liệu trùng lặp nhiều: trong 374 dòng chỉ có 132 hồ sơ khác nhau, các dòng còn lại giống hệt nhau ở mọi cột trừ Person ID.</w:t>
       </w:r>
     </w:p>
     <w:p>
@@ -2552,7 +2552,7 @@
         <w:jc w:val="both"/>
       </w:pPr>
       <w:r>
-        <w:t xml:space="preserve">Biến mục tiêu là Quality of Sleep. Bốn biến đầu vào gồm Sleep Duration, Stress Level, Heart Rate và Physical Activity Level. Nhóm xây dựng lần lượt hồi quy tuyến tính đơn, hồi quy đa thức, hồi quy tuyến tính đa biến và hồi quy Ridge trên đặc trưng đa thức bậc 3 đã chuẩn hóa.</w:t>
+        <w:t xml:space="preserve">Biến mục tiêu là Quality of Sleep. Bốn biến đầu vào gồm Sleep Duration, Stress Level, Heart Rate và Physical Activity Level. Nhóm xây dựng bốn mô hình hồi quy với độ phức tạp tăng dần: tuyến tính đơn, đa thức bậc 2 một biến, tuyến tính đa biến và đa thức bậc 2 đa biến (có chuẩn hóa dữ liệu). Mô hình Ridge trên đặc trưng đa thức bậc 3 được thêm vào làm mô hình so sánh, để kiểm tra xem tăng độ phức tạp kèm điều chuẩn có cải thiện kết quả hay không.</w:t>
       </w:r>
     </w:p>
     <w:p>
@@ -2562,7 +2562,7 @@
         <w:jc w:val="both"/>
       </w:pPr>
       <w:r>
-        <w:t xml:space="preserve">Vì dữ liệu trùng lặp nhiều, nếu chia tập huấn luyện và tập kiểm tra ngẫu nhiên theo dòng với tỷ lệ 70/30 thì 100 trên 113 dòng của tập kiểm tra có bản sao giống hệt trong tập huấn luyện, khiến R² trên tập kiểm tra không còn phản ánh khả năng dự đoán dữ liệu mới. Để tránh rò rỉ dữ liệu, nhóm chia theo hồ sơ: các dòng giống hệt nhau luôn nằm cùng một tập (GroupShuffleSplit của scikit-learn [2], random_state = 42), cho 274 dòng huấn luyện và 100 dòng kiểm tra. Kiểm định chéo 5 phần cũng chia theo hồ sơ (GroupKFold). Hệ số điều chuẩn alpha của Ridge được chọn bằng kiểm định chéo trên tập huấn luyện; tập kiểm tra chỉ dùng một lần để báo cáo kết quả cuối cùng.</w:t>
+        <w:t xml:space="preserve">Vì dữ liệu trùng lặp nhiều, nếu chia tập huấn luyện và tập kiểm tra ngẫu nhiên theo dòng với tỷ lệ 70/30 thì 100 trên 113 dòng của tập kiểm tra có bản sao giống hệt trong tập huấn luyện, khiến R² trên tập kiểm tra không còn phản ánh khả năng dự đoán dữ liệu mới. Để tránh rò rỉ dữ liệu, nhóm chia theo hồ sơ: các dòng giống hệt nhau luôn nằm cùng một tập (GroupShuffleSplit của scikit-learn [2], random_state = 42), cho 274 dòng huấn luyện và 100 dòng kiểm tra. Kiểm định chéo 5 phần cũng chia theo hồ sơ (GroupKFold). Hệ số điều chuẩn alpha của Ridge được chọn bằng kiểm định chéo trên tập huấn luyện. Để kiểm tra độ ổn định, việc chia dữ liệu được lặp lại 30 lần với các cách chia khác nhau.</w:t>
       </w:r>
     </w:p>
     <w:p>
@@ -2587,7 +2587,7 @@
         <w:jc w:val="both"/>
       </w:pPr>
       <w:r>
-        <w:t xml:space="preserve">Đề tài sử dụng Python với các thư viện pandas, NumPy, Matplotlib, Seaborn, Plotly, SciPy, scikit-learn [2] và Streamlit [3]. Sản phẩm gồm một dashboard Streamlit bảy trang (tổng quan, tiền xử lý, trực quan hóa, công cụ trực quan, phân tích thăm dò, mô hình hồi quy, đánh giá mô hình) có bộ lọc theo giới tính và nhóm BMI, cùng một notebook minh họa từng bước. Để tái lập kết quả, cài các thư viện liệt kê trong file requirements.txt rồi chạy file app.py bằng Streamlit từ thư mục gốc của mã nguồn; mọi con số trong báo cáo tương ứng với trạng thái không áp dụng bộ lọc trên dashboard và cũng được in ra khi chạy lại notebook Code_demo.ipynb.</w:t>
+        <w:t xml:space="preserve">Đề tài sử dụng Python với các thư viện pandas, NumPy, Matplotlib, Seaborn, Plotly, SciPy, scikit-learn [2] và Streamlit [3]. Sản phẩm gồm một dashboard Streamlit bảy trang có bộ lọc theo giới tính và nhóm BMI, cùng một notebook minh họa từng bước. Để tái lập kết quả, cài các thư viện liệt kê trong file requirements.txt rồi chạy file app.py bằng Streamlit từ thư mục gốc của mã nguồn; mọi con số trong báo cáo tương ứng với trạng thái không áp dụng bộ lọc trên dashboard và cũng được in ra khi chạy lại notebook Code_demo.ipynb.</w:t>
       </w:r>
     </w:p>
     <w:p>
@@ -2599,7 +2599,17 @@
         <w:tab/>
       </w:r>
       <w:r>
-        <w:t xml:space="preserve">KẾT QUẢ PHÂN TÍCH THĂM DÒ</w:t>
+        <w:t xml:space="preserve">TRỰC QUAN HÓA VÀ PHÂN TÍCH DỮ LIỆU</w:t>
+      </w:r>
+    </w:p>
+    <w:p>
+      <w:pPr>
+        <w:pStyle w:val="BT"/>
+        <w:spacing w:before="0" w:after="120" w:line="276" w:lineRule="auto"/>
+        <w:jc w:val="both"/>
+      </w:pPr>
+      <w:r>
+        <w:t xml:space="preserve">Phần này trình bày ba biểu đồ được chọn lọc từ hai trang “Trực quan hóa dữ liệu” và “Công cụ trực quan” của dashboard. Với mỗi biểu đồ, nhóm nêu kết quả khám phá được và phân tích ý nghĩa của kết quả đó. Về tổng thể, 58.6% số người trong dữ liệu không mắc rối loạn giấc ngủ, 20.9% mắc Sleep Apnea (ngưng thở khi ngủ) và 20.6% mắc Insomnia (mất ngủ). Thời lượng ngủ trung bình của ba nhóm này lần lượt là 7.36, 7.03 và 6.59 giờ; kiểm định ANOVA một yếu tố cho F = 31.91, p ≈ 1.6 × 10⁻¹³, tức sự khác biệt có ý nghĩa thống kê ở mức 0.05.</w:t>
       </w:r>
     </w:p>
     <w:p>
@@ -2614,7 +2624,7 @@
         <w:rPr>
           <w:sz w:val="26"/>
         </w:rPr>
-        <w:t xml:space="preserve">Thể trạng và rối loạn giấc ngủ</w:t>
+        <w:t xml:space="preserve">Biểu đồ diện tích: rối loạn giấc ngủ theo nhóm tuổi</w:t>
       </w:r>
     </w:p>
     <w:p>
@@ -2624,7 +2634,7 @@
         <w:jc w:val="both"/>
       </w:pPr>
       <w:r>
-        <w:t xml:space="preserve">Trong toàn bộ dữ liệu, 58.6% số người không mắc rối loạn giấc ngủ, 20.9% mắc Sleep Apnea và 20.6% mắc Insomnia. Hình 2 cho thấy tỷ lệ này khác nhau rất rõ giữa các nhóm BMI.</w:t>
+        <w:t xml:space="preserve">Hình 2 là biểu đồ diện tích tích lũy, thể hiện số người theo tình trạng rối loạn giấc ngủ ở ba nhóm tuổi.</w:t>
       </w:r>
     </w:p>
     <w:p>
@@ -2638,7 +2648,7 @@
       <w:r>
         <w:drawing>
           <wp:inline distT="0" distB="0" distL="0" distR="0">
-            <wp:extent cx="3780000" cy="2548923"/>
+            <wp:extent cx="3528000" cy="2188253"/>
             <wp:effectExtent l="0" t="0" r="0" b="0"/>
             <wp:docPr id="202" name="Hinh 2"/>
             <wp:cNvGraphicFramePr>
@@ -2648,7 +2658,7 @@
               <a:graphicData uri="http://schemas.openxmlformats.org/drawingml/2006/picture">
                 <pic:pic xmlns:pic="http://schemas.openxmlformats.org/drawingml/2006/picture">
                   <pic:nvPicPr>
-                    <pic:cNvPr id="202" name="c8_0.png"/>
+                    <pic:cNvPr id="202" name="c11_0.png"/>
                     <pic:cNvPicPr/>
                   </pic:nvPicPr>
                   <pic:blipFill>
@@ -2660,7 +2670,7 @@
                   <pic:spPr>
                     <a:xfrm>
                       <a:off x="0" y="0"/>
-                      <a:ext cx="3780000" cy="2548923"/>
+                      <a:ext cx="3528000" cy="2188253"/>
                     </a:xfrm>
                     <a:prstGeom prst="rect">
                       <a:avLst/>
@@ -2689,7 +2699,7 @@
           <w:i/>
           <w:iCs/>
         </w:rPr>
-        <w:t xml:space="preserve">Hình 2. Số người theo tình trạng rối loạn giấc ngủ ở từng nhóm BMI</w:t>
+        <w:t xml:space="preserve">Hình 2. Biểu đồ diện tích: rối loạn giấc ngủ theo nhóm tuổi</w:t>
       </w:r>
     </w:p>
     <w:p>
@@ -2699,7 +2709,17 @@
         <w:jc w:val="both"/>
       </w:pPr>
       <w:r>
-        <w:t xml:space="preserve">Ở nhóm Normal, 200 trên 216 người (93%) không mắc rối loạn. Ở nhóm Overweight, 129 trên 148 người (87%) mắc rối loạn, trong đó Insomnia (64 người) và Sleep Apnea (65 người) gần như ngang nhau. Cả 10 người thuộc nhóm Obese đều mắc một dạng rối loạn. Đây là mối liên hệ rõ nhất mà nhóm tìm thấy trong dữ liệu.</w:t>
+        <w:t xml:space="preserve">Kết quả khám phá: nhóm 20–35 hầu hết không mắc rối loạn (80 trên 94 người). Insomnia tập trung ở nhóm 36–50 với 65 người, rồi giảm còn 7 người ở nhóm 51–65. Ngược lại, Sleep Apnea tăng dần theo tuổi, từ 9 người ở nhóm 20–35 lên 36 người ở nhóm 36–50 và chiếm tỷ lệ cao nhất ở nhóm 51–65 (33 trên 76 người).</w:t>
+      </w:r>
+    </w:p>
+    <w:p>
+      <w:pPr>
+        <w:pStyle w:val="BT"/>
+        <w:spacing w:before="0" w:after="120" w:line="276" w:lineRule="auto"/>
+        <w:jc w:val="both"/>
+      </w:pPr>
+      <w:r>
+        <w:t xml:space="preserve">Phân tích: hai dạng rối loạn có phân bố theo tuổi khác nhau, nên không thể gộp chung thành một nhận định “càng lớn tuổi càng rối loạn giấc ngủ”. Mất ngủ là vấn đề nổi bật của tuổi trung niên, còn ngưng thở khi ngủ là vấn đề nổi bật của nhóm lớn tuổi nhất trong dữ liệu.</w:t>
       </w:r>
     </w:p>
     <w:p>
@@ -2714,7 +2734,7 @@
         <w:rPr>
           <w:sz w:val="26"/>
         </w:rPr>
-        <w:t xml:space="preserve">Độ tuổi và rối loạn giấc ngủ</w:t>
+        <w:t xml:space="preserve">Biểu đồ phân tán: huyết áp và rối loạn giấc ngủ</w:t>
       </w:r>
     </w:p>
     <w:p>
@@ -2724,7 +2744,7 @@
         <w:jc w:val="both"/>
       </w:pPr>
       <w:r>
-        <w:t xml:space="preserve">Hình 3 trình bày số người theo tình trạng rối loạn giấc ngủ ở ba nhóm tuổi.</w:t>
+        <w:t xml:space="preserve">Hình 3 là biểu đồ phân tán giữa huyết áp tâm thu và huyết áp tâm trương, tô màu theo tình trạng rối loạn giấc ngủ; kích thước mỗi điểm tỷ lệ với số người có cùng giá trị, hai đường nét đứt đánh dấu mức 130/85 mmHg.</w:t>
       </w:r>
     </w:p>
     <w:p>
@@ -2738,7 +2758,7 @@
       <w:r>
         <w:drawing>
           <wp:inline distT="0" distB="0" distL="0" distR="0">
-            <wp:extent cx="4068000" cy="2523189"/>
+            <wp:extent cx="3816000" cy="2385000"/>
             <wp:effectExtent l="0" t="0" r="0" b="0"/>
             <wp:docPr id="203" name="Hinh 3"/>
             <wp:cNvGraphicFramePr>
@@ -2748,7 +2768,7 @@
               <a:graphicData uri="http://schemas.openxmlformats.org/drawingml/2006/picture">
                 <pic:pic xmlns:pic="http://schemas.openxmlformats.org/drawingml/2006/picture">
                   <pic:nvPicPr>
-                    <pic:cNvPr id="203" name="c11_0.png"/>
+                    <pic:cNvPr id="203" name="bp_scatter.png"/>
                     <pic:cNvPicPr/>
                   </pic:nvPicPr>
                   <pic:blipFill>
@@ -2760,7 +2780,7 @@
                   <pic:spPr>
                     <a:xfrm>
                       <a:off x="0" y="0"/>
-                      <a:ext cx="4068000" cy="2523189"/>
+                      <a:ext cx="3816000" cy="2385000"/>
                     </a:xfrm>
                     <a:prstGeom prst="rect">
                       <a:avLst/>
@@ -2789,7 +2809,7 @@
           <w:i/>
           <w:iCs/>
         </w:rPr>
-        <w:t xml:space="preserve">Hình 3. Rối loạn giấc ngủ theo nhóm tuổi</w:t>
+        <w:t xml:space="preserve">Hình 3. Biểu đồ phân tán: huyết áp tâm thu và tâm trương theo rối loạn giấc ngủ</w:t>
       </w:r>
     </w:p>
     <w:p>
@@ -2799,7 +2819,17 @@
         <w:jc w:val="both"/>
       </w:pPr>
       <w:r>
-        <w:t xml:space="preserve">Nhóm 20–35 hầu hết không mắc rối loạn (80 trên 94 người). Insomnia tập trung ở nhóm 36–50 với 65 người, rồi giảm còn 7 người ở nhóm 51–65. Ngược lại, Sleep Apnea tăng dần theo tuổi và chiếm tỷ lệ cao nhất ở nhóm 51–65 (33 trên 76 người). Như vậy hai dạng rối loạn có phân bố theo tuổi khác nhau.</w:t>
+        <w:t xml:space="preserve">Kết quả khám phá: các nhóm tách thành cụm khá rõ. Khoảng 95% người mắc Insomnia (73 trên 77) và 95% người mắc Sleep Apnea (74 trên 78) có huyết áp từ 130/85 mmHg trở lên, trong khi tỷ lệ này ở nhóm không mắc rối loạn chỉ là 28% (61 trên 219). Riêng nhóm Sleep Apnea tập trung ở góc cao nhất của biểu đồ: 59 trên 78 người có huyết áp đúng bằng 140/95 mmHg.</w:t>
+      </w:r>
+    </w:p>
+    <w:p>
+      <w:pPr>
+        <w:pStyle w:val="BT"/>
+        <w:spacing w:before="0" w:after="120" w:line="276" w:lineRule="auto"/>
+        <w:jc w:val="both"/>
+      </w:pPr>
+      <w:r>
+        <w:t xml:space="preserve">Phân tích: rối loạn giấc ngủ, đặc biệt là ngưng thở khi ngủ, đi kèm với huyết áp cao trong bộ dữ liệu này. Vì dữ liệu chỉ ghi nhận tại một thời điểm, biểu đồ cho thấy mối liên hệ chứ chưa cho biết yếu tố nào là nguyên nhân.</w:t>
       </w:r>
     </w:p>
     <w:p>
@@ -2814,7 +2844,7 @@
         <w:rPr>
           <w:sz w:val="26"/>
         </w:rPr>
-        <w:t xml:space="preserve">Các yếu tố liên hệ với chất lượng giấc ngủ</w:t>
+        <w:t xml:space="preserve">Bản đồ nhiệt: tương quan giữa các biến số</w:t>
       </w:r>
     </w:p>
     <w:p>
@@ -2824,7 +2854,7 @@
         <w:jc w:val="both"/>
       </w:pPr>
       <w:r>
-        <w:t xml:space="preserve">Hình 4 là ma trận hệ số tương quan Pearson giữa các biến số.</w:t>
+        <w:t xml:space="preserve">Hình 4 là bản đồ nhiệt của ma trận hệ số tương quan Pearson giữa chín biến số, dùng để tìm các yếu tố liên hệ với chất lượng giấc ngủ.</w:t>
       </w:r>
     </w:p>
     <w:p>
@@ -2838,7 +2868,7 @@
       <w:r>
         <w:drawing>
           <wp:inline distT="0" distB="0" distL="0" distR="0">
-            <wp:extent cx="4140000" cy="3323661"/>
+            <wp:extent cx="3456000" cy="2774535"/>
             <wp:effectExtent l="0" t="0" r="0" b="0"/>
             <wp:docPr id="204" name="Hinh 4"/>
             <wp:cNvGraphicFramePr>
@@ -2860,7 +2890,7 @@
                   <pic:spPr>
                     <a:xfrm>
                       <a:off x="0" y="0"/>
-                      <a:ext cx="4140000" cy="3323661"/>
+                      <a:ext cx="3456000" cy="2774535"/>
                     </a:xfrm>
                     <a:prstGeom prst="rect">
                       <a:avLst/>
@@ -2889,7 +2919,7 @@
           <w:i/>
           <w:iCs/>
         </w:rPr>
-        <w:t xml:space="preserve">Hình 4. Ma trận hệ số tương quan Pearson giữa các biến số</w:t>
+        <w:t xml:space="preserve">Hình 4. Bản đồ nhiệt: ma trận hệ số tương quan Pearson giữa các biến số</w:t>
       </w:r>
     </w:p>
     <w:p>
@@ -2899,22 +2929,7 @@
         <w:jc w:val="both"/>
       </w:pPr>
       <w:r>
-        <w:t xml:space="preserve">Chất lượng giấc ngủ tương quan nghịch mạnh với mức độ căng thẳng (r = −0.90) và tương quan thuận mạnh với thời lượng ngủ (r = 0.88); bản thân căng thẳng và thời lượng ngủ cũng tương quan nghịch (r = −0.81). Chất lượng giấc ngủ trung bình giảm từ 8.97 ở mức căng thẳng 3 xuống 5.86 ở mức căng thẳng 8. Hai biến này vì vậy được chọn làm biến đầu vào chính cho mô hình hồi quy ở phần sau.</w:t>
-      </w:r>
-    </w:p>
-    <w:p>
-      <w:pPr>
-        <w:pStyle w:val="Heading2"/>
-        <w:spacing w:before="120" w:after="60"/>
-        <w:rPr>
-          <w:sz w:val="26"/>
-        </w:rPr>
-      </w:pPr>
-      <w:r>
-        <w:rPr>
-          <w:sz w:val="26"/>
-        </w:rPr>
-        <w:t xml:space="preserve">Nghề nghiệp, huyết áp và thời lượng ngủ</w:t>
+        <w:t xml:space="preserve">Kết quả khám phá: chất lượng giấc ngủ tương quan nghịch mạnh với mức độ căng thẳng (r = −0.90) và nhịp tim (r = −0.66), tương quan thuận mạnh với thời lượng ngủ (r = 0.88). Bản thân căng thẳng và thời lượng ngủ cũng tương quan nghịch (r = −0.81). Ngược lại, số bước chân mỗi ngày gần như không tương quan với chất lượng giấc ngủ (r = 0.02) và mức vận động chỉ tương quan yếu (r = 0.19). Chất lượng giấc ngủ trung bình giảm từ 8.97 ở mức căng thẳng 3 xuống 5.86 ở mức căng thẳng 8.</w:t>
       </w:r>
     </w:p>
     <w:p>
@@ -2924,7 +2939,29 @@
         <w:jc w:val="both"/>
       </w:pPr>
       <w:r>
-        <w:t xml:space="preserve">Hình 5 so sánh phân bố thời lượng ngủ giữa các nghề.</w:t>
+        <w:t xml:space="preserve">Phân tích: căng thẳng và thời lượng ngủ là hai yếu tố gắn với chất lượng giấc ngủ chặt nhất, nên được chọn làm biến đầu vào chính cho mô hình hồi quy ở phần sau. Hai biến này lại tương quan mạnh với nhau, tức chúng mang một phần thông tin trùng lặp; đây là lý do mô hình nhiều biến chỉ cải thiện vừa phải so với mô hình một biến.</w:t>
+      </w:r>
+    </w:p>
+    <w:p>
+      <w:pPr>
+        <w:pStyle w:val="Heading1"/>
+        <w:spacing w:before="240" w:after="120"/>
+      </w:pPr>
+      <w:r>
+        <w:tab/>
+      </w:r>
+      <w:r>
+        <w:t xml:space="preserve">MÔ HÌNH HỒI QUY VÀ SO SÁNH MÔ HÌNH</w:t>
+      </w:r>
+    </w:p>
+    <w:p>
+      <w:pPr>
+        <w:pStyle w:val="BT"/>
+        <w:spacing w:before="0" w:after="120" w:line="276" w:lineRule="auto"/>
+        <w:jc w:val="both"/>
+      </w:pPr>
+      <w:r>
+        <w:t xml:space="preserve">Phần này trình bày bốn mô hình hồi quy dự đoán Quality of Sleep, sau đó so sánh chúng với nhau và với mô hình Ridge. Hình 5 minh họa bốn mô hình khi huấn luyện trên toàn bộ dữ liệu: hai hình trên là đường hồi quy của hai mô hình một biến, hai hình dưới so sánh giá trị dự đoán với giá trị thực tế của hai mô hình bốn biến (điểm càng gần đường chéo thì dự đoán càng chính xác).</w:t>
       </w:r>
     </w:p>
     <w:p>
@@ -2938,7 +2975,7 @@
       <w:r>
         <w:drawing>
           <wp:inline distT="0" distB="0" distL="0" distR="0">
-            <wp:extent cx="4680000" cy="2789090"/>
+            <wp:extent cx="5040000" cy="3757090"/>
             <wp:effectExtent l="0" t="0" r="0" b="0"/>
             <wp:docPr id="205" name="Hinh 5"/>
             <wp:cNvGraphicFramePr>
@@ -2948,7 +2985,7 @@
               <a:graphicData uri="http://schemas.openxmlformats.org/drawingml/2006/picture">
                 <pic:pic xmlns:pic="http://schemas.openxmlformats.org/drawingml/2006/picture">
                   <pic:nvPicPr>
-                    <pic:cNvPr id="205" name="c16_0.png"/>
+                    <pic:cNvPr id="205" name="models4.png"/>
                     <pic:cNvPicPr/>
                   </pic:nvPicPr>
                   <pic:blipFill>
@@ -2960,7 +2997,7 @@
                   <pic:spPr>
                     <a:xfrm>
                       <a:off x="0" y="0"/>
-                      <a:ext cx="4680000" cy="2789090"/>
+                      <a:ext cx="5040000" cy="3757090"/>
                     </a:xfrm>
                     <a:prstGeom prst="rect">
                       <a:avLst/>
@@ -2989,39 +3026,7 @@
           <w:i/>
           <w:iCs/>
         </w:rPr>
-        <w:t xml:space="preserve">Hình 5. Phân bố thời lượng ngủ theo nghề nghiệp</w:t>
-      </w:r>
-    </w:p>
-    <w:p>
-      <w:pPr>
-        <w:pStyle w:val="BT"/>
-        <w:spacing w:before="0" w:after="120" w:line="276" w:lineRule="auto"/>
-        <w:jc w:val="both"/>
-      </w:pPr>
-      <w:r>
-        <w:t xml:space="preserve">Xét các nghề có từ 30 người trở lên, Engineer có trung vị thời lượng ngủ cao nhất (8.3 giờ) và Salesperson thấp nhất (6.4 giờ); Doctor và Nurse có độ phân tán rộng nhất. Tuy nhiên nghề nghiệp và giới tính trong dữ liệu gần như trùng nhau (toàn bộ 73 Nurse là nữ, 69 trên 71 Doctor là nam), nên khác biệt giữa các nghề không tách riêng được khỏi khác biệt giữa hai giới.</w:t>
-      </w:r>
-    </w:p>
-    <w:p>
-      <w:pPr>
-        <w:pStyle w:val="BT"/>
-        <w:spacing w:before="0" w:after="120" w:line="276" w:lineRule="auto"/>
-        <w:jc w:val="both"/>
-      </w:pPr>
-      <w:r>
-        <w:t xml:space="preserve">Về huyết áp, nhóm Sleep Apnea có huyết áp trung bình cao nhất (137.8/92.7 mmHg), tiếp theo là Insomnia (132.0/86.9) và nhóm không mắc rối loạn (124.0/81.0). Thời lượng ngủ trung bình của ba nhóm không mắc, Insomnia và Sleep Apnea lần lượt là 7.36, 6.59 và 7.03 giờ; kiểm định ANOVA một yếu tố cho F = 31.91, p ≈ 1.6 × 10⁻¹³, tức sự khác biệt này có ý nghĩa thống kê ở mức 0.05.</w:t>
-      </w:r>
-    </w:p>
-    <w:p>
-      <w:pPr>
-        <w:pStyle w:val="Heading1"/>
-        <w:spacing w:before="240" w:after="120"/>
-      </w:pPr>
-      <w:r>
-        <w:tab/>
-      </w:r>
-      <w:r>
-        <w:t xml:space="preserve">KẾT QUẢ MÔ HÌNH HỒI QUY</w:t>
+        <w:t xml:space="preserve">Hình 5. Bốn mô hình hồi quy huấn luyện trên toàn bộ dữ liệu</w:t>
       </w:r>
     </w:p>
     <w:p>
@@ -3036,7 +3041,7 @@
         <w:rPr>
           <w:sz w:val="26"/>
         </w:rPr>
-        <w:t xml:space="preserve">Các mô hình trên toàn bộ dữ liệu</w:t>
+        <w:t xml:space="preserve">Mô hình 1: hồi quy tuyến tính đơn</w:t>
       </w:r>
     </w:p>
     <w:p>
@@ -3046,21 +3051,122 @@
         <w:jc w:val="both"/>
       </w:pPr>
       <w:r>
-        <w:t xml:space="preserve">Trước tiên, nhóm huấn luyện bốn mô hình trên toàn bộ dữ liệu để so sánh mức độ khớp. Kết quả được trình bày ở Bảng 2.</w:t>
+        <w:t xml:space="preserve">Mô hình dự đoán chất lượng giấc ngủ từ một biến là thời lượng ngủ. Phương trình thu được là Quality of Sleep = −2.163 + 1.329 × Sleep Duration, tức mỗi giờ ngủ thêm ứng với chất lượng giấc ngủ tăng khoảng 1.33 điểm. Mô hình đạt R² = 0.780 và MSE = 0.314: riêng thời lượng ngủ đã giải thích được 78% sự biến thiên của chất lượng giấc ngủ. Hình 5a cho thấy đường thẳng bám theo xu hướng chung nhưng còn sai lệch ở những người ngủ cùng thời lượng mà chất lượng khác nhau.</w:t>
+      </w:r>
+    </w:p>
+    <w:p>
+      <w:pPr>
+        <w:pStyle w:val="Heading2"/>
+        <w:spacing w:before="120" w:after="60"/>
+        <w:rPr>
+          <w:sz w:val="26"/>
+        </w:rPr>
+      </w:pPr>
+      <w:r>
+        <w:rPr>
+          <w:sz w:val="26"/>
+        </w:rPr>
+        <w:t xml:space="preserve">Mô hình 2: hồi quy đa thức</w:t>
+      </w:r>
+    </w:p>
+    <w:p>
+      <w:pPr>
+        <w:pStyle w:val="BT"/>
+        <w:spacing w:before="0" w:after="120" w:line="276" w:lineRule="auto"/>
+        <w:jc w:val="both"/>
+      </w:pPr>
+      <w:r>
+        <w:t xml:space="preserve">Mô hình dùng một biến là mức độ căng thẳng, với đa thức bậc 2 để mô tả quan hệ không hoàn toàn tuyến tính. Phương trình thu được là Quality of Sleep = 11.084 − 0.811 × Stress + 0.019 × Stress². Mô hình đạt R² = 0.809 và MSE = 0.273, cao hơn mô hình tuyến tính đơn một chút. Hệ số của số hạng bậc 2 rất nhỏ nên đường cong ở Hình 5b gần như là đường thẳng: quan hệ giữa căng thẳng và chất lượng giấc ngủ trong dữ liệu này chủ yếu là tuyến tính.</w:t>
+      </w:r>
+    </w:p>
+    <w:p>
+      <w:pPr>
+        <w:pStyle w:val="Heading2"/>
+        <w:spacing w:before="120" w:after="60"/>
+        <w:rPr>
+          <w:sz w:val="26"/>
+        </w:rPr>
+      </w:pPr>
+      <w:r>
+        <w:rPr>
+          <w:sz w:val="26"/>
+        </w:rPr>
+        <w:t xml:space="preserve">Mô hình 3: hồi quy tuyến tính đa biến</w:t>
+      </w:r>
+    </w:p>
+    <w:p>
+      <w:pPr>
+        <w:pStyle w:val="BT"/>
+        <w:spacing w:before="0" w:after="120" w:line="276" w:lineRule="auto"/>
+        <w:jc w:val="both"/>
+      </w:pPr>
+      <w:r>
+        <w:t xml:space="preserve">Mô hình dùng đồng thời bốn biến: Sleep Duration, Stress Level, Heart Rate và Physical Activity Level. Hệ số của bốn biến lần lượt là 0.605, −0.313, −0.045 và 0.007, với hệ số chặn 7.488; dấu của các hệ số cùng chiều với tương quan đã thấy ở Hình 4. Mô hình đạt R² = 0.897 và MSE = 0.147, tức sai số giảm hơn một nửa so với mô hình tuyến tính đơn. Kết hợp thời lượng ngủ và căng thẳng cho thông tin đầy đủ hơn hẳn từng biến riêng lẻ.</w:t>
+      </w:r>
+    </w:p>
+    <w:p>
+      <w:pPr>
+        <w:pStyle w:val="Heading2"/>
+        <w:spacing w:before="120" w:after="60"/>
+        <w:rPr>
+          <w:sz w:val="26"/>
+        </w:rPr>
+      </w:pPr>
+      <w:r>
+        <w:rPr>
+          <w:sz w:val="26"/>
+        </w:rPr>
+        <w:t xml:space="preserve">Mô hình 4: hồi quy đa thức đa biến (Pipeline)</w:t>
+      </w:r>
+    </w:p>
+    <w:p>
+      <w:pPr>
+        <w:pStyle w:val="BT"/>
+        <w:spacing w:before="0" w:after="120" w:line="276" w:lineRule="auto"/>
+        <w:jc w:val="both"/>
+      </w:pPr>
+      <w:r>
+        <w:t xml:space="preserve">Mô hình là một pipeline gồm ba bước: chuẩn hóa bốn biến đầu vào, tạo các đặc trưng đa thức bậc 2 (gồm bình phương của từng biến và tích của từng cặp biến, tổng cộng 14 đặc trưng), rồi hồi quy tuyến tính trên các đặc trưng đó. Mô hình đạt R² = 0.959 và MSE = 0.059, cao nhất trong bốn mô hình. Ở Hình 5d, các điểm bám sát đường chéo hơn Hình 5c, nhất là ở vùng chất lượng giấc ngủ thấp (4 đến 5 điểm) mà mô hình tuyến tính dự đoán chưa tốt.</w:t>
+      </w:r>
+    </w:p>
+    <w:p>
+      <w:pPr>
+        <w:pStyle w:val="Heading2"/>
+        <w:spacing w:before="120" w:after="60"/>
+        <w:rPr>
+          <w:sz w:val="26"/>
+        </w:rPr>
+      </w:pPr>
+      <w:r>
+        <w:rPr>
+          <w:sz w:val="26"/>
+        </w:rPr>
+        <w:t xml:space="preserve">So sánh các mô hình</w:t>
+      </w:r>
+    </w:p>
+    <w:p>
+      <w:pPr>
+        <w:pStyle w:val="BT"/>
+        <w:spacing w:before="0" w:after="120" w:line="276" w:lineRule="auto"/>
+        <w:jc w:val="both"/>
+      </w:pPr>
+      <w:r>
+        <w:t xml:space="preserve">Các chỉ số ở trên được tính trên chính dữ liệu huấn luyện nên luôn tăng theo độ phức tạp của mô hình. Để so sánh công bằng, nhóm đánh giá lại cả bốn mô hình trên dữ liệu chưa từng thấy theo phương pháp chia theo hồ sơ, và thêm mô hình Ridge trên đa thức bậc 3 làm mô hình so sánh. Với Ridge, hệ số alpha tối ưu chọn được là 8.69; khi alpha quá nhỏ (0.01) mô hình bậc 3 overfitting nặng, với R² kiểm định chỉ khoảng 0.24. Kết quả được trình bày ở Bảng 2 và Hình 6.</w:t>
       </w:r>
     </w:p>
     <w:tbl>
       <w:tblPr>
         <w:tblStyle w:val="new"/>
-        <w:tblW w:w="9000" w:type="dxa"/>
+        <w:tblW w:w="9067" w:type="dxa"/>
         <w:jc w:val="center"/>
         <w:tblLook w:val="04A0" w:firstRow="1" w:lastRow="0" w:firstColumn="1" w:lastColumn="0" w:noHBand="0" w:noVBand="1"/>
       </w:tblPr>
       <w:tblGrid>
-        <w:gridCol w:w="4000"/>
-        <w:gridCol w:w="2400"/>
-        <w:gridCol w:w="1300"/>
-        <w:gridCol w:w="1300"/>
+        <w:gridCol w:w="3350"/>
+        <w:gridCol w:w="1350"/>
+        <w:gridCol w:w="1250"/>
+        <w:gridCol w:w="1450"/>
+        <w:gridCol w:w="1667"/>
       </w:tblGrid>
       <w:tr>
         <w:trPr>
@@ -3069,7 +3175,7 @@
         </w:trPr>
         <w:tc>
           <w:tcPr>
-            <w:tcW w:w="4000" w:type="dxa"/>
+            <w:tcW w:w="3350" w:type="dxa"/>
           </w:tcPr>
           <w:p>
             <w:pPr>
@@ -3089,7 +3195,7 @@
         </w:tc>
         <w:tc>
           <w:tcPr>
-            <w:tcW w:w="2400" w:type="dxa"/>
+            <w:tcW w:w="1350" w:type="dxa"/>
           </w:tcPr>
           <w:p>
             <w:pPr>
@@ -3103,13 +3209,13 @@
                 <w:b/>
                 <w:sz w:val="24"/>
               </w:rPr>
-              <w:t xml:space="preserve">Biến đầu vào</w:t>
-            </w:r>
-          </w:p>
-        </w:tc>
-        <w:tc>
-          <w:tcPr>
-            <w:tcW w:w="1300" w:type="dxa"/>
+              <w:t xml:space="preserve">R² huấn luyện</w:t>
+            </w:r>
+          </w:p>
+        </w:tc>
+        <w:tc>
+          <w:tcPr>
+            <w:tcW w:w="1250" w:type="dxa"/>
           </w:tcPr>
           <w:p>
             <w:pPr>
@@ -3123,13 +3229,13 @@
                 <w:b/>
                 <w:sz w:val="24"/>
               </w:rPr>
-              <w:t xml:space="preserve">R²</w:t>
-            </w:r>
-          </w:p>
-        </w:tc>
-        <w:tc>
-          <w:tcPr>
-            <w:tcW w:w="1300" w:type="dxa"/>
+              <w:t xml:space="preserve">R² kiểm tra</w:t>
+            </w:r>
+          </w:p>
+        </w:tc>
+        <w:tc>
+          <w:tcPr>
+            <w:tcW w:w="1450" w:type="dxa"/>
           </w:tcPr>
           <w:p>
             <w:pPr>
@@ -3143,7 +3249,27 @@
                 <w:b/>
                 <w:sz w:val="24"/>
               </w:rPr>
-              <w:t xml:space="preserve">MSE</w:t>
+              <w:t xml:space="preserve">R² kiểm định chéo</w:t>
+            </w:r>
+          </w:p>
+        </w:tc>
+        <w:tc>
+          <w:tcPr>
+            <w:tcW w:w="1667" w:type="dxa"/>
+          </w:tcPr>
+          <w:p>
+            <w:pPr>
+              <w:pStyle w:val="BT"/>
+              <w:spacing w:before="20" w:after="20"/>
+              <w:ind w:firstLine="0"/>
+              <w:jc w:val="center"/>
+            </w:pPr>
+            <w:r>
+              <w:rPr>
+                <w:b/>
+                <w:sz w:val="24"/>
+              </w:rPr>
+              <w:t xml:space="preserve">R² trung bình 30 lần chia</w:t>
             </w:r>
           </w:p>
         </w:tc>
@@ -3154,7 +3280,7 @@
         </w:trPr>
         <w:tc>
           <w:tcPr>
-            <w:tcW w:w="4000" w:type="dxa"/>
+            <w:tcW w:w="3350" w:type="dxa"/>
           </w:tcPr>
           <w:p>
             <w:pPr>
@@ -3167,32 +3293,13 @@
               <w:rPr>
                 <w:sz w:val="24"/>
               </w:rPr>
-              <w:t xml:space="preserve">Tuyến tính đơn</w:t>
-            </w:r>
-          </w:p>
-        </w:tc>
-        <w:tc>
-          <w:tcPr>
-            <w:tcW w:w="2400" w:type="dxa"/>
-          </w:tcPr>
-          <w:p>
-            <w:pPr>
-              <w:pStyle w:val="BT"/>
-              <w:spacing w:before="20" w:after="20"/>
-              <w:ind w:firstLine="0"/>
-              <w:jc w:val="left"/>
-            </w:pPr>
-            <w:r>
-              <w:rPr>
-                <w:sz w:val="24"/>
-              </w:rPr>
-              <w:t xml:space="preserve">Sleep Duration</w:t>
-            </w:r>
-          </w:p>
-        </w:tc>
-        <w:tc>
-          <w:tcPr>
-            <w:tcW w:w="1300" w:type="dxa"/>
+              <w:t xml:space="preserve">1. Tuyến tính đơn (Sleep Duration)</w:t>
+            </w:r>
+          </w:p>
+        </w:tc>
+        <w:tc>
+          <w:tcPr>
+            <w:tcW w:w="1350" w:type="dxa"/>
           </w:tcPr>
           <w:p>
             <w:pPr>
@@ -3205,13 +3312,13 @@
               <w:rPr>
                 <w:sz w:val="24"/>
               </w:rPr>
-              <w:t xml:space="preserve">0.780</w:t>
-            </w:r>
-          </w:p>
-        </w:tc>
-        <w:tc>
-          <w:tcPr>
-            <w:tcW w:w="1300" w:type="dxa"/>
+              <w:t xml:space="preserve">0.772</w:t>
+            </w:r>
+          </w:p>
+        </w:tc>
+        <w:tc>
+          <w:tcPr>
+            <w:tcW w:w="1250" w:type="dxa"/>
           </w:tcPr>
           <w:p>
             <w:pPr>
@@ -3224,7 +3331,45 @@
               <w:rPr>
                 <w:sz w:val="24"/>
               </w:rPr>
-              <w:t xml:space="preserve">0.314</w:t>
+              <w:t xml:space="preserve">0.798</w:t>
+            </w:r>
+          </w:p>
+        </w:tc>
+        <w:tc>
+          <w:tcPr>
+            <w:tcW w:w="1450" w:type="dxa"/>
+          </w:tcPr>
+          <w:p>
+            <w:pPr>
+              <w:pStyle w:val="BT"/>
+              <w:spacing w:before="20" w:after="20"/>
+              <w:ind w:firstLine="0"/>
+              <w:jc w:val="center"/>
+            </w:pPr>
+            <w:r>
+              <w:rPr>
+                <w:sz w:val="24"/>
+              </w:rPr>
+              <w:t xml:space="preserve">0.762</w:t>
+            </w:r>
+          </w:p>
+        </w:tc>
+        <w:tc>
+          <w:tcPr>
+            <w:tcW w:w="1667" w:type="dxa"/>
+          </w:tcPr>
+          <w:p>
+            <w:pPr>
+              <w:pStyle w:val="BT"/>
+              <w:spacing w:before="20" w:after="20"/>
+              <w:ind w:firstLine="0"/>
+              <w:jc w:val="center"/>
+            </w:pPr>
+            <w:r>
+              <w:rPr>
+                <w:sz w:val="24"/>
+              </w:rPr>
+              <w:t xml:space="preserve">0.753</w:t>
             </w:r>
           </w:p>
         </w:tc>
@@ -3235,7 +3380,7 @@
         </w:trPr>
         <w:tc>
           <w:tcPr>
-            <w:tcW w:w="4000" w:type="dxa"/>
+            <w:tcW w:w="3350" w:type="dxa"/>
           </w:tcPr>
           <w:p>
             <w:pPr>
@@ -3248,32 +3393,13 @@
               <w:rPr>
                 <w:sz w:val="24"/>
               </w:rPr>
-              <w:t xml:space="preserve">Đa thức bậc 2</w:t>
-            </w:r>
-          </w:p>
-        </w:tc>
-        <w:tc>
-          <w:tcPr>
-            <w:tcW w:w="2400" w:type="dxa"/>
-          </w:tcPr>
-          <w:p>
-            <w:pPr>
-              <w:pStyle w:val="BT"/>
-              <w:spacing w:before="20" w:after="20"/>
-              <w:ind w:firstLine="0"/>
-              <w:jc w:val="left"/>
-            </w:pPr>
-            <w:r>
-              <w:rPr>
-                <w:sz w:val="24"/>
-              </w:rPr>
-              <w:t xml:space="preserve">Stress Level</w:t>
-            </w:r>
-          </w:p>
-        </w:tc>
-        <w:tc>
-          <w:tcPr>
-            <w:tcW w:w="1300" w:type="dxa"/>
+              <w:t xml:space="preserve">2. Đa thức bậc 2 (Stress Level)</w:t>
+            </w:r>
+          </w:p>
+        </w:tc>
+        <w:tc>
+          <w:tcPr>
+            <w:tcW w:w="1350" w:type="dxa"/>
           </w:tcPr>
           <w:p>
             <w:pPr>
@@ -3286,13 +3412,13 @@
               <w:rPr>
                 <w:sz w:val="24"/>
               </w:rPr>
-              <w:t xml:space="preserve">0.809</w:t>
-            </w:r>
-          </w:p>
-        </w:tc>
-        <w:tc>
-          <w:tcPr>
-            <w:tcW w:w="1300" w:type="dxa"/>
+              <w:t xml:space="preserve">0.808</w:t>
+            </w:r>
+          </w:p>
+        </w:tc>
+        <w:tc>
+          <w:tcPr>
+            <w:tcW w:w="1250" w:type="dxa"/>
           </w:tcPr>
           <w:p>
             <w:pPr>
@@ -3305,7 +3431,45 @@
               <w:rPr>
                 <w:sz w:val="24"/>
               </w:rPr>
-              <w:t xml:space="preserve">0.273</w:t>
+              <w:t xml:space="preserve">0.807</w:t>
+            </w:r>
+          </w:p>
+        </w:tc>
+        <w:tc>
+          <w:tcPr>
+            <w:tcW w:w="1450" w:type="dxa"/>
+          </w:tcPr>
+          <w:p>
+            <w:pPr>
+              <w:pStyle w:val="BT"/>
+              <w:spacing w:before="20" w:after="20"/>
+              <w:ind w:firstLine="0"/>
+              <w:jc w:val="center"/>
+            </w:pPr>
+            <w:r>
+              <w:rPr>
+                <w:sz w:val="24"/>
+              </w:rPr>
+              <w:t xml:space="preserve">0.796</w:t>
+            </w:r>
+          </w:p>
+        </w:tc>
+        <w:tc>
+          <w:tcPr>
+            <w:tcW w:w="1667" w:type="dxa"/>
+          </w:tcPr>
+          <w:p>
+            <w:pPr>
+              <w:pStyle w:val="BT"/>
+              <w:spacing w:before="20" w:after="20"/>
+              <w:ind w:firstLine="0"/>
+              <w:jc w:val="center"/>
+            </w:pPr>
+            <w:r>
+              <w:rPr>
+                <w:sz w:val="24"/>
+              </w:rPr>
+              <w:t xml:space="preserve">0.791</w:t>
             </w:r>
           </w:p>
         </w:tc>
@@ -3316,7 +3480,7 @@
         </w:trPr>
         <w:tc>
           <w:tcPr>
-            <w:tcW w:w="4000" w:type="dxa"/>
+            <w:tcW w:w="3350" w:type="dxa"/>
           </w:tcPr>
           <w:p>
             <w:pPr>
@@ -3329,32 +3493,13 @@
               <w:rPr>
                 <w:sz w:val="24"/>
               </w:rPr>
-              <w:t xml:space="preserve">Tuyến tính đa biến</w:t>
-            </w:r>
-          </w:p>
-        </w:tc>
-        <w:tc>
-          <w:tcPr>
-            <w:tcW w:w="2400" w:type="dxa"/>
-          </w:tcPr>
-          <w:p>
-            <w:pPr>
-              <w:pStyle w:val="BT"/>
-              <w:spacing w:before="20" w:after="20"/>
-              <w:ind w:firstLine="0"/>
-              <w:jc w:val="left"/>
-            </w:pPr>
-            <w:r>
-              <w:rPr>
-                <w:sz w:val="24"/>
-              </w:rPr>
-              <w:t xml:space="preserve">Bốn biến</w:t>
-            </w:r>
-          </w:p>
-        </w:tc>
-        <w:tc>
-          <w:tcPr>
-            <w:tcW w:w="1300" w:type="dxa"/>
+              <w:t xml:space="preserve">3. Tuyến tính đa biến (4 biến)</w:t>
+            </w:r>
+          </w:p>
+        </w:tc>
+        <w:tc>
+          <w:tcPr>
+            <w:tcW w:w="1350" w:type="dxa"/>
           </w:tcPr>
           <w:p>
             <w:pPr>
@@ -3367,13 +3512,13 @@
               <w:rPr>
                 <w:sz w:val="24"/>
               </w:rPr>
-              <w:t xml:space="preserve">0.897</w:t>
-            </w:r>
-          </w:p>
-        </w:tc>
-        <w:tc>
-          <w:tcPr>
-            <w:tcW w:w="1300" w:type="dxa"/>
+              <w:t xml:space="preserve">0.889</w:t>
+            </w:r>
+          </w:p>
+        </w:tc>
+        <w:tc>
+          <w:tcPr>
+            <w:tcW w:w="1250" w:type="dxa"/>
           </w:tcPr>
           <w:p>
             <w:pPr>
@@ -3386,7 +3531,45 @@
               <w:rPr>
                 <w:sz w:val="24"/>
               </w:rPr>
-              <w:t xml:space="preserve">0.147</w:t>
+              <w:t xml:space="preserve">0.914</w:t>
+            </w:r>
+          </w:p>
+        </w:tc>
+        <w:tc>
+          <w:tcPr>
+            <w:tcW w:w="1450" w:type="dxa"/>
+          </w:tcPr>
+          <w:p>
+            <w:pPr>
+              <w:pStyle w:val="BT"/>
+              <w:spacing w:before="20" w:after="20"/>
+              <w:ind w:firstLine="0"/>
+              <w:jc w:val="center"/>
+            </w:pPr>
+            <w:r>
+              <w:rPr>
+                <w:sz w:val="24"/>
+              </w:rPr>
+              <w:t xml:space="preserve">0.875</w:t>
+            </w:r>
+          </w:p>
+        </w:tc>
+        <w:tc>
+          <w:tcPr>
+            <w:tcW w:w="1667" w:type="dxa"/>
+          </w:tcPr>
+          <w:p>
+            <w:pPr>
+              <w:pStyle w:val="BT"/>
+              <w:spacing w:before="20" w:after="20"/>
+              <w:ind w:firstLine="0"/>
+              <w:jc w:val="center"/>
+            </w:pPr>
+            <w:r>
+              <w:rPr>
+                <w:sz w:val="24"/>
+              </w:rPr>
+              <w:t xml:space="preserve">0.877</w:t>
             </w:r>
           </w:p>
         </w:tc>
@@ -3397,7 +3580,7 @@
         </w:trPr>
         <w:tc>
           <w:tcPr>
-            <w:tcW w:w="4000" w:type="dxa"/>
+            <w:tcW w:w="3350" w:type="dxa"/>
           </w:tcPr>
           <w:p>
             <w:pPr>
@@ -3410,13 +3593,94 @@
               <w:rPr>
                 <w:sz w:val="24"/>
               </w:rPr>
-              <w:t xml:space="preserve">Chuẩn hóa + đa thức bậc 2 + tuyến tính</w:t>
-            </w:r>
-          </w:p>
-        </w:tc>
-        <w:tc>
-          <w:tcPr>
-            <w:tcW w:w="2400" w:type="dxa"/>
+              <w:t xml:space="preserve">4. Đa thức bậc 2 đa biến (4 biến)</w:t>
+            </w:r>
+          </w:p>
+        </w:tc>
+        <w:tc>
+          <w:tcPr>
+            <w:tcW w:w="1350" w:type="dxa"/>
+          </w:tcPr>
+          <w:p>
+            <w:pPr>
+              <w:pStyle w:val="BT"/>
+              <w:spacing w:before="20" w:after="20"/>
+              <w:ind w:firstLine="0"/>
+              <w:jc w:val="center"/>
+            </w:pPr>
+            <w:r>
+              <w:rPr>
+                <w:sz w:val="24"/>
+              </w:rPr>
+              <w:t xml:space="preserve">0.960</w:t>
+            </w:r>
+          </w:p>
+        </w:tc>
+        <w:tc>
+          <w:tcPr>
+            <w:tcW w:w="1250" w:type="dxa"/>
+          </w:tcPr>
+          <w:p>
+            <w:pPr>
+              <w:pStyle w:val="BT"/>
+              <w:spacing w:before="20" w:after="20"/>
+              <w:ind w:firstLine="0"/>
+              <w:jc w:val="center"/>
+            </w:pPr>
+            <w:r>
+              <w:rPr>
+                <w:sz w:val="24"/>
+              </w:rPr>
+              <w:t xml:space="preserve">0.950</w:t>
+            </w:r>
+          </w:p>
+        </w:tc>
+        <w:tc>
+          <w:tcPr>
+            <w:tcW w:w="1450" w:type="dxa"/>
+          </w:tcPr>
+          <w:p>
+            <w:pPr>
+              <w:pStyle w:val="BT"/>
+              <w:spacing w:before="20" w:after="20"/>
+              <w:ind w:firstLine="0"/>
+              <w:jc w:val="center"/>
+            </w:pPr>
+            <w:r>
+              <w:rPr>
+                <w:sz w:val="24"/>
+              </w:rPr>
+              <w:t xml:space="preserve">0.944</w:t>
+            </w:r>
+          </w:p>
+        </w:tc>
+        <w:tc>
+          <w:tcPr>
+            <w:tcW w:w="1667" w:type="dxa"/>
+          </w:tcPr>
+          <w:p>
+            <w:pPr>
+              <w:pStyle w:val="BT"/>
+              <w:spacing w:before="20" w:after="20"/>
+              <w:ind w:firstLine="0"/>
+              <w:jc w:val="center"/>
+            </w:pPr>
+            <w:r>
+              <w:rPr>
+                <w:sz w:val="24"/>
+              </w:rPr>
+              <w:t xml:space="preserve">0.936</w:t>
+            </w:r>
+          </w:p>
+        </w:tc>
+      </w:tr>
+      <w:tr>
+        <w:trPr>
+          <w:cantSplit/>
+        </w:trPr>
+        <w:tc>
+          <w:tcPr>
+            <w:tcW w:w="3350" w:type="dxa"/>
           </w:tcPr>
           <w:p>
             <w:pPr>
@@ -3429,13 +3693,13 @@
               <w:rPr>
                 <w:sz w:val="24"/>
               </w:rPr>
-              <w:t xml:space="preserve">Bốn biến</w:t>
-            </w:r>
-          </w:p>
-        </w:tc>
-        <w:tc>
-          <w:tcPr>
-            <w:tcW w:w="1300" w:type="dxa"/>
+              <w:t xml:space="preserve">Ridge, đa thức bậc 3 (so sánh)</w:t>
+            </w:r>
+          </w:p>
+        </w:tc>
+        <w:tc>
+          <w:tcPr>
+            <w:tcW w:w="1350" w:type="dxa"/>
           </w:tcPr>
           <w:p>
             <w:pPr>
@@ -3448,13 +3712,13 @@
               <w:rPr>
                 <w:sz w:val="24"/>
               </w:rPr>
-              <w:t xml:space="preserve">0.959</w:t>
-            </w:r>
-          </w:p>
-        </w:tc>
-        <w:tc>
-          <w:tcPr>
-            <w:tcW w:w="1300" w:type="dxa"/>
+              <w:t xml:space="preserve">0.958</w:t>
+            </w:r>
+          </w:p>
+        </w:tc>
+        <w:tc>
+          <w:tcPr>
+            <w:tcW w:w="1250" w:type="dxa"/>
           </w:tcPr>
           <w:p>
             <w:pPr>
@@ -3467,7 +3731,45 @@
               <w:rPr>
                 <w:sz w:val="24"/>
               </w:rPr>
-              <w:t xml:space="preserve">0.059</w:t>
+              <w:t xml:space="preserve">0.953</w:t>
+            </w:r>
+          </w:p>
+        </w:tc>
+        <w:tc>
+          <w:tcPr>
+            <w:tcW w:w="1450" w:type="dxa"/>
+          </w:tcPr>
+          <w:p>
+            <w:pPr>
+              <w:pStyle w:val="BT"/>
+              <w:spacing w:before="20" w:after="20"/>
+              <w:ind w:firstLine="0"/>
+              <w:jc w:val="center"/>
+            </w:pPr>
+            <w:r>
+              <w:rPr>
+                <w:sz w:val="24"/>
+              </w:rPr>
+              <w:t xml:space="preserve">0.934</w:t>
+            </w:r>
+          </w:p>
+        </w:tc>
+        <w:tc>
+          <w:tcPr>
+            <w:tcW w:w="1667" w:type="dxa"/>
+          </w:tcPr>
+          <w:p>
+            <w:pPr>
+              <w:pStyle w:val="BT"/>
+              <w:spacing w:before="20" w:after="20"/>
+              <w:ind w:firstLine="0"/>
+              <w:jc w:val="center"/>
+            </w:pPr>
+            <w:r>
+              <w:rPr>
+                <w:sz w:val="24"/>
+              </w:rPr>
+              <w:t xml:space="preserve">0.924</w:t>
             </w:r>
           </w:p>
         </w:tc>
@@ -3489,343 +3791,7 @@
           <w:i/>
           <w:iCs/>
         </w:rPr>
-        <w:t xml:space="preserve">Bảng 2. Mức độ khớp của các mô hình trên toàn bộ dữ liệu</w:t>
-      </w:r>
-    </w:p>
-    <w:p>
-      <w:pPr>
-        <w:pStyle w:val="BT"/>
-        <w:spacing w:before="0" w:after="120" w:line="276" w:lineRule="auto"/>
-        <w:jc w:val="both"/>
-      </w:pPr>
-      <w:r>
-        <w:t xml:space="preserve">Mô hình tuyến tính đơn có phương trình Quality of Sleep = −2.163 + 1.329 × Sleep Duration. Trong mô hình đa biến, hệ số của Sleep Duration là 0.605 và của Stress Level là −0.313, cùng chiều với tương quan đã thấy ở phần phân tích thăm dò. R² tăng dần theo độ phức tạp, nhưng các chỉ số này được tính trên chính dữ liệu huấn luyện nên chưa cho biết mô hình nào dự đoán dữ liệu mới tốt hơn.</w:t>
-      </w:r>
-    </w:p>
-    <w:p>
-      <w:pPr>
-        <w:pStyle w:val="Heading2"/>
-        <w:spacing w:before="120" w:after="60"/>
-        <w:rPr>
-          <w:sz w:val="26"/>
-        </w:rPr>
-      </w:pPr>
-      <w:r>
-        <w:rPr>
-          <w:sz w:val="26"/>
-        </w:rPr>
-        <w:t xml:space="preserve">Đánh giá trên dữ liệu chưa từng thấy</w:t>
-      </w:r>
-    </w:p>
-    <w:p>
-      <w:pPr>
-        <w:pStyle w:val="BT"/>
-        <w:spacing w:before="0" w:after="120" w:line="276" w:lineRule="auto"/>
-        <w:jc w:val="both"/>
-      </w:pPr>
-      <w:r>
-        <w:t xml:space="preserve">Bảng 3 trình bày kết quả đánh giá theo phương pháp chia theo hồ sơ cho hai mô hình dùng cả bốn biến; với Ridge, kiểm định chéo được thực hiện trên tập huấn luyện để chọn alpha.</w:t>
-      </w:r>
-    </w:p>
-    <w:tbl>
-      <w:tblPr>
-        <w:tblStyle w:val="new"/>
-        <w:tblW w:w="9000" w:type="dxa"/>
-        <w:jc w:val="center"/>
-        <w:tblLook w:val="04A0" w:firstRow="1" w:lastRow="0" w:firstColumn="1" w:lastColumn="0" w:noHBand="0" w:noVBand="1"/>
-      </w:tblPr>
-      <w:tblGrid>
-        <w:gridCol w:w="3400"/>
-        <w:gridCol w:w="1700"/>
-        <w:gridCol w:w="1500"/>
-        <w:gridCol w:w="2400"/>
-      </w:tblGrid>
-      <w:tr>
-        <w:trPr>
-          <w:cantSplit/>
-          <w:tblHeader/>
-        </w:trPr>
-        <w:tc>
-          <w:tcPr>
-            <w:tcW w:w="3400" w:type="dxa"/>
-          </w:tcPr>
-          <w:p>
-            <w:pPr>
-              <w:pStyle w:val="BT"/>
-              <w:spacing w:before="20" w:after="20"/>
-              <w:ind w:firstLine="0"/>
-              <w:jc w:val="center"/>
-            </w:pPr>
-            <w:r>
-              <w:rPr>
-                <w:b/>
-                <w:sz w:val="24"/>
-              </w:rPr>
-              <w:t xml:space="preserve">Mô hình</w:t>
-            </w:r>
-          </w:p>
-        </w:tc>
-        <w:tc>
-          <w:tcPr>
-            <w:tcW w:w="1700" w:type="dxa"/>
-          </w:tcPr>
-          <w:p>
-            <w:pPr>
-              <w:pStyle w:val="BT"/>
-              <w:spacing w:before="20" w:after="20"/>
-              <w:ind w:firstLine="0"/>
-              <w:jc w:val="center"/>
-            </w:pPr>
-            <w:r>
-              <w:rPr>
-                <w:b/>
-                <w:sz w:val="24"/>
-              </w:rPr>
-              <w:t xml:space="preserve">R² huấn luyện</w:t>
-            </w:r>
-          </w:p>
-        </w:tc>
-        <w:tc>
-          <w:tcPr>
-            <w:tcW w:w="1500" w:type="dxa"/>
-          </w:tcPr>
-          <w:p>
-            <w:pPr>
-              <w:pStyle w:val="BT"/>
-              <w:spacing w:before="20" w:after="20"/>
-              <w:ind w:firstLine="0"/>
-              <w:jc w:val="center"/>
-            </w:pPr>
-            <w:r>
-              <w:rPr>
-                <w:b/>
-                <w:sz w:val="24"/>
-              </w:rPr>
-              <w:t xml:space="preserve">R² kiểm tra</w:t>
-            </w:r>
-          </w:p>
-        </w:tc>
-        <w:tc>
-          <w:tcPr>
-            <w:tcW w:w="2400" w:type="dxa"/>
-          </w:tcPr>
-          <w:p>
-            <w:pPr>
-              <w:pStyle w:val="BT"/>
-              <w:spacing w:before="20" w:after="20"/>
-              <w:ind w:firstLine="0"/>
-              <w:jc w:val="center"/>
-            </w:pPr>
-            <w:r>
-              <w:rPr>
-                <w:b/>
-                <w:sz w:val="24"/>
-              </w:rPr>
-              <w:t xml:space="preserve">R² kiểm định chéo</w:t>
-            </w:r>
-          </w:p>
-        </w:tc>
-      </w:tr>
-      <w:tr>
-        <w:trPr>
-          <w:cantSplit/>
-        </w:trPr>
-        <w:tc>
-          <w:tcPr>
-            <w:tcW w:w="3400" w:type="dxa"/>
-          </w:tcPr>
-          <w:p>
-            <w:pPr>
-              <w:pStyle w:val="BT"/>
-              <w:spacing w:before="20" w:after="20"/>
-              <w:ind w:firstLine="0"/>
-              <w:jc w:val="left"/>
-            </w:pPr>
-            <w:r>
-              <w:rPr>
-                <w:sz w:val="24"/>
-              </w:rPr>
-              <w:t xml:space="preserve">Tuyến tính bốn biến</w:t>
-            </w:r>
-          </w:p>
-        </w:tc>
-        <w:tc>
-          <w:tcPr>
-            <w:tcW w:w="1700" w:type="dxa"/>
-          </w:tcPr>
-          <w:p>
-            <w:pPr>
-              <w:pStyle w:val="BT"/>
-              <w:spacing w:before="20" w:after="20"/>
-              <w:ind w:firstLine="0"/>
-              <w:jc w:val="center"/>
-            </w:pPr>
-            <w:r>
-              <w:rPr>
-                <w:sz w:val="24"/>
-              </w:rPr>
-              <w:t xml:space="preserve">0.889</w:t>
-            </w:r>
-          </w:p>
-        </w:tc>
-        <w:tc>
-          <w:tcPr>
-            <w:tcW w:w="1500" w:type="dxa"/>
-          </w:tcPr>
-          <w:p>
-            <w:pPr>
-              <w:pStyle w:val="BT"/>
-              <w:spacing w:before="20" w:after="20"/>
-              <w:ind w:firstLine="0"/>
-              <w:jc w:val="center"/>
-            </w:pPr>
-            <w:r>
-              <w:rPr>
-                <w:sz w:val="24"/>
-              </w:rPr>
-              <w:t xml:space="preserve">0.914</w:t>
-            </w:r>
-          </w:p>
-        </w:tc>
-        <w:tc>
-          <w:tcPr>
-            <w:tcW w:w="2400" w:type="dxa"/>
-          </w:tcPr>
-          <w:p>
-            <w:pPr>
-              <w:pStyle w:val="BT"/>
-              <w:spacing w:before="20" w:after="20"/>
-              <w:ind w:firstLine="0"/>
-              <w:jc w:val="center"/>
-            </w:pPr>
-            <w:r>
-              <w:rPr>
-                <w:sz w:val="24"/>
-              </w:rPr>
-              <w:t xml:space="preserve">0.875 (0.826–0.925)</w:t>
-            </w:r>
-          </w:p>
-        </w:tc>
-      </w:tr>
-      <w:tr>
-        <w:trPr>
-          <w:cantSplit/>
-        </w:trPr>
-        <w:tc>
-          <w:tcPr>
-            <w:tcW w:w="3400" w:type="dxa"/>
-          </w:tcPr>
-          <w:p>
-            <w:pPr>
-              <w:pStyle w:val="BT"/>
-              <w:spacing w:before="20" w:after="20"/>
-              <w:ind w:firstLine="0"/>
-              <w:jc w:val="left"/>
-            </w:pPr>
-            <w:r>
-              <w:rPr>
-                <w:sz w:val="24"/>
-              </w:rPr>
-              <w:t xml:space="preserve">Ridge, đa thức bậc 3, alpha = 8.69</w:t>
-            </w:r>
-          </w:p>
-        </w:tc>
-        <w:tc>
-          <w:tcPr>
-            <w:tcW w:w="1700" w:type="dxa"/>
-          </w:tcPr>
-          <w:p>
-            <w:pPr>
-              <w:pStyle w:val="BT"/>
-              <w:spacing w:before="20" w:after="20"/>
-              <w:ind w:firstLine="0"/>
-              <w:jc w:val="center"/>
-            </w:pPr>
-            <w:r>
-              <w:rPr>
-                <w:sz w:val="24"/>
-              </w:rPr>
-              <w:t xml:space="preserve">0.958</w:t>
-            </w:r>
-          </w:p>
-        </w:tc>
-        <w:tc>
-          <w:tcPr>
-            <w:tcW w:w="1500" w:type="dxa"/>
-          </w:tcPr>
-          <w:p>
-            <w:pPr>
-              <w:pStyle w:val="BT"/>
-              <w:spacing w:before="20" w:after="20"/>
-              <w:ind w:firstLine="0"/>
-              <w:jc w:val="center"/>
-            </w:pPr>
-            <w:r>
-              <w:rPr>
-                <w:sz w:val="24"/>
-              </w:rPr>
-              <w:t xml:space="preserve">0.953</w:t>
-            </w:r>
-          </w:p>
-        </w:tc>
-        <w:tc>
-          <w:tcPr>
-            <w:tcW w:w="2400" w:type="dxa"/>
-          </w:tcPr>
-          <w:p>
-            <w:pPr>
-              <w:pStyle w:val="BT"/>
-              <w:spacing w:before="20" w:after="20"/>
-              <w:ind w:firstLine="0"/>
-              <w:jc w:val="center"/>
-            </w:pPr>
-            <w:r>
-              <w:rPr>
-                <w:sz w:val="24"/>
-              </w:rPr>
-              <w:t xml:space="preserve">0.910</w:t>
-            </w:r>
-          </w:p>
-        </w:tc>
-      </w:tr>
-    </w:tbl>
-    <w:p>
-      <w:pPr>
-        <w:pStyle w:val="BT"/>
-        <w:spacing w:before="60" w:after="160" w:line="276" w:lineRule="auto"/>
-        <w:ind w:firstLine="0"/>
-        <w:jc w:val="center"/>
-        <w:rPr>
-          <w:i/>
-          <w:iCs/>
-        </w:rPr>
-      </w:pPr>
-      <w:r>
-        <w:rPr>
-          <w:i/>
-          <w:iCs/>
-        </w:rPr>
-        <w:t xml:space="preserve">Bảng 3. Kết quả đánh giá trên tập huấn luyện, tập kiểm tra và kiểm định chéo</w:t>
-      </w:r>
-    </w:p>
-    <w:p>
-      <w:pPr>
-        <w:pStyle w:val="BT"/>
-        <w:spacing w:before="0" w:after="120" w:line="276" w:lineRule="auto"/>
-        <w:jc w:val="both"/>
-      </w:pPr>
-      <w:r>
-        <w:t xml:space="preserve">Với mô hình tuyến tính, R² trên tập huấn luyện và tập kiểm tra gần nhau, và R² qua năm phần kiểm định chéo dao động trong khoảng hẹp, nên mô hình không có dấu hiệu overfitting. Riêng với mô hình đa thức một biến theo Stress Level, R² kiểm tra tăng từ 0.804 ở bậc 1 lên 0.878 ở bậc 5 và không giảm khi tăng bậc, vì biến này chỉ có 6 giá trị khác nhau nên đa thức bậc 5 đã là mức phức tạp tối đa.</w:t>
-      </w:r>
-    </w:p>
-    <w:p>
-      <w:pPr>
-        <w:pStyle w:val="BT"/>
-        <w:spacing w:before="0" w:after="120" w:line="276" w:lineRule="auto"/>
-        <w:jc w:val="both"/>
-      </w:pPr>
-      <w:r>
-        <w:t xml:space="preserve">Với mô hình Ridge, Hình 6 cho thấy ảnh hưởng của hệ số điều chuẩn alpha đến R².</w:t>
+        <w:t xml:space="preserve">Bảng 2. So sánh năm mô hình trên dữ liệu chưa từng thấy</w:t>
       </w:r>
     </w:p>
     <w:p>
@@ -3839,7 +3805,7 @@
       <w:r>
         <w:drawing>
           <wp:inline distT="0" distB="0" distL="0" distR="0">
-            <wp:extent cx="4428000" cy="2424380"/>
+            <wp:extent cx="4752000" cy="2300968"/>
             <wp:effectExtent l="0" t="0" r="0" b="0"/>
             <wp:docPr id="206" name="Hinh 6"/>
             <wp:cNvGraphicFramePr>
@@ -3849,7 +3815,7 @@
               <a:graphicData uri="http://schemas.openxmlformats.org/drawingml/2006/picture">
                 <pic:pic xmlns:pic="http://schemas.openxmlformats.org/drawingml/2006/picture">
                   <pic:nvPicPr>
-                    <pic:cNvPr id="206" name="c30_0.png"/>
+                    <pic:cNvPr id="206" name="compare.png"/>
                     <pic:cNvPicPr/>
                   </pic:nvPicPr>
                   <pic:blipFill>
@@ -3861,7 +3827,7 @@
                   <pic:spPr>
                     <a:xfrm>
                       <a:off x="0" y="0"/>
-                      <a:ext cx="4428000" cy="2424380"/>
+                      <a:ext cx="4752000" cy="2300968"/>
                     </a:xfrm>
                     <a:prstGeom prst="rect">
                       <a:avLst/>
@@ -3890,7 +3856,7 @@
           <w:i/>
           <w:iCs/>
         </w:rPr>
-        <w:t xml:space="preserve">Hình 6. R² của mô hình Ridge theo hệ số điều chuẩn alpha</w:t>
+        <w:t xml:space="preserve">Hình 6. R² huấn luyện, kiểm tra và kiểm định chéo của năm mô hình</w:t>
       </w:r>
     </w:p>
     <w:p>
@@ -3900,22 +3866,7 @@
         <w:jc w:val="both"/>
       </w:pPr>
       <w:r>
-        <w:t xml:space="preserve">Khi alpha nhỏ (0.01), R² huấn luyện rất cao (khoảng 0.98) nhưng R² kiểm định chỉ khoảng 0.24, tức mô hình overfitting nặng. Khi alpha quá lớn, các hệ số bị phạt quá mạnh và R² giảm trên cả hai tập. Giá trị tối ưu là alpha = 8.69. Với giá trị này, Ridge đạt R² = 0.953 trên tập kiểm tra, cao hơn mô hình tuyến tính (0.914).</w:t>
-      </w:r>
-    </w:p>
-    <w:p>
-      <w:pPr>
-        <w:pStyle w:val="Heading2"/>
-        <w:spacing w:before="120" w:after="60"/>
-        <w:rPr>
-          <w:sz w:val="26"/>
-        </w:rPr>
-      </w:pPr>
-      <w:r>
-        <w:rPr>
-          <w:sz w:val="26"/>
-        </w:rPr>
-        <w:t xml:space="preserve">Độ ổn định của kết quả</w:t>
+        <w:t xml:space="preserve">Thứ nhất, hai mô hình một biến chỉ đạt R² kiểm định chéo khoảng 0.76 đến 0.80, trong khi mô hình tuyến tính bốn biến đạt 0.875: thêm biến đầu vào cải thiện rõ khả năng dự đoán. Thứ hai, mô hình đa thức bậc 2 đa biến là mô hình tốt nhất, với R² kiểm định chéo 0.944 và R² kiểm tra 0.950; R² huấn luyện và kiểm tra của mô hình này gần nhau nên không có dấu hiệu overfitting. Thứ ba, mô hình Ridge bậc 3 có R² kiểm tra nhỉnh hơn một chút ở lần chia này (0.953) nhưng thấp hơn khi kiểm định chéo (0.934), tức tăng độ phức tạp lên bậc 3 không mang lại cải thiện.</w:t>
       </w:r>
     </w:p>
     <w:p>
@@ -3925,7 +3876,7 @@
         <w:jc w:val="both"/>
       </w:pPr>
       <w:r>
-        <w:t xml:space="preserve">Vì dữ liệu chỉ có 132 hồ sơ khác nhau, nhóm lặp lại việc chia dữ liệu 30 lần với các cách chia khác nhau để kiểm tra độ ổn định. Ridge bậc 3 cho R² kiểm tra cao hơn mô hình tuyến tính ở 23 trên 30 lần, nhưng R² trung bình lại thấp hơn (0.855 so với 0.877) vì ở một số lần chia mô hình này giảm rất mạnh, thấp nhất xuống dưới 0. Mô hình tuyến tính ổn định hơn, với R² thấp nhất trong 30 lần vẫn đạt 0.795.</w:t>
+        <w:t xml:space="preserve">Về độ ổn định, qua 30 lần chia dữ liệu khác nhau, mô hình đa thức bậc 2 đa biến có R² kiểm tra trung bình cao nhất (0.936), dao động ít nhất (độ lệch chuẩn 0.021) và lần thấp nhất vẫn đạt 0.874. Các giá trị tương ứng của Ridge bậc 3 là 0.924, 0.032 và 0.823; của mô hình tuyến tính bốn biến là 0.877, 0.032 và 0.795. Hai mô hình một biến dao động mạnh nhất, với độ lệch chuẩn 0.060.</w:t>
       </w:r>
     </w:p>
     <w:p>
@@ -3947,7 +3898,7 @@
         <w:jc w:val="both"/>
       </w:pPr>
       <w:r>
-        <w:t xml:space="preserve">Đề tài đã phân tích thăm dò bộ dữ liệu Sleep Health and Lifestyle và xây dựng mô hình hồi quy dự đoán chất lượng giấc ngủ, theo quy trình tiền xử lý, trực quan hóa, xây dựng và đánh giá mô hình, với kết quả được trình bày trên dashboard Streamlit. Về phân tích thăm dò, chất lượng giấc ngủ liên hệ mạnh nhất với mức độ căng thẳng (r = −0.90) và thời lượng ngủ (r = 0.88); thể trạng liên hệ rất rõ với rối loạn giấc ngủ; Insomnia tập trung ở nhóm 36–50 tuổi còn Sleep Apnea chiếm tỷ lệ cao nhất ở nhóm 51–65 tuổi. Về mô hình, hồi quy tuyến tính bốn biến đạt R² = 0.914 trên tập kiểm tra và Ridge trên đa thức bậc 3 đạt 0.953.</w:t>
+        <w:t xml:space="preserve">Đề tài đã phân tích thăm dò bộ dữ liệu Sleep Health and Lifestyle và xây dựng mô hình hồi quy dự đoán chất lượng giấc ngủ, theo quy trình tiền xử lý, trực quan hóa, xây dựng và đánh giá mô hình, với kết quả được trình bày trên dashboard Streamlit. Về trực quan hóa và phân tích dữ liệu, chất lượng giấc ngủ liên hệ mạnh nhất với mức độ căng thẳng (r = −0.90) và thời lượng ngủ (r = 0.88); người mắc rối loạn giấc ngủ có huyết áp cao hơn rõ rệt; Insomnia tập trung ở nhóm 36–50 tuổi còn Sleep Apnea chiếm tỷ lệ cao nhất ở nhóm 51–65 tuổi. Về mô hình, nhóm đã xây dựng bốn mô hình hồi quy và so sánh với mô hình Ridge trên cùng một cách đánh giá.</w:t>
       </w:r>
     </w:p>
     <w:p>
@@ -3967,7 +3918,7 @@
         </w:sectPr>
       </w:pPr>
       <w:r>
-        <w:t xml:space="preserve">Nhóm đánh giá mô hình tuyến tính bốn biến là lựa chọn phù hợp nhất với bộ dữ liệu này: mô hình đơn giản, dễ giải thích và cho kết quả ổn định qua các cách chia dữ liệu, trong khi mô hình Ridge bậc 3 thường nhỉnh hơn nhưng có lần giảm mạnh. Các kết quả cần được hiểu trong giới hạn của dữ liệu: chỉ có 132 hồ sơ khác nhau, nghề nghiệp gần như trùng với giới tính, và dữ liệu thu thập tại một thời điểm nên chỉ cho thấy mối liên hệ chứ không chứng minh quan hệ nhân quả. Điểm nhóm rút ra được rõ nhất là cách chia dữ liệu quyết định độ tin cậy của kết quả đánh giá: nếu để các dòng trùng lặp rơi vào cả hai tập thì R² trên tập kiểm tra bị thổi phồng.</w:t>
+        <w:t xml:space="preserve">Nhóm đánh giá mô hình đa thức bậc 2 trên bốn biến là lựa chọn phù hợp nhất với bộ dữ liệu này: mô hình đạt R² = 0.950 trên tập kiểm tra, 0.944 qua kiểm định chéo và ổn định nhất qua 30 lần chia dữ liệu. Mô hình tuyến tính bốn biến đơn giản và dễ giải thích hơn nhưng kém chính xác hơn (0.875 qua kiểm định chéo), còn tăng lên bậc 3 kèm điều chuẩn Ridge không mang lại cải thiện. Các kết quả cần được hiểu trong giới hạn của dữ liệu: chỉ có 132 hồ sơ khác nhau, và dữ liệu thu thập tại một thời điểm nên chỉ cho thấy mối liên hệ chứ không chứng minh quan hệ nhân quả. Điểm nhóm rút ra được rõ nhất là cách chia dữ liệu quyết định độ tin cậy của kết quả đánh giá: nếu để các dòng trùng lặp rơi vào cả hai tập thì R² trên tập kiểm tra bị thổi phồng.</w:t>
       </w:r>
     </w:p>
     <w:p>
@@ -4203,7 +4154,7 @@
               <w:spacing w:before="60" w:after="0" w:line="276" w:lineRule="auto"/>
             </w:pPr>
             <w:r>
-              <w:t xml:space="preserve">Dựng khung dashboard Streamlit (điều hướng, bộ lọc, nạp dữ liệu); làm trang tổng quan và trang tiền xử lý dữ liệu; quản lý kho mã nguồn và file hướng dẫn chạy; viết phần mô tả bộ dữ liệu; tham gia kiểm tra chéo số liệu.</w:t>
+              <w:t xml:space="preserve">Dựng khung dashboard Streamlit (điều hướng, bộ lọc, nạp dữ liệu); làm trang tổng quan và trang tiền xử lý dữ liệu; phụ trách mô hình hồi quy tuyến tính đơn; quản lý kho mã nguồn và file hướng dẫn chạy; viết phần mô tả bộ dữ liệu; tham gia kiểm tra chéo số liệu.</w:t>
             </w:r>
           </w:p>
         </w:tc>
@@ -4251,7 +4202,7 @@
               <w:spacing w:before="60" w:after="0" w:line="276" w:lineRule="auto"/>
             </w:pPr>
             <w:r>
-              <w:t xml:space="preserve">Xây dựng các mô hình hồi quy và phần đánh giá mô hình (chia dữ liệu theo hồ sơ, kiểm định chéo, Ridge); rà soát số liệu của toàn bộ dashboard và báo cáo; viết phần phương pháp và kết quả mô hình; tổng hợp báo cáo.</w:t>
+              <w:t xml:space="preserve">Phụ trách mô hình đa thức đa biến (Pipeline), mô hình Ridge và phần so sánh, đánh giá mô hình (chia dữ liệu theo hồ sơ, kiểm định chéo); rà soát số liệu của toàn bộ dashboard và báo cáo; viết phần phương pháp và kết quả mô hình; tổng hợp báo cáo.</w:t>
             </w:r>
           </w:p>
         </w:tc>
@@ -4299,7 +4250,7 @@
               <w:spacing w:before="60" w:after="0" w:line="276" w:lineRule="auto"/>
             </w:pPr>
             <w:r>
-              <w:t xml:space="preserve">Làm các trang trực quan hóa và công cụ trực quan (rối loạn theo tuổi, huyết áp, nghề nghiệp, ma trận tương quan, radar); viết nhận xét cho các biểu đồ này; viết phần kết quả phân tích thăm dò; tham gia làm slide thuyết trình.</w:t>
+              <w:t xml:space="preserve">Làm các trang trực quan hóa và công cụ trực quan (rối loạn theo tuổi, huyết áp, nghề nghiệp, ma trận tương quan, radar); viết nhận xét cho các biểu đồ này; phụ trách mô hình hồi quy đa thức; viết phần kết quả phân tích thăm dò; tham gia làm slide thuyết trình.</w:t>
             </w:r>
           </w:p>
         </w:tc>
@@ -4347,7 +4298,7 @@
               <w:spacing w:before="60" w:after="0" w:line="276" w:lineRule="auto"/>
             </w:pPr>
             <w:r>
-              <w:t xml:space="preserve">Làm trang phân tích thăm dò (rối loạn theo BMI, nhịp tim, số bước chân) và kiểm định ANOVA; cập nhật notebook minh họa; viết phần giới thiệu và kết luận; tham gia làm slide thuyết trình và kiểm tra chéo số liệu.</w:t>
+              <w:t xml:space="preserve">Làm trang phân tích thăm dò (rối loạn theo BMI, nhịp tim, số bước chân) và kiểm định ANOVA; phụ trách mô hình hồi quy tuyến tính đa biến; cập nhật notebook minh họa; viết phần giới thiệu và kết luận; tham gia làm slide thuyết trình và kiểm tra chéo số liệu.</w:t>
             </w:r>
           </w:p>
         </w:tc>

</xml_diff>

<commit_message>
Sửa hình mô hình trong báo cáo về đúng kiểu biểu đồ phân bố
</commit_message>
<xml_diff>
--- a/Nhom08_Bao_cao.docx
+++ b/Nhom08_Bao_cao.docx
@@ -2609,7 +2609,7 @@
         <w:jc w:val="both"/>
       </w:pPr>
       <w:r>
-        <w:t xml:space="preserve">Phần này trình bày ba biểu đồ được chọn lọc từ hai trang “Trực quan hóa dữ liệu” và “Công cụ trực quan” của dashboard. Với mỗi biểu đồ, nhóm nêu kết quả khám phá được và phân tích ý nghĩa của kết quả đó. Về tổng thể, 58.6% số người trong dữ liệu không mắc rối loạn giấc ngủ, 20.9% mắc Sleep Apnea (ngưng thở khi ngủ) và 20.6% mắc Insomnia (mất ngủ). Thời lượng ngủ trung bình của ba nhóm này lần lượt là 7.36, 7.03 và 6.59 giờ; kiểm định ANOVA một yếu tố cho F = 31.91, p ≈ 1.6 × 10⁻¹³, tức sự khác biệt có ý nghĩa thống kê ở mức 0.05.</w:t>
+        <w:t xml:space="preserve">Phần này trình bày bốn biểu đồ chọn lọc từ dashboard: hai biểu đồ của trang “Trực quan hóa dữ liệu” và hai biểu đồ của trang “Công cụ trực quan”. Về tổng thể, 58.6% số người trong dữ liệu không mắc rối loạn giấc ngủ, 20.9% mắc Sleep Apnea (ngưng thở khi ngủ) và 20.6% mắc Insomnia (mất ngủ).</w:t>
       </w:r>
     </w:p>
     <w:p>
@@ -2624,7 +2624,7 @@
         <w:rPr>
           <w:sz w:val="26"/>
         </w:rPr>
-        <w:t xml:space="preserve">Biểu đồ diện tích: rối loạn giấc ngủ theo nhóm tuổi</w:t>
+        <w:t xml:space="preserve">Trực quan hóa dữ liệu</w:t>
       </w:r>
     </w:p>
     <w:p>
@@ -2648,7 +2648,7 @@
       <w:r>
         <w:drawing>
           <wp:inline distT="0" distB="0" distL="0" distR="0">
-            <wp:extent cx="3528000" cy="2188253"/>
+            <wp:extent cx="3168000" cy="1964962"/>
             <wp:effectExtent l="0" t="0" r="0" b="0"/>
             <wp:docPr id="202" name="Hinh 2"/>
             <wp:cNvGraphicFramePr>
@@ -2670,7 +2670,7 @@
                   <pic:spPr>
                     <a:xfrm>
                       <a:off x="0" y="0"/>
-                      <a:ext cx="3528000" cy="2188253"/>
+                      <a:ext cx="3168000" cy="1964962"/>
                     </a:xfrm>
                     <a:prstGeom prst="rect">
                       <a:avLst/>
@@ -2709,7 +2709,7 @@
         <w:jc w:val="both"/>
       </w:pPr>
       <w:r>
-        <w:t xml:space="preserve">Kết quả khám phá: nhóm 20–35 hầu hết không mắc rối loạn (80 trên 94 người). Insomnia tập trung ở nhóm 36–50 với 65 người, rồi giảm còn 7 người ở nhóm 51–65. Ngược lại, Sleep Apnea tăng dần theo tuổi, từ 9 người ở nhóm 20–35 lên 36 người ở nhóm 36–50 và chiếm tỷ lệ cao nhất ở nhóm 51–65 (33 trên 76 người).</w:t>
+        <w:t xml:space="preserve">Nhóm 20–35 hầu hết không mắc rối loạn (80 trên 94 người). Insomnia tập trung ở nhóm 36–50 với 65 người rồi giảm còn 7 người ở nhóm 51–65, trong khi Sleep Apnea tăng dần theo tuổi và chiếm tỷ lệ cao nhất ở nhóm 51–65 (33 trên 76 người). Như vậy hai dạng rối loạn có phân bố theo tuổi khác nhau: mất ngủ nổi bật ở tuổi trung niên, ngưng thở khi ngủ nổi bật ở nhóm lớn tuổi nhất.</w:t>
       </w:r>
     </w:p>
     <w:p>
@@ -2719,32 +2719,7 @@
         <w:jc w:val="both"/>
       </w:pPr>
       <w:r>
-        <w:t xml:space="preserve">Phân tích: hai dạng rối loạn có phân bố theo tuổi khác nhau, nên không thể gộp chung thành một nhận định “càng lớn tuổi càng rối loạn giấc ngủ”. Mất ngủ là vấn đề nổi bật của tuổi trung niên, còn ngưng thở khi ngủ là vấn đề nổi bật của nhóm lớn tuổi nhất trong dữ liệu.</w:t>
-      </w:r>
-    </w:p>
-    <w:p>
-      <w:pPr>
-        <w:pStyle w:val="Heading2"/>
-        <w:spacing w:before="120" w:after="60"/>
-        <w:rPr>
-          <w:sz w:val="26"/>
-        </w:rPr>
-      </w:pPr>
-      <w:r>
-        <w:rPr>
-          <w:sz w:val="26"/>
-        </w:rPr>
-        <w:t xml:space="preserve">Biểu đồ phân tán: huyết áp và rối loạn giấc ngủ</w:t>
-      </w:r>
-    </w:p>
-    <w:p>
-      <w:pPr>
-        <w:pStyle w:val="BT"/>
-        <w:spacing w:before="0" w:after="120" w:line="276" w:lineRule="auto"/>
-        <w:jc w:val="both"/>
-      </w:pPr>
-      <w:r>
-        <w:t xml:space="preserve">Hình 3 là biểu đồ phân tán giữa huyết áp tâm thu và huyết áp tâm trương, tô màu theo tình trạng rối loạn giấc ngủ; kích thước mỗi điểm tỷ lệ với số người có cùng giá trị, hai đường nét đứt đánh dấu mức 130/85 mmHg.</w:t>
+        <w:t xml:space="preserve">Hình 3 là biểu đồ phân tán giữa huyết áp tâm thu và tâm trương, tô màu theo tình trạng rối loạn giấc ngủ; kích thước điểm tỷ lệ với số người có cùng giá trị, hai đường nét đứt đánh dấu mức 130/85 mmHg.</w:t>
       </w:r>
     </w:p>
     <w:p>
@@ -2758,7 +2733,7 @@
       <w:r>
         <w:drawing>
           <wp:inline distT="0" distB="0" distL="0" distR="0">
-            <wp:extent cx="3816000" cy="2385000"/>
+            <wp:extent cx="3384000" cy="2115000"/>
             <wp:effectExtent l="0" t="0" r="0" b="0"/>
             <wp:docPr id="203" name="Hinh 3"/>
             <wp:cNvGraphicFramePr>
@@ -2780,7 +2755,7 @@
                   <pic:spPr>
                     <a:xfrm>
                       <a:off x="0" y="0"/>
-                      <a:ext cx="3816000" cy="2385000"/>
+                      <a:ext cx="3384000" cy="2115000"/>
                     </a:xfrm>
                     <a:prstGeom prst="rect">
                       <a:avLst/>
@@ -2819,17 +2794,7 @@
         <w:jc w:val="both"/>
       </w:pPr>
       <w:r>
-        <w:t xml:space="preserve">Kết quả khám phá: các nhóm tách thành cụm khá rõ. Khoảng 95% người mắc Insomnia (73 trên 77) và 95% người mắc Sleep Apnea (74 trên 78) có huyết áp từ 130/85 mmHg trở lên, trong khi tỷ lệ này ở nhóm không mắc rối loạn chỉ là 28% (61 trên 219). Riêng nhóm Sleep Apnea tập trung ở góc cao nhất của biểu đồ: 59 trên 78 người có huyết áp đúng bằng 140/95 mmHg.</w:t>
-      </w:r>
-    </w:p>
-    <w:p>
-      <w:pPr>
-        <w:pStyle w:val="BT"/>
-        <w:spacing w:before="0" w:after="120" w:line="276" w:lineRule="auto"/>
-        <w:jc w:val="both"/>
-      </w:pPr>
-      <w:r>
-        <w:t xml:space="preserve">Phân tích: rối loạn giấc ngủ, đặc biệt là ngưng thở khi ngủ, đi kèm với huyết áp cao trong bộ dữ liệu này. Vì dữ liệu chỉ ghi nhận tại một thời điểm, biểu đồ cho thấy mối liên hệ chứ chưa cho biết yếu tố nào là nguyên nhân.</w:t>
+        <w:t xml:space="preserve">Các nhóm tách thành cụm khá rõ: khoảng 95% người mắc Insomnia (73 trên 77) và Sleep Apnea (74 trên 78) có huyết áp từ 130/85 mmHg trở lên, so với 28% ở nhóm không mắc rối loạn (61 trên 219). Riêng nhóm Sleep Apnea tập trung ở góc cao nhất, với 59 trên 78 người có huyết áp 140/95 mmHg. Rối loạn giấc ngủ vì vậy đi kèm với huyết áp cao; do dữ liệu chỉ ghi nhận tại một thời điểm, đây là mối liên hệ chứ chưa phải quan hệ nhân quả.</w:t>
       </w:r>
     </w:p>
     <w:p>
@@ -2844,7 +2809,7 @@
         <w:rPr>
           <w:sz w:val="26"/>
         </w:rPr>
-        <w:t xml:space="preserve">Bản đồ nhiệt: tương quan giữa các biến số</w:t>
+        <w:t xml:space="preserve">Công cụ trực quan</w:t>
       </w:r>
     </w:p>
     <w:p>
@@ -2868,7 +2833,7 @@
       <w:r>
         <w:drawing>
           <wp:inline distT="0" distB="0" distL="0" distR="0">
-            <wp:extent cx="3456000" cy="2774535"/>
+            <wp:extent cx="3168000" cy="2543323"/>
             <wp:effectExtent l="0" t="0" r="0" b="0"/>
             <wp:docPr id="204" name="Hinh 4"/>
             <wp:cNvGraphicFramePr>
@@ -2890,7 +2855,7 @@
                   <pic:spPr>
                     <a:xfrm>
                       <a:off x="0" y="0"/>
-                      <a:ext cx="3456000" cy="2774535"/>
+                      <a:ext cx="3168000" cy="2543323"/>
                     </a:xfrm>
                     <a:prstGeom prst="rect">
                       <a:avLst/>
@@ -2929,7 +2894,7 @@
         <w:jc w:val="both"/>
       </w:pPr>
       <w:r>
-        <w:t xml:space="preserve">Kết quả khám phá: chất lượng giấc ngủ tương quan nghịch mạnh với mức độ căng thẳng (r = −0.90) và nhịp tim (r = −0.66), tương quan thuận mạnh với thời lượng ngủ (r = 0.88). Bản thân căng thẳng và thời lượng ngủ cũng tương quan nghịch (r = −0.81). Ngược lại, số bước chân mỗi ngày gần như không tương quan với chất lượng giấc ngủ (r = 0.02) và mức vận động chỉ tương quan yếu (r = 0.19). Chất lượng giấc ngủ trung bình giảm từ 8.97 ở mức căng thẳng 3 xuống 5.86 ở mức căng thẳng 8.</w:t>
+        <w:t xml:space="preserve">Chất lượng giấc ngủ tương quan nghịch mạnh với mức độ căng thẳng (r = −0.90) và nhịp tim (r = −0.66), tương quan thuận mạnh với thời lượng ngủ (r = 0.88); số bước chân mỗi ngày gần như không tương quan (r = 0.02). Căng thẳng và thời lượng ngủ vì vậy được chọn làm biến đầu vào chính cho mô hình hồi quy. Hai biến này lại tương quan mạnh với nhau (r = −0.81), tức chúng mang một phần thông tin trùng lặp.</w:t>
       </w:r>
     </w:p>
     <w:p>
@@ -2939,29 +2904,7 @@
         <w:jc w:val="both"/>
       </w:pPr>
       <w:r>
-        <w:t xml:space="preserve">Phân tích: căng thẳng và thời lượng ngủ là hai yếu tố gắn với chất lượng giấc ngủ chặt nhất, nên được chọn làm biến đầu vào chính cho mô hình hồi quy ở phần sau. Hai biến này lại tương quan mạnh với nhau, tức chúng mang một phần thông tin trùng lặp; đây là lý do mô hình nhiều biến chỉ cải thiện vừa phải so với mô hình một biến.</w:t>
-      </w:r>
-    </w:p>
-    <w:p>
-      <w:pPr>
-        <w:pStyle w:val="Heading1"/>
-        <w:spacing w:before="240" w:after="120"/>
-      </w:pPr>
-      <w:r>
-        <w:tab/>
-      </w:r>
-      <w:r>
-        <w:t xml:space="preserve">MÔ HÌNH HỒI QUY VÀ SO SÁNH MÔ HÌNH</w:t>
-      </w:r>
-    </w:p>
-    <w:p>
-      <w:pPr>
-        <w:pStyle w:val="BT"/>
-        <w:spacing w:before="0" w:after="120" w:line="276" w:lineRule="auto"/>
-        <w:jc w:val="both"/>
-      </w:pPr>
-      <w:r>
-        <w:t xml:space="preserve">Phần này trình bày bốn mô hình hồi quy dự đoán Quality of Sleep, sau đó so sánh chúng với nhau và với mô hình Ridge. Hình 5 minh họa bốn mô hình khi huấn luyện trên toàn bộ dữ liệu: hai hình trên là đường hồi quy của hai mô hình một biến, hai hình dưới so sánh giá trị dự đoán với giá trị thực tế của hai mô hình bốn biến (điểm càng gần đường chéo thì dự đoán càng chính xác).</w:t>
+        <w:t xml:space="preserve">Hình 5 là biểu đồ radar so sánh năm chỉ số trung bình của bốn nghề đông người nhất; mỗi chỉ số được chuẩn hóa về thang 0–1 theo giá trị trung bình thấp nhất và cao nhất trong 11 nghề.</w:t>
       </w:r>
     </w:p>
     <w:p>
@@ -2975,7 +2918,7 @@
       <w:r>
         <w:drawing>
           <wp:inline distT="0" distB="0" distL="0" distR="0">
-            <wp:extent cx="5040000" cy="3757090"/>
+            <wp:extent cx="2736000" cy="2892687"/>
             <wp:effectExtent l="0" t="0" r="0" b="0"/>
             <wp:docPr id="205" name="Hinh 5"/>
             <wp:cNvGraphicFramePr>
@@ -2985,7 +2928,7 @@
               <a:graphicData uri="http://schemas.openxmlformats.org/drawingml/2006/picture">
                 <pic:pic xmlns:pic="http://schemas.openxmlformats.org/drawingml/2006/picture">
                   <pic:nvPicPr>
-                    <pic:cNvPr id="205" name="models4.png"/>
+                    <pic:cNvPr id="205" name="radar.png"/>
                     <pic:cNvPicPr/>
                   </pic:nvPicPr>
                   <pic:blipFill>
@@ -2997,7 +2940,7 @@
                   <pic:spPr>
                     <a:xfrm>
                       <a:off x="0" y="0"/>
-                      <a:ext cx="5040000" cy="3757090"/>
+                      <a:ext cx="2736000" cy="2892687"/>
                     </a:xfrm>
                     <a:prstGeom prst="rect">
                       <a:avLst/>
@@ -3026,7 +2969,104 @@
           <w:i/>
           <w:iCs/>
         </w:rPr>
-        <w:t xml:space="preserve">Hình 5. Bốn mô hình hồi quy huấn luyện trên toàn bộ dữ liệu</w:t>
+        <w:t xml:space="preserve">Hình 5. Biểu đồ radar: hồ sơ chỉ số sức khỏe của bốn nghề đông người nhất</w:t>
+      </w:r>
+    </w:p>
+    <w:p>
+      <w:pPr>
+        <w:pStyle w:val="BT"/>
+        <w:spacing w:before="0" w:after="120" w:line="276" w:lineRule="auto"/>
+        <w:jc w:val="both"/>
+      </w:pPr>
+      <w:r>
+        <w:t xml:space="preserve">Engineer có thời lượng ngủ (7.99 giờ) và chất lượng giấc ngủ (8.41) cao nhất, đồng thời mức căng thẳng (3.89) thấp nhất; Doctor có mức căng thẳng cao nhất (6.73) và chất lượng giấc ngủ thấp nhất (6.65); Nurse vận động nhiều nhất (78.6 phút mỗi ngày). Nghề có mức căng thẳng thấp cũng là nghề ngủ tốt, phù hợp với Hình 4. Tuy nhiên nghề nghiệp và giới tính gần như trùng nhau (toàn bộ 73 Nurse là nữ, 69 trên 71 Doctor là nam), nên khác biệt giữa các nghề không tách riêng được khỏi khác biệt giữa hai giới.</w:t>
+      </w:r>
+    </w:p>
+    <w:p>
+      <w:pPr>
+        <w:pStyle w:val="Heading1"/>
+        <w:spacing w:before="240" w:after="120"/>
+      </w:pPr>
+      <w:r>
+        <w:tab/>
+      </w:r>
+      <w:r>
+        <w:t xml:space="preserve">MÔ HÌNH HỒI QUY VÀ SO SÁNH MÔ HÌNH</w:t>
+      </w:r>
+    </w:p>
+    <w:p>
+      <w:pPr>
+        <w:pStyle w:val="BT"/>
+        <w:spacing w:before="0" w:after="120" w:line="276" w:lineRule="auto"/>
+        <w:jc w:val="both"/>
+      </w:pPr>
+      <w:r>
+        <w:t xml:space="preserve">Phần này trình bày bốn mô hình hồi quy dự đoán Quality of Sleep và một mô hình so sánh. Hình 6 minh họa bốn mô hình khi huấn luyện trên toàn bộ dữ liệu: hai hình trên là đường hồi quy của hai mô hình một biến, hai hình dưới là biểu đồ phân bố (distribution plot) của hai mô hình bốn biến, so sánh phân bố của giá trị dự đoán với phân bố của giá trị thực tế (hai đường càng trùng nhau thì mô hình càng khớp).</w:t>
+      </w:r>
+    </w:p>
+    <w:p>
+      <w:pPr>
+        <w:pStyle w:val="BT"/>
+        <w:keepNext/>
+        <w:spacing w:before="60" w:after="0"/>
+        <w:ind w:firstLine="0"/>
+        <w:jc w:val="center"/>
+      </w:pPr>
+      <w:r>
+        <w:drawing>
+          <wp:inline distT="0" distB="0" distL="0" distR="0">
+            <wp:extent cx="4536000" cy="3381381"/>
+            <wp:effectExtent l="0" t="0" r="0" b="0"/>
+            <wp:docPr id="206" name="Hinh 6"/>
+            <wp:cNvGraphicFramePr>
+              <a:graphicFrameLocks xmlns:a="http://schemas.openxmlformats.org/drawingml/2006/main" noChangeAspect="1"/>
+            </wp:cNvGraphicFramePr>
+            <a:graphic xmlns:a="http://schemas.openxmlformats.org/drawingml/2006/main">
+              <a:graphicData uri="http://schemas.openxmlformats.org/drawingml/2006/picture">
+                <pic:pic xmlns:pic="http://schemas.openxmlformats.org/drawingml/2006/picture">
+                  <pic:nvPicPr>
+                    <pic:cNvPr id="206" name="models4.png"/>
+                    <pic:cNvPicPr/>
+                  </pic:nvPicPr>
+                  <pic:blipFill>
+                    <a:blip r:embed="rId906"/>
+                    <a:stretch>
+                      <a:fillRect/>
+                    </a:stretch>
+                  </pic:blipFill>
+                  <pic:spPr>
+                    <a:xfrm>
+                      <a:off x="0" y="0"/>
+                      <a:ext cx="4536000" cy="3381381"/>
+                    </a:xfrm>
+                    <a:prstGeom prst="rect">
+                      <a:avLst/>
+                    </a:prstGeom>
+                  </pic:spPr>
+                </pic:pic>
+              </a:graphicData>
+            </a:graphic>
+          </wp:inline>
+        </w:drawing>
+      </w:r>
+    </w:p>
+    <w:p>
+      <w:pPr>
+        <w:pStyle w:val="BT"/>
+        <w:spacing w:before="60" w:after="160" w:line="276" w:lineRule="auto"/>
+        <w:ind w:firstLine="0"/>
+        <w:jc w:val="center"/>
+        <w:rPr>
+          <w:i/>
+          <w:iCs/>
+        </w:rPr>
+      </w:pPr>
+      <w:r>
+        <w:rPr>
+          <w:i/>
+          <w:iCs/>
+        </w:rPr>
+        <w:t xml:space="preserve">Hình 6. Bốn mô hình hồi quy huấn luyện trên toàn bộ dữ liệu</w:t>
       </w:r>
     </w:p>
     <w:p>
@@ -3051,7 +3091,7 @@
         <w:jc w:val="both"/>
       </w:pPr>
       <w:r>
-        <w:t xml:space="preserve">Mô hình dự đoán chất lượng giấc ngủ từ một biến là thời lượng ngủ. Phương trình thu được là Quality of Sleep = −2.163 + 1.329 × Sleep Duration, tức mỗi giờ ngủ thêm ứng với chất lượng giấc ngủ tăng khoảng 1.33 điểm. Mô hình đạt R² = 0.780 và MSE = 0.314: riêng thời lượng ngủ đã giải thích được 78% sự biến thiên của chất lượng giấc ngủ. Hình 5a cho thấy đường thẳng bám theo xu hướng chung nhưng còn sai lệch ở những người ngủ cùng thời lượng mà chất lượng khác nhau.</w:t>
+        <w:t xml:space="preserve">Mô hình dự đoán từ một biến là thời lượng ngủ, với phương trình Quality of Sleep = −2.163 + 1.329 × Sleep Duration: mỗi giờ ngủ thêm ứng với chất lượng giấc ngủ tăng khoảng 1.33 điểm. Mô hình đạt R² = 0.780 và MSE = 0.314.</w:t>
       </w:r>
     </w:p>
     <w:p>
@@ -3076,7 +3116,7 @@
         <w:jc w:val="both"/>
       </w:pPr>
       <w:r>
-        <w:t xml:space="preserve">Mô hình dùng một biến là mức độ căng thẳng, với đa thức bậc 2 để mô tả quan hệ không hoàn toàn tuyến tính. Phương trình thu được là Quality of Sleep = 11.084 − 0.811 × Stress + 0.019 × Stress². Mô hình đạt R² = 0.809 và MSE = 0.273, cao hơn mô hình tuyến tính đơn một chút. Hệ số của số hạng bậc 2 rất nhỏ nên đường cong ở Hình 5b gần như là đường thẳng: quan hệ giữa căng thẳng và chất lượng giấc ngủ trong dữ liệu này chủ yếu là tuyến tính.</w:t>
+        <w:t xml:space="preserve">Mô hình dùng đa thức bậc 2 của mức độ căng thẳng, với phương trình Quality of Sleep = 11.084 − 0.811 × Stress + 0.019 × Stress². Mô hình đạt R² = 0.809 và MSE = 0.273. Hệ số bậc 2 rất nhỏ nên đường cong ở Hình 6b gần như thẳng: quan hệ này chủ yếu là tuyến tính.</w:t>
       </w:r>
     </w:p>
     <w:p>
@@ -3101,7 +3141,7 @@
         <w:jc w:val="both"/>
       </w:pPr>
       <w:r>
-        <w:t xml:space="preserve">Mô hình dùng đồng thời bốn biến: Sleep Duration, Stress Level, Heart Rate và Physical Activity Level. Hệ số của bốn biến lần lượt là 0.605, −0.313, −0.045 và 0.007, với hệ số chặn 7.488; dấu của các hệ số cùng chiều với tương quan đã thấy ở Hình 4. Mô hình đạt R² = 0.897 và MSE = 0.147, tức sai số giảm hơn một nửa so với mô hình tuyến tính đơn. Kết hợp thời lượng ngủ và căng thẳng cho thông tin đầy đủ hơn hẳn từng biến riêng lẻ.</w:t>
+        <w:t xml:space="preserve">Mô hình dùng bốn biến Sleep Duration, Stress Level, Heart Rate và Physical Activity Level, với các hệ số lần lượt là 0.605, −0.313, −0.045 và 0.007, cùng chiều với tương quan ở Hình 4. Mô hình đạt R² = 0.897 và MSE = 0.147, tức sai số giảm hơn một nửa so với mô hình 1.</w:t>
       </w:r>
     </w:p>
     <w:p>
@@ -3126,7 +3166,7 @@
         <w:jc w:val="both"/>
       </w:pPr>
       <w:r>
-        <w:t xml:space="preserve">Mô hình là một pipeline gồm ba bước: chuẩn hóa bốn biến đầu vào, tạo các đặc trưng đa thức bậc 2 (gồm bình phương của từng biến và tích của từng cặp biến, tổng cộng 14 đặc trưng), rồi hồi quy tuyến tính trên các đặc trưng đó. Mô hình đạt R² = 0.959 và MSE = 0.059, cao nhất trong bốn mô hình. Ở Hình 5d, các điểm bám sát đường chéo hơn Hình 5c, nhất là ở vùng chất lượng giấc ngủ thấp (4 đến 5 điểm) mà mô hình tuyến tính dự đoán chưa tốt.</w:t>
+        <w:t xml:space="preserve">Mô hình là một pipeline gồm chuẩn hóa bốn biến, tạo 14 đặc trưng đa thức bậc 2 (bình phương từng biến và tích từng cặp biến) rồi hồi quy tuyến tính. Mô hình đạt R² = 0.959 và MSE = 0.059, cao nhất trong bốn mô hình; ở Hình 6d đường dự đoán bám sát các đỉnh của đường thực tế hơn so với Hình 6c.</w:t>
       </w:r>
     </w:p>
     <w:p>
@@ -3151,7 +3191,7 @@
         <w:jc w:val="both"/>
       </w:pPr>
       <w:r>
-        <w:t xml:space="preserve">Các chỉ số ở trên được tính trên chính dữ liệu huấn luyện nên luôn tăng theo độ phức tạp của mô hình. Để so sánh công bằng, nhóm đánh giá lại cả bốn mô hình trên dữ liệu chưa từng thấy theo phương pháp chia theo hồ sơ, và thêm mô hình Ridge trên đa thức bậc 3 làm mô hình so sánh. Với Ridge, hệ số alpha tối ưu chọn được là 8.69; khi alpha quá nhỏ (0.01) mô hình bậc 3 overfitting nặng, với R² kiểm định chỉ khoảng 0.24. Kết quả được trình bày ở Bảng 2 và Hình 6.</w:t>
+        <w:t xml:space="preserve">Các chỉ số ở trên được tính trên chính dữ liệu huấn luyện nên luôn tăng theo độ phức tạp. Để so sánh công bằng, nhóm đánh giá lại bốn mô hình trên dữ liệu chưa từng thấy theo phương pháp chia theo hồ sơ, và thêm mô hình Ridge trên đa thức bậc 3 (alpha tối ưu 8.69) làm mô hình so sánh. Kết quả được trình bày ở Bảng 2 và Hình 7.</w:t>
       </w:r>
     </w:p>
     <w:tbl>
@@ -3805,9 +3845,9 @@
       <w:r>
         <w:drawing>
           <wp:inline distT="0" distB="0" distL="0" distR="0">
-            <wp:extent cx="4752000" cy="2300968"/>
+            <wp:extent cx="4392000" cy="2126652"/>
             <wp:effectExtent l="0" t="0" r="0" b="0"/>
-            <wp:docPr id="206" name="Hinh 6"/>
+            <wp:docPr id="207" name="Hinh 7"/>
             <wp:cNvGraphicFramePr>
               <a:graphicFrameLocks xmlns:a="http://schemas.openxmlformats.org/drawingml/2006/main" noChangeAspect="1"/>
             </wp:cNvGraphicFramePr>
@@ -3815,11 +3855,11 @@
               <a:graphicData uri="http://schemas.openxmlformats.org/drawingml/2006/picture">
                 <pic:pic xmlns:pic="http://schemas.openxmlformats.org/drawingml/2006/picture">
                   <pic:nvPicPr>
-                    <pic:cNvPr id="206" name="compare.png"/>
+                    <pic:cNvPr id="207" name="compare.png"/>
                     <pic:cNvPicPr/>
                   </pic:nvPicPr>
                   <pic:blipFill>
-                    <a:blip r:embed="rId906"/>
+                    <a:blip r:embed="rId907"/>
                     <a:stretch>
                       <a:fillRect/>
                     </a:stretch>
@@ -3827,7 +3867,7 @@
                   <pic:spPr>
                     <a:xfrm>
                       <a:off x="0" y="0"/>
-                      <a:ext cx="4752000" cy="2300968"/>
+                      <a:ext cx="4392000" cy="2126652"/>
                     </a:xfrm>
                     <a:prstGeom prst="rect">
                       <a:avLst/>
@@ -3856,7 +3896,7 @@
           <w:i/>
           <w:iCs/>
         </w:rPr>
-        <w:t xml:space="preserve">Hình 6. R² huấn luyện, kiểm tra và kiểm định chéo của năm mô hình</w:t>
+        <w:t xml:space="preserve">Hình 7. R² huấn luyện, kiểm tra và kiểm định chéo của năm mô hình</w:t>
       </w:r>
     </w:p>
     <w:p>
@@ -3866,17 +3906,7 @@
         <w:jc w:val="both"/>
       </w:pPr>
       <w:r>
-        <w:t xml:space="preserve">Thứ nhất, hai mô hình một biến chỉ đạt R² kiểm định chéo khoảng 0.76 đến 0.80, trong khi mô hình tuyến tính bốn biến đạt 0.875: thêm biến đầu vào cải thiện rõ khả năng dự đoán. Thứ hai, mô hình đa thức bậc 2 đa biến là mô hình tốt nhất, với R² kiểm định chéo 0.944 và R² kiểm tra 0.950; R² huấn luyện và kiểm tra của mô hình này gần nhau nên không có dấu hiệu overfitting. Thứ ba, mô hình Ridge bậc 3 có R² kiểm tra nhỉnh hơn một chút ở lần chia này (0.953) nhưng thấp hơn khi kiểm định chéo (0.934), tức tăng độ phức tạp lên bậc 3 không mang lại cải thiện.</w:t>
-      </w:r>
-    </w:p>
-    <w:p>
-      <w:pPr>
-        <w:pStyle w:val="BT"/>
-        <w:spacing w:before="0" w:after="120" w:line="276" w:lineRule="auto"/>
-        <w:jc w:val="both"/>
-      </w:pPr>
-      <w:r>
-        <w:t xml:space="preserve">Về độ ổn định, qua 30 lần chia dữ liệu khác nhau, mô hình đa thức bậc 2 đa biến có R² kiểm tra trung bình cao nhất (0.936), dao động ít nhất (độ lệch chuẩn 0.021) và lần thấp nhất vẫn đạt 0.874. Các giá trị tương ứng của Ridge bậc 3 là 0.924, 0.032 và 0.823; của mô hình tuyến tính bốn biến là 0.877, 0.032 và 0.795. Hai mô hình một biến dao động mạnh nhất, với độ lệch chuẩn 0.060.</w:t>
+        <w:t xml:space="preserve">Hai mô hình một biến chỉ đạt R² kiểm định chéo khoảng 0.76 đến 0.80, trong khi mô hình tuyến tính bốn biến đạt 0.875: thêm biến đầu vào cải thiện rõ khả năng dự đoán. Mô hình 4 là mô hình tốt nhất, với R² kiểm định chéo 0.944 và R² kiểm tra 0.950; R² huấn luyện và kiểm tra gần nhau nên không có dấu hiệu overfitting. Mô hình Ridge bậc 3 nhỉnh hơn một chút ở lần chia này (0.953) nhưng thấp hơn khi kiểm định chéo (0.934), tức tăng lên bậc 3 không mang lại cải thiện. Qua 30 lần chia dữ liệu khác nhau, mô hình 4 cũng ổn định nhất: R² kiểm tra trung bình 0.936, độ lệch chuẩn 0.021 và lần thấp nhất vẫn đạt 0.874.</w:t>
       </w:r>
     </w:p>
     <w:p>

</xml_diff>

<commit_message>
Thêm ANOVA vào dashboard, báo cáo dùng hình của dashboard
</commit_message>
<xml_diff>
--- a/Nhom08_Bao_cao.docx
+++ b/Nhom08_Bao_cao.docx
@@ -2491,7 +2491,7 @@
         <w:jc w:val="both"/>
       </w:pPr>
       <w:r>
-        <w:t xml:space="preserve">Dữ liệu được làm sạch qua bốn bước sau, áp dụng thống nhất cho cả dashboard và notebook:</w:t>
+        <w:t xml:space="preserve">Dữ liệu được làm sạch qua bốn bước sau, thực hiện một lần khi nạp dữ liệu và dùng chung cho mọi trang của dashboard:</w:t>
       </w:r>
     </w:p>
     <w:p>
@@ -2587,7 +2587,7 @@
         <w:jc w:val="both"/>
       </w:pPr>
       <w:r>
-        <w:t xml:space="preserve">Đề tài sử dụng Python với các thư viện pandas, NumPy, Matplotlib, Seaborn, Plotly, SciPy, scikit-learn [2] và Streamlit [3]. Sản phẩm gồm một dashboard Streamlit bảy trang có bộ lọc theo giới tính và nhóm BMI, cùng một notebook minh họa từng bước. Để tái lập kết quả, cài các thư viện liệt kê trong file requirements.txt rồi chạy file app.py bằng Streamlit từ thư mục gốc của mã nguồn; mọi con số trong báo cáo tương ứng với trạng thái không áp dụng bộ lọc trên dashboard và cũng được in ra khi chạy lại notebook Code_demo.ipynb.</w:t>
+        <w:t xml:space="preserve">Đề tài sử dụng Python với các thư viện pandas, NumPy, Matplotlib, Seaborn, Plotly, SciPy, scikit-learn [2] và Streamlit [3]. Sản phẩm là một dashboard Streamlit bảy trang có bộ lọc theo giới tính và nhóm BMI. Để tái lập kết quả, cài các thư viện liệt kê trong file requirements.txt rồi chạy file app.py bằng Streamlit từ thư mục gốc của mã nguồn; mọi con số và hình trong báo cáo tương ứng với trạng thái không áp dụng bộ lọc trên dashboard.</w:t>
       </w:r>
     </w:p>
     <w:p>
@@ -2609,7 +2609,7 @@
         <w:jc w:val="both"/>
       </w:pPr>
       <w:r>
-        <w:t xml:space="preserve">Phần này trình bày bốn biểu đồ chọn lọc từ dashboard: hai biểu đồ của trang “Trực quan hóa dữ liệu” và hai biểu đồ của trang “Công cụ trực quan”. Về tổng thể, 58.6% số người trong dữ liệu không mắc rối loạn giấc ngủ, 20.9% mắc Sleep Apnea (ngưng thở khi ngủ) và 20.6% mắc Insomnia (mất ngủ).</w:t>
+        <w:t xml:space="preserve">Phần này trình bày bốn biểu đồ lấy trực tiếp từ dashboard: hai biểu đồ của trang “Trực quan hóa dữ liệu” và hai biểu đồ của trang “Công cụ trực quan”. Về tổng thể, 58.6% số người trong dữ liệu không mắc rối loạn giấc ngủ, 20.9% mắc Sleep Apnea (ngưng thở khi ngủ) và 20.6% mắc Insomnia (mất ngủ).</w:t>
       </w:r>
     </w:p>
     <w:p>
@@ -2648,7 +2648,7 @@
       <w:r>
         <w:drawing>
           <wp:inline distT="0" distB="0" distL="0" distR="0">
-            <wp:extent cx="3168000" cy="1964962"/>
+            <wp:extent cx="3780000" cy="2184000"/>
             <wp:effectExtent l="0" t="0" r="0" b="0"/>
             <wp:docPr id="202" name="Hinh 2"/>
             <wp:cNvGraphicFramePr>
@@ -2658,7 +2658,7 @@
               <a:graphicData uri="http://schemas.openxmlformats.org/drawingml/2006/picture">
                 <pic:pic xmlns:pic="http://schemas.openxmlformats.org/drawingml/2006/picture">
                   <pic:nvPicPr>
-                    <pic:cNvPr id="202" name="c11_0.png"/>
+                    <pic:cNvPr id="202" name="dash_ch3_1.png"/>
                     <pic:cNvPicPr/>
                   </pic:nvPicPr>
                   <pic:blipFill>
@@ -2670,7 +2670,7 @@
                   <pic:spPr>
                     <a:xfrm>
                       <a:off x="0" y="0"/>
-                      <a:ext cx="3168000" cy="1964962"/>
+                      <a:ext cx="3780000" cy="2184000"/>
                     </a:xfrm>
                     <a:prstGeom prst="rect">
                       <a:avLst/>
@@ -2719,7 +2719,7 @@
         <w:jc w:val="both"/>
       </w:pPr>
       <w:r>
-        <w:t xml:space="preserve">Hình 3 là biểu đồ phân tán giữa huyết áp tâm thu và tâm trương, tô màu theo tình trạng rối loạn giấc ngủ; kích thước điểm tỷ lệ với số người có cùng giá trị, hai đường nét đứt đánh dấu mức 130/85 mmHg.</w:t>
+        <w:t xml:space="preserve">Hình 3 là biểu đồ phân tán giữa huyết áp tâm thu và tâm trương, tô màu theo tình trạng rối loạn giấc ngủ; kích thước điểm thể hiện nhịp tim.</w:t>
       </w:r>
     </w:p>
     <w:p>
@@ -2733,7 +2733,7 @@
       <w:r>
         <w:drawing>
           <wp:inline distT="0" distB="0" distL="0" distR="0">
-            <wp:extent cx="3384000" cy="2115000"/>
+            <wp:extent cx="3780000" cy="2184000"/>
             <wp:effectExtent l="0" t="0" r="0" b="0"/>
             <wp:docPr id="203" name="Hinh 3"/>
             <wp:cNvGraphicFramePr>
@@ -2743,7 +2743,7 @@
               <a:graphicData uri="http://schemas.openxmlformats.org/drawingml/2006/picture">
                 <pic:pic xmlns:pic="http://schemas.openxmlformats.org/drawingml/2006/picture">
                   <pic:nvPicPr>
-                    <pic:cNvPr id="203" name="bp_scatter.png"/>
+                    <pic:cNvPr id="203" name="dash_ch3_2.png"/>
                     <pic:cNvPicPr/>
                   </pic:nvPicPr>
                   <pic:blipFill>
@@ -2755,7 +2755,7 @@
                   <pic:spPr>
                     <a:xfrm>
                       <a:off x="0" y="0"/>
-                      <a:ext cx="3384000" cy="2115000"/>
+                      <a:ext cx="3780000" cy="2184000"/>
                     </a:xfrm>
                     <a:prstGeom prst="rect">
                       <a:avLst/>
@@ -2794,7 +2794,7 @@
         <w:jc w:val="both"/>
       </w:pPr>
       <w:r>
-        <w:t xml:space="preserve">Các nhóm tách thành cụm khá rõ: khoảng 95% người mắc Insomnia (73 trên 77) và Sleep Apnea (74 trên 78) có huyết áp từ 130/85 mmHg trở lên, so với 28% ở nhóm không mắc rối loạn (61 trên 219). Riêng nhóm Sleep Apnea tập trung ở góc cao nhất, với 59 trên 78 người có huyết áp 140/95 mmHg. Rối loạn giấc ngủ vì vậy đi kèm với huyết áp cao; do dữ liệu chỉ ghi nhận tại một thời điểm, đây là mối liên hệ chứ chưa phải quan hệ nhân quả.</w:t>
+        <w:t xml:space="preserve">Trên biểu đồ, các điểm của nhóm không mắc rối loạn nằm chủ yếu ở nửa dưới bên trái, còn các điểm Insomnia và Sleep Apnea nằm chủ yếu ở nửa trên bên phải. Tính trên dữ liệu, khoảng 95% người mắc Insomnia (73 trên 77) và Sleep Apnea (74 trên 78) có huyết áp từ 130/85 mmHg trở lên, so với 28% ở nhóm không mắc rối loạn (61 trên 219); riêng nhóm Sleep Apnea có 59 trên 78 người ở mức 140/95 mmHg. Rối loạn giấc ngủ vì vậy đi kèm với huyết áp cao; do dữ liệu chỉ ghi nhận tại một thời điểm, đây là mối liên hệ chứ chưa phải quan hệ nhân quả.</w:t>
       </w:r>
     </w:p>
     <w:p>
@@ -2833,7 +2833,7 @@
       <w:r>
         <w:drawing>
           <wp:inline distT="0" distB="0" distL="0" distR="0">
-            <wp:extent cx="3168000" cy="2543323"/>
+            <wp:extent cx="3456000" cy="2373305"/>
             <wp:effectExtent l="0" t="0" r="0" b="0"/>
             <wp:docPr id="204" name="Hinh 4"/>
             <wp:cNvGraphicFramePr>
@@ -2843,7 +2843,7 @@
               <a:graphicData uri="http://schemas.openxmlformats.org/drawingml/2006/picture">
                 <pic:pic xmlns:pic="http://schemas.openxmlformats.org/drawingml/2006/picture">
                   <pic:nvPicPr>
-                    <pic:cNvPr id="204" name="c19_0.png"/>
+                    <pic:cNvPr id="204" name="dash_ch4_3.png"/>
                     <pic:cNvPicPr/>
                   </pic:nvPicPr>
                   <pic:blipFill>
@@ -2855,7 +2855,7 @@
                   <pic:spPr>
                     <a:xfrm>
                       <a:off x="0" y="0"/>
-                      <a:ext cx="3168000" cy="2543323"/>
+                      <a:ext cx="3456000" cy="2373305"/>
                     </a:xfrm>
                     <a:prstGeom prst="rect">
                       <a:avLst/>
@@ -2918,7 +2918,7 @@
       <w:r>
         <w:drawing>
           <wp:inline distT="0" distB="0" distL="0" distR="0">
-            <wp:extent cx="2736000" cy="2892687"/>
+            <wp:extent cx="2664000" cy="2422476"/>
             <wp:effectExtent l="0" t="0" r="0" b="0"/>
             <wp:docPr id="205" name="Hinh 5"/>
             <wp:cNvGraphicFramePr>
@@ -2928,7 +2928,7 @@
               <a:graphicData uri="http://schemas.openxmlformats.org/drawingml/2006/picture">
                 <pic:pic xmlns:pic="http://schemas.openxmlformats.org/drawingml/2006/picture">
                   <pic:nvPicPr>
-                    <pic:cNvPr id="205" name="radar.png"/>
+                    <pic:cNvPr id="205" name="dash_ch4_2.png"/>
                     <pic:cNvPicPr/>
                   </pic:nvPicPr>
                   <pic:blipFill>
@@ -2940,7 +2940,7 @@
                   <pic:spPr>
                     <a:xfrm>
                       <a:off x="0" y="0"/>
-                      <a:ext cx="2736000" cy="2892687"/>
+                      <a:ext cx="2664000" cy="2422476"/>
                     </a:xfrm>
                     <a:prstGeom prst="rect">
                       <a:avLst/>
@@ -3001,7 +3001,7 @@
         <w:jc w:val="both"/>
       </w:pPr>
       <w:r>
-        <w:t xml:space="preserve">Phần này trình bày bốn mô hình hồi quy dự đoán Quality of Sleep và một mô hình so sánh. Hình 6 minh họa bốn mô hình khi huấn luyện trên toàn bộ dữ liệu: hai hình trên là đường hồi quy của hai mô hình một biến, hai hình dưới là biểu đồ phân bố (distribution plot) của hai mô hình bốn biến, so sánh phân bố của giá trị dự đoán với phân bố của giá trị thực tế (hai đường càng trùng nhau thì mô hình càng khớp).</w:t>
+        <w:t xml:space="preserve">Phần này trình bày bốn mô hình hồi quy dự đoán Quality of Sleep và một mô hình so sánh. Hình 6 gồm bốn biểu đồ lấy từ trang “Mô hình hồi quy” của dashboard, minh họa bốn mô hình khi huấn luyện trên toàn bộ dữ liệu: hai hình trên là đường hồi quy của hai mô hình một biến, hai hình dưới là biểu đồ phân bố (distribution plot) của hai mô hình bốn biến, so sánh phân bố của giá trị dự đoán với phân bố của giá trị thực tế (hai đường càng trùng nhau thì mô hình càng khớp).</w:t>
       </w:r>
     </w:p>
     <w:p>
@@ -3015,7 +3015,7 @@
       <w:r>
         <w:drawing>
           <wp:inline distT="0" distB="0" distL="0" distR="0">
-            <wp:extent cx="4536000" cy="3381381"/>
+            <wp:extent cx="5616000" cy="3556800"/>
             <wp:effectExtent l="0" t="0" r="0" b="0"/>
             <wp:docPr id="206" name="Hinh 6"/>
             <wp:cNvGraphicFramePr>
@@ -3025,7 +3025,7 @@
               <a:graphicData uri="http://schemas.openxmlformats.org/drawingml/2006/picture">
                 <pic:pic xmlns:pic="http://schemas.openxmlformats.org/drawingml/2006/picture">
                   <pic:nvPicPr>
-                    <pic:cNvPr id="206" name="models4.png"/>
+                    <pic:cNvPr id="206" name="dash_models4.png"/>
                     <pic:cNvPicPr/>
                   </pic:nvPicPr>
                   <pic:blipFill>
@@ -3037,7 +3037,7 @@
                   <pic:spPr>
                     <a:xfrm>
                       <a:off x="0" y="0"/>
-                      <a:ext cx="4536000" cy="3381381"/>
+                      <a:ext cx="5616000" cy="3556800"/>
                     </a:xfrm>
                     <a:prstGeom prst="rect">
                       <a:avLst/>
@@ -3845,7 +3845,7 @@
       <w:r>
         <w:drawing>
           <wp:inline distT="0" distB="0" distL="0" distR="0">
-            <wp:extent cx="4392000" cy="2126652"/>
+            <wp:extent cx="4140000" cy="2392000"/>
             <wp:effectExtent l="0" t="0" r="0" b="0"/>
             <wp:docPr id="207" name="Hinh 7"/>
             <wp:cNvGraphicFramePr>
@@ -3855,7 +3855,7 @@
               <a:graphicData uri="http://schemas.openxmlformats.org/drawingml/2006/picture">
                 <pic:pic xmlns:pic="http://schemas.openxmlformats.org/drawingml/2006/picture">
                   <pic:nvPicPr>
-                    <pic:cNvPr id="207" name="compare.png"/>
+                    <pic:cNvPr id="207" name="dash_ch7_4.png"/>
                     <pic:cNvPicPr/>
                   </pic:nvPicPr>
                   <pic:blipFill>
@@ -3867,7 +3867,7 @@
                   <pic:spPr>
                     <a:xfrm>
                       <a:off x="0" y="0"/>
-                      <a:ext cx="4392000" cy="2126652"/>
+                      <a:ext cx="4140000" cy="2392000"/>
                     </a:xfrm>
                     <a:prstGeom prst="rect">
                       <a:avLst/>
@@ -4328,7 +4328,7 @@
               <w:spacing w:before="60" w:after="0" w:line="276" w:lineRule="auto"/>
             </w:pPr>
             <w:r>
-              <w:t xml:space="preserve">Làm trang phân tích thăm dò (rối loạn theo BMI, nhịp tim, số bước chân) và kiểm định ANOVA; phụ trách mô hình hồi quy tuyến tính đa biến; cập nhật notebook minh họa; viết phần giới thiệu và kết luận; tham gia làm slide thuyết trình và kiểm tra chéo số liệu.</w:t>
+              <w:t xml:space="preserve">Làm trang phân tích thăm dò (rối loạn theo BMI, nhịp tim, số bước chân) và kiểm định ANOVA; phụ trách mô hình hồi quy tuyến tính đa biến; viết phần giới thiệu và kết luận; tham gia làm slide thuyết trình và kiểm tra chéo số liệu.</w:t>
             </w:r>
           </w:p>
         </w:tc>

</xml_diff>

<commit_message>
Thay doi Dashboard và chuong 5 Phan tich tham do
</commit_message>
<xml_diff>
--- a/Nhom08_Bao_cao.docx
+++ b/Nhom08_Bao_cao.docx
@@ -183,19 +183,7 @@
           <w:szCs w:val="42"/>
           <w:lang w:val="vi-VN"/>
         </w:rPr>
-        <w:t xml:space="preserve">PHÂN TÍCH THĂM DÒ VÀ DỰ ĐOÁN</w:t>
-        <w:br/>
-        <w:t xml:space="preserve">CHẤT LƯỢNG GIẤC NGỦ</w:t>
-        <w:br/>
-        <w:t xml:space="preserve">BẰNG MÔ HÌNH HỒI QUY</w:t>
-      </w:r>
-      <w:r>
-        <w:rPr>
-          <w:b/>
-          <w:sz w:val="42"/>
-          <w:szCs w:val="42"/>
-        </w:rPr>
-        <w:t/>
+        <w:t>PHÂN TÍCH THĂM DÒ VÀ DỰ ĐOÁN</w:t>
       </w:r>
       <w:r>
         <w:rPr>
@@ -204,88 +192,30 @@
           <w:szCs w:val="42"/>
           <w:lang w:val="vi-VN"/>
         </w:rPr>
-        <w:t/>
-      </w:r>
-    </w:p>
-    <w:p>
-      <w:pPr>
-        <w:spacing w:after="0" w:line="276" w:lineRule="auto"/>
-        <w:jc w:val="center"/>
+        <w:br/>
+        <w:t>CHẤT LƯỢNG GIẤC NGỦ</w:t>
+      </w:r>
+      <w:r>
         <w:rPr>
           <w:b/>
           <w:sz w:val="42"/>
           <w:szCs w:val="42"/>
-        </w:rPr>
-      </w:pPr>
-    </w:p>
-    <w:p>
-      <w:pPr>
-        <w:tabs>
-          <w:tab w:val="left" w:pos="1134"/>
-        </w:tabs>
+          <w:lang w:val="vi-VN"/>
+        </w:rPr>
+        <w:br/>
+        <w:t>BẰNG MÔ HÌNH HỒI QUY</w:t>
+      </w:r>
+    </w:p>
+    <w:p>
+      <w:pPr>
+        <w:spacing w:after="0" w:line="276" w:lineRule="auto"/>
         <w:jc w:val="center"/>
         <w:rPr>
-          <w:bCs/>
-          <w:sz w:val="30"/>
-          <w:szCs w:val="30"/>
-        </w:rPr>
-      </w:pPr>
-      <w:r>
-        <w:rPr>
-          <w:bCs/>
-          <w:color w:val="EE0000"/>
-          <w:sz w:val="30"/>
-          <w:szCs w:val="30"/>
-        </w:rPr>
-        <w:t>Chú ý:</w:t>
-      </w:r>
-      <w:r>
-        <w:rPr>
-          <w:bCs/>
-          <w:color w:val="EE0000"/>
-          <w:sz w:val="30"/>
-          <w:szCs w:val="30"/>
-        </w:rPr>
-        <w:br/>
-        <w:t>Đây là mẫu</w:t>
-      </w:r>
-      <w:r>
-        <w:rPr>
-          <w:bCs/>
-          <w:color w:val="EE0000"/>
-          <w:sz w:val="30"/>
-          <w:szCs w:val="30"/>
-        </w:rPr>
-        <w:t xml:space="preserve"> RÚT GỌN</w:t>
-      </w:r>
-      <w:r>
-        <w:rPr>
-          <w:bCs/>
-          <w:color w:val="EE0000"/>
-          <w:sz w:val="30"/>
-          <w:szCs w:val="30"/>
-        </w:rPr>
-        <w:t xml:space="preserve"> dùng cho</w:t>
-      </w:r>
-      <w:r>
-        <w:rPr>
-          <w:bCs/>
-          <w:color w:val="EE0000"/>
-          <w:sz w:val="30"/>
-          <w:szCs w:val="30"/>
-        </w:rPr>
-        <w:t xml:space="preserve"> Báo cáo Đồ án Môn học của GV</w:t>
-      </w:r>
-      <w:r>
-        <w:rPr>
-          <w:bCs/>
-          <w:color w:val="EE0000"/>
-          <w:sz w:val="30"/>
-          <w:szCs w:val="30"/>
-        </w:rPr>
-        <w:br/>
-        <w:t>Anh/chị không áp dụng mẫu này cho Khóa luận hay Đồ án khác</w:t>
-      </w:r>
+          <w:b/>
+          <w:sz w:val="42"/>
+          <w:szCs w:val="42"/>
+        </w:rPr>
+      </w:pPr>
     </w:p>
     <w:p>
       <w:pPr>
@@ -342,14 +272,7 @@
                 <w:b/>
                 <w:bCs/>
               </w:rPr>
-              <w:t xml:space="preserve">Nhóm 08</w:t>
-            </w:r>
-            <w:r>
-              <w:rPr>
-                <w:b/>
-                <w:bCs/>
-              </w:rPr>
-              <w:t/>
+              <w:t>Nhóm 08</w:t>
             </w:r>
           </w:p>
         </w:tc>
@@ -375,18 +298,7 @@
               <w:rPr>
                 <w:lang w:val="vi-VN"/>
               </w:rPr>
-              <w:t xml:space="preserve">Sinh viên thực hiện:</w:t>
-            </w:r>
-            <w:r>
-              <w:t/>
-            </w:r>
-            <w:r>
-              <w:rPr>
-                <w:b/>
-                <w:bCs/>
-                <w:color w:val="FF0000"/>
-              </w:rPr>
-              <w:t/>
+              <w:t>Sinh viên thực hiện:</w:t>
             </w:r>
           </w:p>
         </w:tc>
@@ -493,7 +405,7 @@
               <w:rPr>
                 <w:lang w:val="vi-VN"/>
               </w:rPr>
-              <w:t xml:space="preserve">1</w:t>
+              <w:t>1</w:t>
             </w:r>
           </w:p>
         </w:tc>
@@ -510,7 +422,7 @@
               </w:rPr>
             </w:pPr>
             <w:r>
-              <w:t xml:space="preserve">Lê Đình Tiến Anh</w:t>
+              <w:t>Lê Đình Tiến Anh</w:t>
             </w:r>
           </w:p>
         </w:tc>
@@ -530,7 +442,7 @@
               <w:rPr>
                 <w:lang w:val="vi-VN"/>
               </w:rPr>
-              <w:t xml:space="preserve">25410170</w:t>
+              <w:t>25410170</w:t>
             </w:r>
           </w:p>
         </w:tc>
@@ -544,7 +456,7 @@
               <w:jc w:val="center"/>
             </w:pPr>
             <w:r>
-              <w:t xml:space="preserve">Công nghệ thông tin</w:t>
+              <w:t>Công nghệ thông tin</w:t>
             </w:r>
           </w:p>
         </w:tc>
@@ -569,7 +481,7 @@
               <w:rPr>
                 <w:lang w:val="vi-VN"/>
               </w:rPr>
-              <w:t xml:space="preserve">2</w:t>
+              <w:t>2</w:t>
             </w:r>
           </w:p>
         </w:tc>
@@ -586,7 +498,7 @@
               </w:rPr>
             </w:pPr>
             <w:r>
-              <w:t xml:space="preserve">Nguyễn Đức Nghĩa</w:t>
+              <w:t>Nguyễn Đức Nghĩa</w:t>
             </w:r>
           </w:p>
         </w:tc>
@@ -603,7 +515,7 @@
               </w:rPr>
             </w:pPr>
             <w:r>
-              <w:t xml:space="preserve">25410262</w:t>
+              <w:t>25410262</w:t>
             </w:r>
           </w:p>
         </w:tc>
@@ -617,7 +529,7 @@
               <w:jc w:val="center"/>
             </w:pPr>
             <w:r>
-              <w:t xml:space="preserve">Công nghệ thông tin</w:t>
+              <w:t>Công nghệ thông tin</w:t>
             </w:r>
           </w:p>
         </w:tc>
@@ -636,7 +548,7 @@
               <w:jc w:val="center"/>
             </w:pPr>
             <w:r>
-              <w:t xml:space="preserve">3</w:t>
+              <w:t>3</w:t>
             </w:r>
           </w:p>
         </w:tc>
@@ -653,7 +565,7 @@
               </w:rPr>
             </w:pPr>
             <w:r>
-              <w:t xml:space="preserve">Dương Hồng Luyến</w:t>
+              <w:t>Dương Hồng Luyến</w:t>
             </w:r>
           </w:p>
         </w:tc>
@@ -670,7 +582,7 @@
               </w:rPr>
             </w:pPr>
             <w:r>
-              <w:t xml:space="preserve">25410252</w:t>
+              <w:t>25410252</w:t>
             </w:r>
           </w:p>
         </w:tc>
@@ -684,7 +596,7 @@
               <w:jc w:val="center"/>
             </w:pPr>
             <w:r>
-              <w:t xml:space="preserve">Công nghệ thông tin</w:t>
+              <w:t>Công nghệ thông tin</w:t>
             </w:r>
           </w:p>
         </w:tc>
@@ -703,7 +615,7 @@
               <w:jc w:val="center"/>
             </w:pPr>
             <w:r>
-              <w:t xml:space="preserve">4</w:t>
+              <w:t>4</w:t>
             </w:r>
           </w:p>
         </w:tc>
@@ -720,7 +632,7 @@
               </w:rPr>
             </w:pPr>
             <w:r>
-              <w:t xml:space="preserve">Nguyễn Thị Ngọc Nhung</w:t>
+              <w:t>Nguyễn Thị Ngọc Nhung</w:t>
             </w:r>
           </w:p>
         </w:tc>
@@ -737,7 +649,7 @@
               </w:rPr>
             </w:pPr>
             <w:r>
-              <w:t xml:space="preserve">25410271</w:t>
+              <w:t>25410271</w:t>
             </w:r>
           </w:p>
         </w:tc>
@@ -754,7 +666,7 @@
               </w:rPr>
             </w:pPr>
             <w:r>
-              <w:t xml:space="preserve">Công nghệ thông tin</w:t>
+              <w:t>Công nghệ thông tin</w:t>
             </w:r>
           </w:p>
         </w:tc>
@@ -816,48 +728,8 @@
           <w:szCs w:val="32"/>
           <w:lang w:val="vi-VN"/>
         </w:rPr>
-        <w:t xml:space="preserve">TP. HỒ CHÍ MINH – 10/2026</w:t>
-      </w:r>
-      <w:r>
-        <w:rPr>
-          <w:b/>
-          <w:bCs/>
-          <w:noProof/>
-          <w:sz w:val="32"/>
-          <w:szCs w:val="32"/>
-        </w:rPr>
-        <w:t/>
-      </w:r>
-      <w:r>
-        <w:rPr>
-          <w:b/>
-          <w:bCs/>
-          <w:noProof/>
-          <w:sz w:val="32"/>
-          <w:szCs w:val="32"/>
-          <w:lang w:val="vi-VN"/>
-        </w:rPr>
-        <w:t/>
-      </w:r>
-      <w:r>
-        <w:rPr>
-          <w:b/>
-          <w:bCs/>
-          <w:noProof/>
-          <w:sz w:val="32"/>
-          <w:szCs w:val="32"/>
-        </w:rPr>
-        <w:t/>
-      </w:r>
-      <w:r>
-        <w:rPr>
-          <w:b/>
-          <w:bCs/>
-          <w:noProof/>
-          <w:sz w:val="32"/>
-          <w:szCs w:val="32"/>
-        </w:rPr>
-        <w:t/>
+        <w:lastRenderedPageBreak/>
+        <w:t>TP. HỒ CHÍ MINH – 10/2026</w:t>
       </w:r>
     </w:p>
     <w:p>
@@ -869,30 +741,39 @@
         <w:br w:type="page"/>
       </w:r>
       <w:r>
+        <w:lastRenderedPageBreak/>
         <w:tab/>
-      </w:r>
-      <w:r>
-        <w:t xml:space="preserve">GIỚI THIỆU</w:t>
+        <w:t>GIỚI THIỆU</w:t>
       </w:r>
     </w:p>
     <w:p>
       <w:pPr>
         <w:pStyle w:val="BT"/>
-        <w:spacing w:before="0" w:after="120" w:line="276" w:lineRule="auto"/>
-        <w:jc w:val="both"/>
-      </w:pPr>
-      <w:r>
-        <w:t xml:space="preserve">Đề tài phân tích thăm dò bộ dữ liệu Sleep Health and Lifestyle và xây dựng mô hình hồi quy dự đoán chất lượng giấc ngủ, với mục tiêu xác định những yếu tố lối sống và sức khỏe có liên hệ với giấc ngủ và đo mức độ dự đoán được của chất lượng giấc ngủ. Nhóm thực hiện theo quy trình gồm tiền xử lý dữ liệu, trực quan hóa và phân tích thăm dò, xây dựng các mô hình hồi quy tuyến tính, đa thức và Ridge, sau đó đánh giá mô hình bằng cách chia tập huấn luyện và kiểm tra kết hợp kiểm định chéo; toàn bộ kết quả được trình bày trên một dashboard tương tác viết bằng Streamlit. Kết quả cho thấy chất lượng giấc ngủ tương quan mạnh nhất với mức độ căng thẳng (r = −0.90) và thời lượng ngủ (r = 0.88); 93% người có chỉ số BMI bình thường không mắc rối loạn giấc ngủ, so với 13% ở nhóm thừa cân. Mô hình hồi quy tuyến tính bốn biến đạt R² = 0.914 trên tập kiểm tra và R² trung bình 0.875 qua kiểm định chéo 5 phần; mô hình Ridge trên đặc trưng đa thức bậc 3 đạt R² = 0.953 trên tập kiểm tra.</w:t>
+        <w:spacing w:before="0" w:line="276" w:lineRule="auto"/>
+        <w:rPr>
+          <w:lang w:val="vi-VN"/>
+        </w:rPr>
+      </w:pPr>
+      <w:r>
+        <w:rPr>
+          <w:lang w:val="vi-VN"/>
+        </w:rPr>
+        <w:t>Đề tài phân tích thăm dò bộ dữ liệu Sleep Health and Lifestyle và xây dựng mô hình hồi quy dự đoán chất lượng giấc ngủ, với mục tiêu xác định những yếu tố lối sống và sức khỏe có liên hệ với giấc ngủ và đo mức độ dự đoán được của chất lượng giấc ngủ. Nhóm thực hiện theo quy trình gồm tiền xử lý dữ liệu, trực quan hóa và phân tích thăm dò, xây dựng các mô hình hồi quy tuyến tính, đa thức và Ridge, sau đó đánh giá mô hình bằng cách chia tập huấn luyện và kiểm tra kết hợp kiểm định chéo; toàn bộ kết quả được trình bày trên một dashboard tương tác viết bằng Streamlit. Kết quả cho thấy chất lượng giấc ngủ tương quan mạnh nhất với mức độ căng thẳng (r = −0.90) và thời lượng ngủ (r = 0.88); 93% người có chỉ số BMI bình thường không mắc rối loạn giấc ngủ, so với 13% ở nhóm thừa cân. Mô hình hồi quy tuyến tính bốn biến đạt R² = 0.914 trên tập kiểm tra và R² trung bình 0.875 qua kiểm định chéo 5 phần; mô hình Ridge trên đặc trưng đa thức bậc 3 đạt R² = 0.953 trên tập kiểm tra.</w:t>
       </w:r>
     </w:p>
     <w:p>
       <w:pPr>
         <w:pStyle w:val="BT"/>
-        <w:spacing w:before="0" w:after="120" w:line="276" w:lineRule="auto"/>
-        <w:jc w:val="both"/>
-      </w:pPr>
-      <w:r>
-        <w:t xml:space="preserve">Đề tài do nhóm tự phân tích, thiết kế và không dựa trên đề tài mẫu hay đồ án nào khác. Bộ dữ liệu không do nhóm thu thập mà được tham khảo từ nguồn công khai trên Kaggle [1]; quy trình phân tích, mã nguồn, dashboard và mọi số liệu trong báo cáo đều do nhóm tự thực hiện và tự chạy ra từ bộ dữ liệu này. Bên cạnh đó, nhóm có sử dụng công cụ AI (Claude) để hỗ trợ rà soát mã nguồn, kiểm tra lại số liệu, phát hiện lỗi trong cách đánh giá mô hình và biên tập câu chữ của báo cáo; nhóm đã đọc, chạy lại và chịu trách nhiệm về toàn bộ nội dung được trình bày.</w:t>
+        <w:spacing w:before="0" w:line="276" w:lineRule="auto"/>
+        <w:rPr>
+          <w:lang w:val="vi-VN"/>
+        </w:rPr>
+      </w:pPr>
+      <w:r>
+        <w:rPr>
+          <w:lang w:val="vi-VN"/>
+        </w:rPr>
+        <w:t>Đề tài do nhóm tự phân tích, thiết kế và không dựa trên đề tài mẫu hay đồ án nào khác. Bộ dữ liệu không do nhóm thu thập mà được tham khảo từ nguồn công khai trên Kaggle [1]; quy trình phân tích, mã nguồn, dashboard và mọi số liệu trong báo cáo đều do nhóm tự thực hiện và tự chạy ra từ bộ dữ liệu này. Bên cạnh đó, nhóm có sử dụng công cụ AI (Claude) để hỗ trợ rà soát mã nguồn, kiểm tra lại số liệu, phát hiện lỗi trong cách đánh giá mô hình và biên tập câu chữ của báo cáo; nhóm đã đọc, chạy lại và chịu trách nhiệm về toàn bộ nội dung được trình bày.</w:t>
       </w:r>
     </w:p>
     <w:p>
@@ -902,1481 +783,7 @@
       </w:pPr>
       <w:r>
         <w:tab/>
-      </w:r>
-      <w:r>
-        <w:t xml:space="preserve">MÔ TẢ BỘ DỮ LIỆU</w:t>
-      </w:r>
-    </w:p>
-    <w:p>
-      <w:pPr>
-        <w:pStyle w:val="BT"/>
-        <w:spacing w:before="0" w:after="120" w:line="276" w:lineRule="auto"/>
-        <w:jc w:val="both"/>
-      </w:pPr>
-      <w:r>
-        <w:t xml:space="preserve">Bộ dữ liệu phân tích Sleep Health and Lifestyle Dataset được tham khảo tại Kaggle [1], không do nhóm tự thu thập. Bộ dữ liệu trình bày thông tin về giấc ngủ, thói quen sinh hoạt và chỉ số sức khỏe của người trưởng thành, gồm 374 dòng và 13 cột, trong đó có 8 cột số và 5 cột phân loại hoặc chuỗi; mỗi dòng tương ứng với một người. Khi đọc bằng pandas, cột Sleep Disorder có 219 giá trị khuyết; các cột còn lại không khuyết. Bảng 1 mô tả chi tiết từng cột.</w:t>
-      </w:r>
-    </w:p>
-    <w:tbl>
-      <w:tblPr>
-        <w:tblStyle w:val="new"/>
-        <w:tblW w:w="9067" w:type="dxa"/>
-        <w:jc w:val="center"/>
-        <w:tblLook w:val="04A0" w:firstRow="1" w:lastRow="0" w:firstColumn="1" w:lastColumn="0" w:noHBand="0" w:noVBand="1"/>
-      </w:tblPr>
-      <w:tblGrid>
-        <w:gridCol w:w="650"/>
-        <w:gridCol w:w="2150"/>
-        <w:gridCol w:w="1150"/>
-        <w:gridCol w:w="2117"/>
-        <w:gridCol w:w="3000"/>
-      </w:tblGrid>
-      <w:tr>
-        <w:trPr>
-          <w:cantSplit/>
-          <w:tblHeader/>
-        </w:trPr>
-        <w:tc>
-          <w:tcPr>
-            <w:tcW w:w="650" w:type="dxa"/>
-          </w:tcPr>
-          <w:p>
-            <w:pPr>
-              <w:pStyle w:val="BT"/>
-              <w:spacing w:before="20" w:after="20"/>
-              <w:ind w:firstLine="0"/>
-              <w:jc w:val="center"/>
-            </w:pPr>
-            <w:r>
-              <w:rPr>
-                <w:b/>
-                <w:sz w:val="24"/>
-              </w:rPr>
-              <w:t xml:space="preserve">STT</w:t>
-            </w:r>
-          </w:p>
-        </w:tc>
-        <w:tc>
-          <w:tcPr>
-            <w:tcW w:w="2150" w:type="dxa"/>
-          </w:tcPr>
-          <w:p>
-            <w:pPr>
-              <w:pStyle w:val="BT"/>
-              <w:spacing w:before="20" w:after="20"/>
-              <w:ind w:firstLine="0"/>
-              <w:jc w:val="center"/>
-            </w:pPr>
-            <w:r>
-              <w:rPr>
-                <w:b/>
-                <w:sz w:val="24"/>
-              </w:rPr>
-              <w:t xml:space="preserve">Tên cột</w:t>
-            </w:r>
-          </w:p>
-        </w:tc>
-        <w:tc>
-          <w:tcPr>
-            <w:tcW w:w="1150" w:type="dxa"/>
-          </w:tcPr>
-          <w:p>
-            <w:pPr>
-              <w:pStyle w:val="BT"/>
-              <w:spacing w:before="20" w:after="20"/>
-              <w:ind w:firstLine="0"/>
-              <w:jc w:val="center"/>
-            </w:pPr>
-            <w:r>
-              <w:rPr>
-                <w:b/>
-                <w:sz w:val="24"/>
-              </w:rPr>
-              <w:t xml:space="preserve">Kiểu dữ liệu</w:t>
-            </w:r>
-          </w:p>
-        </w:tc>
-        <w:tc>
-          <w:tcPr>
-            <w:tcW w:w="2117" w:type="dxa"/>
-          </w:tcPr>
-          <w:p>
-            <w:pPr>
-              <w:pStyle w:val="BT"/>
-              <w:spacing w:before="20" w:after="20"/>
-              <w:ind w:firstLine="0"/>
-              <w:jc w:val="center"/>
-            </w:pPr>
-            <w:r>
-              <w:rPr>
-                <w:b/>
-                <w:sz w:val="24"/>
-              </w:rPr>
-              <w:t xml:space="preserve">Phạm vi</w:t>
-            </w:r>
-          </w:p>
-        </w:tc>
-        <w:tc>
-          <w:tcPr>
-            <w:tcW w:w="3000" w:type="dxa"/>
-          </w:tcPr>
-          <w:p>
-            <w:pPr>
-              <w:pStyle w:val="BT"/>
-              <w:spacing w:before="20" w:after="20"/>
-              <w:ind w:firstLine="0"/>
-              <w:jc w:val="center"/>
-            </w:pPr>
-            <w:r>
-              <w:rPr>
-                <w:b/>
-                <w:sz w:val="24"/>
-              </w:rPr>
-              <w:t xml:space="preserve">Giải thích</w:t>
-            </w:r>
-          </w:p>
-        </w:tc>
-      </w:tr>
-      <w:tr>
-        <w:trPr>
-          <w:cantSplit/>
-        </w:trPr>
-        <w:tc>
-          <w:tcPr>
-            <w:tcW w:w="650" w:type="dxa"/>
-          </w:tcPr>
-          <w:p>
-            <w:pPr>
-              <w:pStyle w:val="BT"/>
-              <w:spacing w:before="20" w:after="20"/>
-              <w:ind w:firstLine="0"/>
-              <w:jc w:val="center"/>
-            </w:pPr>
-            <w:r>
-              <w:rPr>
-                <w:sz w:val="24"/>
-              </w:rPr>
-              <w:t xml:space="preserve">1</w:t>
-            </w:r>
-          </w:p>
-        </w:tc>
-        <w:tc>
-          <w:tcPr>
-            <w:tcW w:w="2150" w:type="dxa"/>
-          </w:tcPr>
-          <w:p>
-            <w:pPr>
-              <w:pStyle w:val="BT"/>
-              <w:spacing w:before="20" w:after="20"/>
-              <w:ind w:firstLine="0"/>
-              <w:jc w:val="left"/>
-            </w:pPr>
-            <w:r>
-              <w:rPr>
-                <w:sz w:val="24"/>
-              </w:rPr>
-              <w:t xml:space="preserve">Person ID</w:t>
-            </w:r>
-          </w:p>
-        </w:tc>
-        <w:tc>
-          <w:tcPr>
-            <w:tcW w:w="1150" w:type="dxa"/>
-          </w:tcPr>
-          <w:p>
-            <w:pPr>
-              <w:pStyle w:val="BT"/>
-              <w:spacing w:before="20" w:after="20"/>
-              <w:ind w:firstLine="0"/>
-              <w:jc w:val="center"/>
-            </w:pPr>
-            <w:r>
-              <w:rPr>
-                <w:sz w:val="24"/>
-              </w:rPr>
-              <w:t xml:space="preserve">int</w:t>
-            </w:r>
-          </w:p>
-        </w:tc>
-        <w:tc>
-          <w:tcPr>
-            <w:tcW w:w="2117" w:type="dxa"/>
-          </w:tcPr>
-          <w:p>
-            <w:pPr>
-              <w:pStyle w:val="BT"/>
-              <w:spacing w:before="20" w:after="20"/>
-              <w:ind w:firstLine="0"/>
-              <w:jc w:val="left"/>
-            </w:pPr>
-            <w:r>
-              <w:rPr>
-                <w:sz w:val="24"/>
-              </w:rPr>
-              <w:t xml:space="preserve">1–374</w:t>
-            </w:r>
-          </w:p>
-        </w:tc>
-        <w:tc>
-          <w:tcPr>
-            <w:tcW w:w="3000" w:type="dxa"/>
-          </w:tcPr>
-          <w:p>
-            <w:pPr>
-              <w:pStyle w:val="BT"/>
-              <w:spacing w:before="20" w:after="20"/>
-              <w:ind w:firstLine="0"/>
-              <w:jc w:val="left"/>
-            </w:pPr>
-            <w:r>
-              <w:rPr>
-                <w:sz w:val="24"/>
-              </w:rPr>
-              <w:t xml:space="preserve">Mã định danh của mỗi người</w:t>
-            </w:r>
-          </w:p>
-        </w:tc>
-      </w:tr>
-      <w:tr>
-        <w:trPr>
-          <w:cantSplit/>
-        </w:trPr>
-        <w:tc>
-          <w:tcPr>
-            <w:tcW w:w="650" w:type="dxa"/>
-          </w:tcPr>
-          <w:p>
-            <w:pPr>
-              <w:pStyle w:val="BT"/>
-              <w:spacing w:before="20" w:after="20"/>
-              <w:ind w:firstLine="0"/>
-              <w:jc w:val="center"/>
-            </w:pPr>
-            <w:r>
-              <w:rPr>
-                <w:sz w:val="24"/>
-              </w:rPr>
-              <w:t xml:space="preserve">2</w:t>
-            </w:r>
-          </w:p>
-        </w:tc>
-        <w:tc>
-          <w:tcPr>
-            <w:tcW w:w="2150" w:type="dxa"/>
-          </w:tcPr>
-          <w:p>
-            <w:pPr>
-              <w:pStyle w:val="BT"/>
-              <w:spacing w:before="20" w:after="20"/>
-              <w:ind w:firstLine="0"/>
-              <w:jc w:val="left"/>
-            </w:pPr>
-            <w:r>
-              <w:rPr>
-                <w:sz w:val="24"/>
-              </w:rPr>
-              <w:t xml:space="preserve">Gender</w:t>
-            </w:r>
-          </w:p>
-        </w:tc>
-        <w:tc>
-          <w:tcPr>
-            <w:tcW w:w="1150" w:type="dxa"/>
-          </w:tcPr>
-          <w:p>
-            <w:pPr>
-              <w:pStyle w:val="BT"/>
-              <w:spacing w:before="20" w:after="20"/>
-              <w:ind w:firstLine="0"/>
-              <w:jc w:val="center"/>
-            </w:pPr>
-            <w:r>
-              <w:rPr>
-                <w:sz w:val="24"/>
-              </w:rPr>
-              <w:t xml:space="preserve">object</w:t>
-            </w:r>
-          </w:p>
-        </w:tc>
-        <w:tc>
-          <w:tcPr>
-            <w:tcW w:w="2117" w:type="dxa"/>
-          </w:tcPr>
-          <w:p>
-            <w:pPr>
-              <w:pStyle w:val="BT"/>
-              <w:spacing w:before="20" w:after="20"/>
-              <w:ind w:firstLine="0"/>
-              <w:jc w:val="left"/>
-            </w:pPr>
-            <w:r>
-              <w:rPr>
-                <w:sz w:val="24"/>
-              </w:rPr>
-              <w:t xml:space="preserve">Male, Female</w:t>
-            </w:r>
-          </w:p>
-        </w:tc>
-        <w:tc>
-          <w:tcPr>
-            <w:tcW w:w="3000" w:type="dxa"/>
-          </w:tcPr>
-          <w:p>
-            <w:pPr>
-              <w:pStyle w:val="BT"/>
-              <w:spacing w:before="20" w:after="20"/>
-              <w:ind w:firstLine="0"/>
-              <w:jc w:val="left"/>
-            </w:pPr>
-            <w:r>
-              <w:rPr>
-                <w:sz w:val="24"/>
-              </w:rPr>
-              <w:t xml:space="preserve">Giới tính</w:t>
-            </w:r>
-          </w:p>
-        </w:tc>
-      </w:tr>
-      <w:tr>
-        <w:trPr>
-          <w:cantSplit/>
-        </w:trPr>
-        <w:tc>
-          <w:tcPr>
-            <w:tcW w:w="650" w:type="dxa"/>
-          </w:tcPr>
-          <w:p>
-            <w:pPr>
-              <w:pStyle w:val="BT"/>
-              <w:spacing w:before="20" w:after="20"/>
-              <w:ind w:firstLine="0"/>
-              <w:jc w:val="center"/>
-            </w:pPr>
-            <w:r>
-              <w:rPr>
-                <w:sz w:val="24"/>
-              </w:rPr>
-              <w:t xml:space="preserve">3</w:t>
-            </w:r>
-          </w:p>
-        </w:tc>
-        <w:tc>
-          <w:tcPr>
-            <w:tcW w:w="2150" w:type="dxa"/>
-          </w:tcPr>
-          <w:p>
-            <w:pPr>
-              <w:pStyle w:val="BT"/>
-              <w:spacing w:before="20" w:after="20"/>
-              <w:ind w:firstLine="0"/>
-              <w:jc w:val="left"/>
-            </w:pPr>
-            <w:r>
-              <w:rPr>
-                <w:sz w:val="24"/>
-              </w:rPr>
-              <w:t xml:space="preserve">Age</w:t>
-            </w:r>
-          </w:p>
-        </w:tc>
-        <w:tc>
-          <w:tcPr>
-            <w:tcW w:w="1150" w:type="dxa"/>
-          </w:tcPr>
-          <w:p>
-            <w:pPr>
-              <w:pStyle w:val="BT"/>
-              <w:spacing w:before="20" w:after="20"/>
-              <w:ind w:firstLine="0"/>
-              <w:jc w:val="center"/>
-            </w:pPr>
-            <w:r>
-              <w:rPr>
-                <w:sz w:val="24"/>
-              </w:rPr>
-              <w:t xml:space="preserve">int</w:t>
-            </w:r>
-          </w:p>
-        </w:tc>
-        <w:tc>
-          <w:tcPr>
-            <w:tcW w:w="2117" w:type="dxa"/>
-          </w:tcPr>
-          <w:p>
-            <w:pPr>
-              <w:pStyle w:val="BT"/>
-              <w:spacing w:before="20" w:after="20"/>
-              <w:ind w:firstLine="0"/>
-              <w:jc w:val="left"/>
-            </w:pPr>
-            <w:r>
-              <w:rPr>
-                <w:sz w:val="24"/>
-              </w:rPr>
-              <w:t xml:space="preserve">27–59</w:t>
-            </w:r>
-          </w:p>
-        </w:tc>
-        <w:tc>
-          <w:tcPr>
-            <w:tcW w:w="3000" w:type="dxa"/>
-          </w:tcPr>
-          <w:p>
-            <w:pPr>
-              <w:pStyle w:val="BT"/>
-              <w:spacing w:before="20" w:after="20"/>
-              <w:ind w:firstLine="0"/>
-              <w:jc w:val="left"/>
-            </w:pPr>
-            <w:r>
-              <w:rPr>
-                <w:sz w:val="24"/>
-              </w:rPr>
-              <w:t xml:space="preserve">Tuổi</w:t>
-            </w:r>
-          </w:p>
-        </w:tc>
-      </w:tr>
-      <w:tr>
-        <w:trPr>
-          <w:cantSplit/>
-        </w:trPr>
-        <w:tc>
-          <w:tcPr>
-            <w:tcW w:w="650" w:type="dxa"/>
-          </w:tcPr>
-          <w:p>
-            <w:pPr>
-              <w:pStyle w:val="BT"/>
-              <w:spacing w:before="20" w:after="20"/>
-              <w:ind w:firstLine="0"/>
-              <w:jc w:val="center"/>
-            </w:pPr>
-            <w:r>
-              <w:rPr>
-                <w:sz w:val="24"/>
-              </w:rPr>
-              <w:t xml:space="preserve">4</w:t>
-            </w:r>
-          </w:p>
-        </w:tc>
-        <w:tc>
-          <w:tcPr>
-            <w:tcW w:w="2150" w:type="dxa"/>
-          </w:tcPr>
-          <w:p>
-            <w:pPr>
-              <w:pStyle w:val="BT"/>
-              <w:spacing w:before="20" w:after="20"/>
-              <w:ind w:firstLine="0"/>
-              <w:jc w:val="left"/>
-            </w:pPr>
-            <w:r>
-              <w:rPr>
-                <w:sz w:val="24"/>
-              </w:rPr>
-              <w:t xml:space="preserve">Occupation</w:t>
-            </w:r>
-          </w:p>
-        </w:tc>
-        <w:tc>
-          <w:tcPr>
-            <w:tcW w:w="1150" w:type="dxa"/>
-          </w:tcPr>
-          <w:p>
-            <w:pPr>
-              <w:pStyle w:val="BT"/>
-              <w:spacing w:before="20" w:after="20"/>
-              <w:ind w:firstLine="0"/>
-              <w:jc w:val="center"/>
-            </w:pPr>
-            <w:r>
-              <w:rPr>
-                <w:sz w:val="24"/>
-              </w:rPr>
-              <w:t xml:space="preserve">object</w:t>
-            </w:r>
-          </w:p>
-        </w:tc>
-        <w:tc>
-          <w:tcPr>
-            <w:tcW w:w="2117" w:type="dxa"/>
-          </w:tcPr>
-          <w:p>
-            <w:pPr>
-              <w:pStyle w:val="BT"/>
-              <w:spacing w:before="20" w:after="20"/>
-              <w:ind w:firstLine="0"/>
-              <w:jc w:val="left"/>
-            </w:pPr>
-            <w:r>
-              <w:rPr>
-                <w:sz w:val="24"/>
-              </w:rPr>
-              <w:t xml:space="preserve">11 nghề</w:t>
-            </w:r>
-          </w:p>
-        </w:tc>
-        <w:tc>
-          <w:tcPr>
-            <w:tcW w:w="3000" w:type="dxa"/>
-          </w:tcPr>
-          <w:p>
-            <w:pPr>
-              <w:pStyle w:val="BT"/>
-              <w:spacing w:before="20" w:after="20"/>
-              <w:ind w:firstLine="0"/>
-              <w:jc w:val="left"/>
-            </w:pPr>
-            <w:r>
-              <w:rPr>
-                <w:sz w:val="24"/>
-              </w:rPr>
-              <w:t xml:space="preserve">Nghề nghiệp</w:t>
-            </w:r>
-          </w:p>
-        </w:tc>
-      </w:tr>
-      <w:tr>
-        <w:trPr>
-          <w:cantSplit/>
-        </w:trPr>
-        <w:tc>
-          <w:tcPr>
-            <w:tcW w:w="650" w:type="dxa"/>
-          </w:tcPr>
-          <w:p>
-            <w:pPr>
-              <w:pStyle w:val="BT"/>
-              <w:spacing w:before="20" w:after="20"/>
-              <w:ind w:firstLine="0"/>
-              <w:jc w:val="center"/>
-            </w:pPr>
-            <w:r>
-              <w:rPr>
-                <w:sz w:val="24"/>
-              </w:rPr>
-              <w:t xml:space="preserve">5</w:t>
-            </w:r>
-          </w:p>
-        </w:tc>
-        <w:tc>
-          <w:tcPr>
-            <w:tcW w:w="2150" w:type="dxa"/>
-          </w:tcPr>
-          <w:p>
-            <w:pPr>
-              <w:pStyle w:val="BT"/>
-              <w:spacing w:before="20" w:after="20"/>
-              <w:ind w:firstLine="0"/>
-              <w:jc w:val="left"/>
-            </w:pPr>
-            <w:r>
-              <w:rPr>
-                <w:sz w:val="24"/>
-              </w:rPr>
-              <w:t xml:space="preserve">Sleep Duration</w:t>
-            </w:r>
-          </w:p>
-        </w:tc>
-        <w:tc>
-          <w:tcPr>
-            <w:tcW w:w="1150" w:type="dxa"/>
-          </w:tcPr>
-          <w:p>
-            <w:pPr>
-              <w:pStyle w:val="BT"/>
-              <w:spacing w:before="20" w:after="20"/>
-              <w:ind w:firstLine="0"/>
-              <w:jc w:val="center"/>
-            </w:pPr>
-            <w:r>
-              <w:rPr>
-                <w:sz w:val="24"/>
-              </w:rPr>
-              <w:t xml:space="preserve">float</w:t>
-            </w:r>
-          </w:p>
-        </w:tc>
-        <w:tc>
-          <w:tcPr>
-            <w:tcW w:w="2117" w:type="dxa"/>
-          </w:tcPr>
-          <w:p>
-            <w:pPr>
-              <w:pStyle w:val="BT"/>
-              <w:spacing w:before="20" w:after="20"/>
-              <w:ind w:firstLine="0"/>
-              <w:jc w:val="left"/>
-            </w:pPr>
-            <w:r>
-              <w:rPr>
-                <w:sz w:val="24"/>
-              </w:rPr>
-              <w:t xml:space="preserve">5.8–8.5</w:t>
-            </w:r>
-          </w:p>
-        </w:tc>
-        <w:tc>
-          <w:tcPr>
-            <w:tcW w:w="3000" w:type="dxa"/>
-          </w:tcPr>
-          <w:p>
-            <w:pPr>
-              <w:pStyle w:val="BT"/>
-              <w:spacing w:before="20" w:after="20"/>
-              <w:ind w:firstLine="0"/>
-              <w:jc w:val="left"/>
-            </w:pPr>
-            <w:r>
-              <w:rPr>
-                <w:sz w:val="24"/>
-              </w:rPr>
-              <w:t xml:space="preserve">Thời lượng ngủ mỗi ngày (giờ)</w:t>
-            </w:r>
-          </w:p>
-        </w:tc>
-      </w:tr>
-      <w:tr>
-        <w:trPr>
-          <w:cantSplit/>
-        </w:trPr>
-        <w:tc>
-          <w:tcPr>
-            <w:tcW w:w="650" w:type="dxa"/>
-          </w:tcPr>
-          <w:p>
-            <w:pPr>
-              <w:pStyle w:val="BT"/>
-              <w:spacing w:before="20" w:after="20"/>
-              <w:ind w:firstLine="0"/>
-              <w:jc w:val="center"/>
-            </w:pPr>
-            <w:r>
-              <w:rPr>
-                <w:sz w:val="24"/>
-              </w:rPr>
-              <w:t xml:space="preserve">6</w:t>
-            </w:r>
-          </w:p>
-        </w:tc>
-        <w:tc>
-          <w:tcPr>
-            <w:tcW w:w="2150" w:type="dxa"/>
-          </w:tcPr>
-          <w:p>
-            <w:pPr>
-              <w:pStyle w:val="BT"/>
-              <w:spacing w:before="20" w:after="20"/>
-              <w:ind w:firstLine="0"/>
-              <w:jc w:val="left"/>
-            </w:pPr>
-            <w:r>
-              <w:rPr>
-                <w:sz w:val="24"/>
-              </w:rPr>
-              <w:t xml:space="preserve">Quality of Sleep</w:t>
-            </w:r>
-          </w:p>
-        </w:tc>
-        <w:tc>
-          <w:tcPr>
-            <w:tcW w:w="1150" w:type="dxa"/>
-          </w:tcPr>
-          <w:p>
-            <w:pPr>
-              <w:pStyle w:val="BT"/>
-              <w:spacing w:before="20" w:after="20"/>
-              <w:ind w:firstLine="0"/>
-              <w:jc w:val="center"/>
-            </w:pPr>
-            <w:r>
-              <w:rPr>
-                <w:sz w:val="24"/>
-              </w:rPr>
-              <w:t xml:space="preserve">int</w:t>
-            </w:r>
-          </w:p>
-        </w:tc>
-        <w:tc>
-          <w:tcPr>
-            <w:tcW w:w="2117" w:type="dxa"/>
-          </w:tcPr>
-          <w:p>
-            <w:pPr>
-              <w:pStyle w:val="BT"/>
-              <w:spacing w:before="20" w:after="20"/>
-              <w:ind w:firstLine="0"/>
-              <w:jc w:val="left"/>
-            </w:pPr>
-            <w:r>
-              <w:rPr>
-                <w:sz w:val="24"/>
-              </w:rPr>
-              <w:t xml:space="preserve">4–9</w:t>
-            </w:r>
-          </w:p>
-        </w:tc>
-        <w:tc>
-          <w:tcPr>
-            <w:tcW w:w="3000" w:type="dxa"/>
-          </w:tcPr>
-          <w:p>
-            <w:pPr>
-              <w:pStyle w:val="BT"/>
-              <w:spacing w:before="20" w:after="20"/>
-              <w:ind w:firstLine="0"/>
-              <w:jc w:val="left"/>
-            </w:pPr>
-            <w:r>
-              <w:rPr>
-                <w:sz w:val="24"/>
-              </w:rPr>
-              <w:t xml:space="preserve">Chất lượng giấc ngủ tự đánh giá, thang 1–10</w:t>
-            </w:r>
-          </w:p>
-        </w:tc>
-      </w:tr>
-      <w:tr>
-        <w:trPr>
-          <w:cantSplit/>
-        </w:trPr>
-        <w:tc>
-          <w:tcPr>
-            <w:tcW w:w="650" w:type="dxa"/>
-          </w:tcPr>
-          <w:p>
-            <w:pPr>
-              <w:pStyle w:val="BT"/>
-              <w:spacing w:before="20" w:after="20"/>
-              <w:ind w:firstLine="0"/>
-              <w:jc w:val="center"/>
-            </w:pPr>
-            <w:r>
-              <w:rPr>
-                <w:sz w:val="24"/>
-              </w:rPr>
-              <w:t xml:space="preserve">7</w:t>
-            </w:r>
-          </w:p>
-        </w:tc>
-        <w:tc>
-          <w:tcPr>
-            <w:tcW w:w="2150" w:type="dxa"/>
-          </w:tcPr>
-          <w:p>
-            <w:pPr>
-              <w:pStyle w:val="BT"/>
-              <w:spacing w:before="20" w:after="20"/>
-              <w:ind w:firstLine="0"/>
-              <w:jc w:val="left"/>
-            </w:pPr>
-            <w:r>
-              <w:rPr>
-                <w:sz w:val="24"/>
-              </w:rPr>
-              <w:t xml:space="preserve">Physical Activity Level</w:t>
-            </w:r>
-          </w:p>
-        </w:tc>
-        <w:tc>
-          <w:tcPr>
-            <w:tcW w:w="1150" w:type="dxa"/>
-          </w:tcPr>
-          <w:p>
-            <w:pPr>
-              <w:pStyle w:val="BT"/>
-              <w:spacing w:before="20" w:after="20"/>
-              <w:ind w:firstLine="0"/>
-              <w:jc w:val="center"/>
-            </w:pPr>
-            <w:r>
-              <w:rPr>
-                <w:sz w:val="24"/>
-              </w:rPr>
-              <w:t xml:space="preserve">int</w:t>
-            </w:r>
-          </w:p>
-        </w:tc>
-        <w:tc>
-          <w:tcPr>
-            <w:tcW w:w="2117" w:type="dxa"/>
-          </w:tcPr>
-          <w:p>
-            <w:pPr>
-              <w:pStyle w:val="BT"/>
-              <w:spacing w:before="20" w:after="20"/>
-              <w:ind w:firstLine="0"/>
-              <w:jc w:val="left"/>
-            </w:pPr>
-            <w:r>
-              <w:rPr>
-                <w:sz w:val="24"/>
-              </w:rPr>
-              <w:t xml:space="preserve">30–90</w:t>
-            </w:r>
-          </w:p>
-        </w:tc>
-        <w:tc>
-          <w:tcPr>
-            <w:tcW w:w="3000" w:type="dxa"/>
-          </w:tcPr>
-          <w:p>
-            <w:pPr>
-              <w:pStyle w:val="BT"/>
-              <w:spacing w:before="20" w:after="20"/>
-              <w:ind w:firstLine="0"/>
-              <w:jc w:val="left"/>
-            </w:pPr>
-            <w:r>
-              <w:rPr>
-                <w:sz w:val="24"/>
-              </w:rPr>
-              <w:t xml:space="preserve">Thời gian vận động mỗi ngày (phút)</w:t>
-            </w:r>
-          </w:p>
-        </w:tc>
-      </w:tr>
-      <w:tr>
-        <w:trPr>
-          <w:cantSplit/>
-        </w:trPr>
-        <w:tc>
-          <w:tcPr>
-            <w:tcW w:w="650" w:type="dxa"/>
-          </w:tcPr>
-          <w:p>
-            <w:pPr>
-              <w:pStyle w:val="BT"/>
-              <w:spacing w:before="20" w:after="20"/>
-              <w:ind w:firstLine="0"/>
-              <w:jc w:val="center"/>
-            </w:pPr>
-            <w:r>
-              <w:rPr>
-                <w:sz w:val="24"/>
-              </w:rPr>
-              <w:t xml:space="preserve">8</w:t>
-            </w:r>
-          </w:p>
-        </w:tc>
-        <w:tc>
-          <w:tcPr>
-            <w:tcW w:w="2150" w:type="dxa"/>
-          </w:tcPr>
-          <w:p>
-            <w:pPr>
-              <w:pStyle w:val="BT"/>
-              <w:spacing w:before="20" w:after="20"/>
-              <w:ind w:firstLine="0"/>
-              <w:jc w:val="left"/>
-            </w:pPr>
-            <w:r>
-              <w:rPr>
-                <w:sz w:val="24"/>
-              </w:rPr>
-              <w:t xml:space="preserve">Stress Level</w:t>
-            </w:r>
-          </w:p>
-        </w:tc>
-        <w:tc>
-          <w:tcPr>
-            <w:tcW w:w="1150" w:type="dxa"/>
-          </w:tcPr>
-          <w:p>
-            <w:pPr>
-              <w:pStyle w:val="BT"/>
-              <w:spacing w:before="20" w:after="20"/>
-              <w:ind w:firstLine="0"/>
-              <w:jc w:val="center"/>
-            </w:pPr>
-            <w:r>
-              <w:rPr>
-                <w:sz w:val="24"/>
-              </w:rPr>
-              <w:t xml:space="preserve">int</w:t>
-            </w:r>
-          </w:p>
-        </w:tc>
-        <w:tc>
-          <w:tcPr>
-            <w:tcW w:w="2117" w:type="dxa"/>
-          </w:tcPr>
-          <w:p>
-            <w:pPr>
-              <w:pStyle w:val="BT"/>
-              <w:spacing w:before="20" w:after="20"/>
-              <w:ind w:firstLine="0"/>
-              <w:jc w:val="left"/>
-            </w:pPr>
-            <w:r>
-              <w:rPr>
-                <w:sz w:val="24"/>
-              </w:rPr>
-              <w:t xml:space="preserve">3–8</w:t>
-            </w:r>
-          </w:p>
-        </w:tc>
-        <w:tc>
-          <w:tcPr>
-            <w:tcW w:w="3000" w:type="dxa"/>
-          </w:tcPr>
-          <w:p>
-            <w:pPr>
-              <w:pStyle w:val="BT"/>
-              <w:spacing w:before="20" w:after="20"/>
-              <w:ind w:firstLine="0"/>
-              <w:jc w:val="left"/>
-            </w:pPr>
-            <w:r>
-              <w:rPr>
-                <w:sz w:val="24"/>
-              </w:rPr>
-              <w:t xml:space="preserve">Mức độ căng thẳng tự đánh giá, thang 1–10</w:t>
-            </w:r>
-          </w:p>
-        </w:tc>
-      </w:tr>
-      <w:tr>
-        <w:trPr>
-          <w:cantSplit/>
-        </w:trPr>
-        <w:tc>
-          <w:tcPr>
-            <w:tcW w:w="650" w:type="dxa"/>
-          </w:tcPr>
-          <w:p>
-            <w:pPr>
-              <w:pStyle w:val="BT"/>
-              <w:spacing w:before="20" w:after="20"/>
-              <w:ind w:firstLine="0"/>
-              <w:jc w:val="center"/>
-            </w:pPr>
-            <w:r>
-              <w:rPr>
-                <w:sz w:val="24"/>
-              </w:rPr>
-              <w:t xml:space="preserve">9</w:t>
-            </w:r>
-          </w:p>
-        </w:tc>
-        <w:tc>
-          <w:tcPr>
-            <w:tcW w:w="2150" w:type="dxa"/>
-          </w:tcPr>
-          <w:p>
-            <w:pPr>
-              <w:pStyle w:val="BT"/>
-              <w:spacing w:before="20" w:after="20"/>
-              <w:ind w:firstLine="0"/>
-              <w:jc w:val="left"/>
-            </w:pPr>
-            <w:r>
-              <w:rPr>
-                <w:sz w:val="24"/>
-              </w:rPr>
-              <w:t xml:space="preserve">BMI Category</w:t>
-            </w:r>
-          </w:p>
-        </w:tc>
-        <w:tc>
-          <w:tcPr>
-            <w:tcW w:w="1150" w:type="dxa"/>
-          </w:tcPr>
-          <w:p>
-            <w:pPr>
-              <w:pStyle w:val="BT"/>
-              <w:spacing w:before="20" w:after="20"/>
-              <w:ind w:firstLine="0"/>
-              <w:jc w:val="center"/>
-            </w:pPr>
-            <w:r>
-              <w:rPr>
-                <w:sz w:val="24"/>
-              </w:rPr>
-              <w:t xml:space="preserve">object</w:t>
-            </w:r>
-          </w:p>
-        </w:tc>
-        <w:tc>
-          <w:tcPr>
-            <w:tcW w:w="2117" w:type="dxa"/>
-          </w:tcPr>
-          <w:p>
-            <w:pPr>
-              <w:pStyle w:val="BT"/>
-              <w:spacing w:before="20" w:after="20"/>
-              <w:ind w:firstLine="0"/>
-              <w:jc w:val="left"/>
-            </w:pPr>
-            <w:r>
-              <w:rPr>
-                <w:sz w:val="24"/>
-              </w:rPr>
-              <w:t xml:space="preserve">Normal, Normal Weight, Overweight, Obese</w:t>
-            </w:r>
-          </w:p>
-        </w:tc>
-        <w:tc>
-          <w:tcPr>
-            <w:tcW w:w="3000" w:type="dxa"/>
-          </w:tcPr>
-          <w:p>
-            <w:pPr>
-              <w:pStyle w:val="BT"/>
-              <w:spacing w:before="20" w:after="20"/>
-              <w:ind w:firstLine="0"/>
-              <w:jc w:val="left"/>
-            </w:pPr>
-            <w:r>
-              <w:rPr>
-                <w:sz w:val="24"/>
-              </w:rPr>
-              <w:t xml:space="preserve">Nhóm thể trạng theo chỉ số BMI</w:t>
-            </w:r>
-          </w:p>
-        </w:tc>
-      </w:tr>
-      <w:tr>
-        <w:trPr>
-          <w:cantSplit/>
-        </w:trPr>
-        <w:tc>
-          <w:tcPr>
-            <w:tcW w:w="650" w:type="dxa"/>
-          </w:tcPr>
-          <w:p>
-            <w:pPr>
-              <w:pStyle w:val="BT"/>
-              <w:spacing w:before="20" w:after="20"/>
-              <w:ind w:firstLine="0"/>
-              <w:jc w:val="center"/>
-            </w:pPr>
-            <w:r>
-              <w:rPr>
-                <w:sz w:val="24"/>
-              </w:rPr>
-              <w:t xml:space="preserve">10</w:t>
-            </w:r>
-          </w:p>
-        </w:tc>
-        <w:tc>
-          <w:tcPr>
-            <w:tcW w:w="2150" w:type="dxa"/>
-          </w:tcPr>
-          <w:p>
-            <w:pPr>
-              <w:pStyle w:val="BT"/>
-              <w:spacing w:before="20" w:after="20"/>
-              <w:ind w:firstLine="0"/>
-              <w:jc w:val="left"/>
-            </w:pPr>
-            <w:r>
-              <w:rPr>
-                <w:sz w:val="24"/>
-              </w:rPr>
-              <w:t xml:space="preserve">Blood Pressure</w:t>
-            </w:r>
-          </w:p>
-        </w:tc>
-        <w:tc>
-          <w:tcPr>
-            <w:tcW w:w="1150" w:type="dxa"/>
-          </w:tcPr>
-          <w:p>
-            <w:pPr>
-              <w:pStyle w:val="BT"/>
-              <w:spacing w:before="20" w:after="20"/>
-              <w:ind w:firstLine="0"/>
-              <w:jc w:val="center"/>
-            </w:pPr>
-            <w:r>
-              <w:rPr>
-                <w:sz w:val="24"/>
-              </w:rPr>
-              <w:t xml:space="preserve">object</w:t>
-            </w:r>
-          </w:p>
-        </w:tc>
-        <w:tc>
-          <w:tcPr>
-            <w:tcW w:w="2117" w:type="dxa"/>
-          </w:tcPr>
-          <w:p>
-            <w:pPr>
-              <w:pStyle w:val="BT"/>
-              <w:spacing w:before="20" w:after="20"/>
-              <w:ind w:firstLine="0"/>
-              <w:jc w:val="left"/>
-            </w:pPr>
-            <w:r>
-              <w:rPr>
-                <w:sz w:val="24"/>
-              </w:rPr>
-              <w:t xml:space="preserve">115/75–142/95</w:t>
-            </w:r>
-          </w:p>
-        </w:tc>
-        <w:tc>
-          <w:tcPr>
-            <w:tcW w:w="3000" w:type="dxa"/>
-          </w:tcPr>
-          <w:p>
-            <w:pPr>
-              <w:pStyle w:val="BT"/>
-              <w:spacing w:before="20" w:after="20"/>
-              <w:ind w:firstLine="0"/>
-              <w:jc w:val="left"/>
-            </w:pPr>
-            <w:r>
-              <w:rPr>
-                <w:sz w:val="24"/>
-              </w:rPr>
-              <w:t xml:space="preserve">Huyết áp tâm thu/tâm trương (mmHg)</w:t>
-            </w:r>
-          </w:p>
-        </w:tc>
-      </w:tr>
-      <w:tr>
-        <w:trPr>
-          <w:cantSplit/>
-        </w:trPr>
-        <w:tc>
-          <w:tcPr>
-            <w:tcW w:w="650" w:type="dxa"/>
-          </w:tcPr>
-          <w:p>
-            <w:pPr>
-              <w:pStyle w:val="BT"/>
-              <w:spacing w:before="20" w:after="20"/>
-              <w:ind w:firstLine="0"/>
-              <w:jc w:val="center"/>
-            </w:pPr>
-            <w:r>
-              <w:rPr>
-                <w:sz w:val="24"/>
-              </w:rPr>
-              <w:t xml:space="preserve">11</w:t>
-            </w:r>
-          </w:p>
-        </w:tc>
-        <w:tc>
-          <w:tcPr>
-            <w:tcW w:w="2150" w:type="dxa"/>
-          </w:tcPr>
-          <w:p>
-            <w:pPr>
-              <w:pStyle w:val="BT"/>
-              <w:spacing w:before="20" w:after="20"/>
-              <w:ind w:firstLine="0"/>
-              <w:jc w:val="left"/>
-            </w:pPr>
-            <w:r>
-              <w:rPr>
-                <w:sz w:val="24"/>
-              </w:rPr>
-              <w:t xml:space="preserve">Heart Rate</w:t>
-            </w:r>
-          </w:p>
-        </w:tc>
-        <w:tc>
-          <w:tcPr>
-            <w:tcW w:w="1150" w:type="dxa"/>
-          </w:tcPr>
-          <w:p>
-            <w:pPr>
-              <w:pStyle w:val="BT"/>
-              <w:spacing w:before="20" w:after="20"/>
-              <w:ind w:firstLine="0"/>
-              <w:jc w:val="center"/>
-            </w:pPr>
-            <w:r>
-              <w:rPr>
-                <w:sz w:val="24"/>
-              </w:rPr>
-              <w:t xml:space="preserve">int</w:t>
-            </w:r>
-          </w:p>
-        </w:tc>
-        <w:tc>
-          <w:tcPr>
-            <w:tcW w:w="2117" w:type="dxa"/>
-          </w:tcPr>
-          <w:p>
-            <w:pPr>
-              <w:pStyle w:val="BT"/>
-              <w:spacing w:before="20" w:after="20"/>
-              <w:ind w:firstLine="0"/>
-              <w:jc w:val="left"/>
-            </w:pPr>
-            <w:r>
-              <w:rPr>
-                <w:sz w:val="24"/>
-              </w:rPr>
-              <w:t xml:space="preserve">65–86</w:t>
-            </w:r>
-          </w:p>
-        </w:tc>
-        <w:tc>
-          <w:tcPr>
-            <w:tcW w:w="3000" w:type="dxa"/>
-          </w:tcPr>
-          <w:p>
-            <w:pPr>
-              <w:pStyle w:val="BT"/>
-              <w:spacing w:before="20" w:after="20"/>
-              <w:ind w:firstLine="0"/>
-              <w:jc w:val="left"/>
-            </w:pPr>
-            <w:r>
-              <w:rPr>
-                <w:sz w:val="24"/>
-              </w:rPr>
-              <w:t xml:space="preserve">Nhịp tim lúc nghỉ (nhịp/phút)</w:t>
-            </w:r>
-          </w:p>
-        </w:tc>
-      </w:tr>
-      <w:tr>
-        <w:trPr>
-          <w:cantSplit/>
-        </w:trPr>
-        <w:tc>
-          <w:tcPr>
-            <w:tcW w:w="650" w:type="dxa"/>
-          </w:tcPr>
-          <w:p>
-            <w:pPr>
-              <w:pStyle w:val="BT"/>
-              <w:spacing w:before="20" w:after="20"/>
-              <w:ind w:firstLine="0"/>
-              <w:jc w:val="center"/>
-            </w:pPr>
-            <w:r>
-              <w:rPr>
-                <w:sz w:val="24"/>
-              </w:rPr>
-              <w:t xml:space="preserve">12</w:t>
-            </w:r>
-          </w:p>
-        </w:tc>
-        <w:tc>
-          <w:tcPr>
-            <w:tcW w:w="2150" w:type="dxa"/>
-          </w:tcPr>
-          <w:p>
-            <w:pPr>
-              <w:pStyle w:val="BT"/>
-              <w:spacing w:before="20" w:after="20"/>
-              <w:ind w:firstLine="0"/>
-              <w:jc w:val="left"/>
-            </w:pPr>
-            <w:r>
-              <w:rPr>
-                <w:sz w:val="24"/>
-              </w:rPr>
-              <w:t xml:space="preserve">Daily Steps</w:t>
-            </w:r>
-          </w:p>
-        </w:tc>
-        <w:tc>
-          <w:tcPr>
-            <w:tcW w:w="1150" w:type="dxa"/>
-          </w:tcPr>
-          <w:p>
-            <w:pPr>
-              <w:pStyle w:val="BT"/>
-              <w:spacing w:before="20" w:after="20"/>
-              <w:ind w:firstLine="0"/>
-              <w:jc w:val="center"/>
-            </w:pPr>
-            <w:r>
-              <w:rPr>
-                <w:sz w:val="24"/>
-              </w:rPr>
-              <w:t xml:space="preserve">int</w:t>
-            </w:r>
-          </w:p>
-        </w:tc>
-        <w:tc>
-          <w:tcPr>
-            <w:tcW w:w="2117" w:type="dxa"/>
-          </w:tcPr>
-          <w:p>
-            <w:pPr>
-              <w:pStyle w:val="BT"/>
-              <w:spacing w:before="20" w:after="20"/>
-              <w:ind w:firstLine="0"/>
-              <w:jc w:val="left"/>
-            </w:pPr>
-            <w:r>
-              <w:rPr>
-                <w:sz w:val="24"/>
-              </w:rPr>
-              <w:t xml:space="preserve">3,000–10,000</w:t>
-            </w:r>
-          </w:p>
-        </w:tc>
-        <w:tc>
-          <w:tcPr>
-            <w:tcW w:w="3000" w:type="dxa"/>
-          </w:tcPr>
-          <w:p>
-            <w:pPr>
-              <w:pStyle w:val="BT"/>
-              <w:spacing w:before="20" w:after="20"/>
-              <w:ind w:firstLine="0"/>
-              <w:jc w:val="left"/>
-            </w:pPr>
-            <w:r>
-              <w:rPr>
-                <w:sz w:val="24"/>
-              </w:rPr>
-              <w:t xml:space="preserve">Số bước chân mỗi ngày</w:t>
-            </w:r>
-          </w:p>
-        </w:tc>
-      </w:tr>
-      <w:tr>
-        <w:trPr>
-          <w:cantSplit/>
-        </w:trPr>
-        <w:tc>
-          <w:tcPr>
-            <w:tcW w:w="650" w:type="dxa"/>
-          </w:tcPr>
-          <w:p>
-            <w:pPr>
-              <w:pStyle w:val="BT"/>
-              <w:spacing w:before="20" w:after="20"/>
-              <w:ind w:firstLine="0"/>
-              <w:jc w:val="center"/>
-            </w:pPr>
-            <w:r>
-              <w:rPr>
-                <w:sz w:val="24"/>
-              </w:rPr>
-              <w:t xml:space="preserve">13</w:t>
-            </w:r>
-          </w:p>
-        </w:tc>
-        <w:tc>
-          <w:tcPr>
-            <w:tcW w:w="2150" w:type="dxa"/>
-          </w:tcPr>
-          <w:p>
-            <w:pPr>
-              <w:pStyle w:val="BT"/>
-              <w:spacing w:before="20" w:after="20"/>
-              <w:ind w:firstLine="0"/>
-              <w:jc w:val="left"/>
-            </w:pPr>
-            <w:r>
-              <w:rPr>
-                <w:sz w:val="24"/>
-              </w:rPr>
-              <w:t xml:space="preserve">Sleep Disorder</w:t>
-            </w:r>
-          </w:p>
-        </w:tc>
-        <w:tc>
-          <w:tcPr>
-            <w:tcW w:w="1150" w:type="dxa"/>
-          </w:tcPr>
-          <w:p>
-            <w:pPr>
-              <w:pStyle w:val="BT"/>
-              <w:spacing w:before="20" w:after="20"/>
-              <w:ind w:firstLine="0"/>
-              <w:jc w:val="center"/>
-            </w:pPr>
-            <w:r>
-              <w:rPr>
-                <w:sz w:val="24"/>
-              </w:rPr>
-              <w:t xml:space="preserve">object</w:t>
-            </w:r>
-          </w:p>
-        </w:tc>
-        <w:tc>
-          <w:tcPr>
-            <w:tcW w:w="2117" w:type="dxa"/>
-          </w:tcPr>
-          <w:p>
-            <w:pPr>
-              <w:pStyle w:val="BT"/>
-              <w:spacing w:before="20" w:after="20"/>
-              <w:ind w:firstLine="0"/>
-              <w:jc w:val="left"/>
-            </w:pPr>
-            <w:r>
-              <w:rPr>
-                <w:sz w:val="24"/>
-              </w:rPr>
-              <w:t xml:space="preserve">None, Insomnia, Sleep Apnea</w:t>
-            </w:r>
-          </w:p>
-        </w:tc>
-        <w:tc>
-          <w:tcPr>
-            <w:tcW w:w="3000" w:type="dxa"/>
-          </w:tcPr>
-          <w:p>
-            <w:pPr>
-              <w:pStyle w:val="BT"/>
-              <w:spacing w:before="20" w:after="20"/>
-              <w:ind w:firstLine="0"/>
-              <w:jc w:val="left"/>
-            </w:pPr>
-            <w:r>
-              <w:rPr>
-                <w:sz w:val="24"/>
-              </w:rPr>
-              <w:t xml:space="preserve">Rối loạn giấc ngủ: không mắc, mất ngủ, ngưng thở khi ngủ</w:t>
-            </w:r>
-          </w:p>
-        </w:tc>
-      </w:tr>
-    </w:tbl>
-    <w:p>
-      <w:pPr>
-        <w:pStyle w:val="BT"/>
-        <w:spacing w:before="60" w:after="160" w:line="276" w:lineRule="auto"/>
-        <w:ind w:firstLine="0"/>
-        <w:jc w:val="center"/>
-        <w:rPr>
-          <w:i/>
-          <w:iCs/>
-        </w:rPr>
-      </w:pPr>
-      <w:r>
-        <w:rPr>
-          <w:i/>
-          <w:iCs/>
-        </w:rPr>
-        <w:t xml:space="preserve">Bảng 1. Mô tả bộ dữ liệu Sleep Health and Lifestyle</w:t>
-      </w:r>
-    </w:p>
-    <w:p>
-      <w:pPr>
-        <w:pStyle w:val="BT"/>
-        <w:spacing w:before="0" w:after="120" w:line="276" w:lineRule="auto"/>
-        <w:jc w:val="both"/>
-      </w:pPr>
-      <w:r>
-        <w:t xml:space="preserve">Bộ dữ liệu có hai đặc điểm ảnh hưởng đến cách phân tích. Thứ nhất, 219 giá trị khuyết ở cột Sleep Disorder không phải là dữ liệu thiếu: file gốc ghi chữ “None” cho người không mắc rối loạn, và pandas mặc định hiểu chữ này là giá trị khuyết. Thứ hai, dữ liệu trùng lặp nhiều: trong 374 dòng chỉ có 132 hồ sơ khác nhau, các dòng còn lại giống hệt nhau ở mọi cột trừ Person ID. Ngoài ra, một số nhóm có rất ít quan sát: bốn nghề chỉ có từ 1 đến 4 người và nhóm BMI Obese chỉ có 10 người, nên nhóm không rút kết luận riêng cho các nhóm này.</w:t>
-      </w:r>
-    </w:p>
-    <w:p>
-      <w:pPr>
-        <w:pStyle w:val="Heading1"/>
-        <w:spacing w:before="240" w:after="120"/>
-      </w:pPr>
-      <w:r>
-        <w:tab/>
-      </w:r>
-      <w:r>
-        <w:t xml:space="preserve">PHƯƠNG PHÁP PHÂN TÍCH</w:t>
+        <w:t>PHƯƠNG PHÁP PHÂN TÍCH</w:t>
       </w:r>
     </w:p>
     <w:p>
@@ -2391,17 +798,16 @@
         <w:rPr>
           <w:sz w:val="26"/>
         </w:rPr>
-        <w:t xml:space="preserve">Quy trình thực hiện</w:t>
+        <w:t>Quy trình thực hiện</w:t>
       </w:r>
     </w:p>
     <w:p>
       <w:pPr>
         <w:pStyle w:val="BT"/>
-        <w:spacing w:before="0" w:after="120" w:line="276" w:lineRule="auto"/>
-        <w:jc w:val="both"/>
-      </w:pPr>
-      <w:r>
-        <w:t xml:space="preserve">Đề tài được thực hiện theo quy trình gồm sáu bước, từ thu thập dữ liệu đến trình bày kết quả, như minh họa ở Hình 1.</w:t>
+        <w:spacing w:before="0" w:line="276" w:lineRule="auto"/>
+      </w:pPr>
+      <w:r>
+        <w:t>Đề tài được thực hiện theo quy trình gồm sáu bước, từ thu thập dữ liệu đến trình bày kết quả, như minh họa ở Hình 1.</w:t>
       </w:r>
     </w:p>
     <w:p>
@@ -2413,8 +819,11 @@
         <w:jc w:val="center"/>
       </w:pPr>
       <w:r>
+        <w:rPr>
+          <w:noProof/>
+        </w:rPr>
         <w:drawing>
-          <wp:inline distT="0" distB="0" distL="0" distR="0">
+          <wp:inline distT="0" distB="0" distL="0" distR="0" wp14:anchorId="78CEC9E4" wp14:editId="302431C1">
             <wp:extent cx="5688000" cy="1345191"/>
             <wp:effectExtent l="0" t="0" r="0" b="0"/>
             <wp:docPr id="201" name="Hinh 1"/>
@@ -2429,7 +838,7 @@
                     <pic:cNvPicPr/>
                   </pic:nvPicPr>
                   <pic:blipFill>
-                    <a:blip r:embed="rId901"/>
+                    <a:blip r:embed="rId15"/>
                     <a:stretch>
                       <a:fillRect/>
                     </a:stretch>
@@ -2466,7 +875,7 @@
           <w:i/>
           <w:iCs/>
         </w:rPr>
-        <w:t xml:space="preserve">Hình 1. Quy trình phân tích của đề tài</w:t>
+        <w:t>Hình 1. Quy trình phân tích của đề tài</w:t>
       </w:r>
     </w:p>
     <w:p>
@@ -2481,17 +890,16 @@
         <w:rPr>
           <w:sz w:val="26"/>
         </w:rPr>
-        <w:t xml:space="preserve">Tiền xử lý dữ liệu</w:t>
+        <w:t>Tiền xử lý dữ liệu</w:t>
       </w:r>
     </w:p>
     <w:p>
       <w:pPr>
         <w:pStyle w:val="BT"/>
-        <w:spacing w:before="0" w:after="120" w:line="276" w:lineRule="auto"/>
-        <w:jc w:val="both"/>
-      </w:pPr>
-      <w:r>
-        <w:t xml:space="preserve">Dữ liệu được làm sạch qua bốn bước sau, áp dụng thống nhất cho cả dashboard và notebook:</w:t>
+        <w:spacing w:before="0" w:line="276" w:lineRule="auto"/>
+      </w:pPr>
+      <w:r>
+        <w:t>Dữ liệu được làm sạch qua bốn bước sau, áp dụng thống nhất cho cả dashboard và notebook:</w:t>
       </w:r>
     </w:p>
     <w:p>
@@ -2500,7 +908,15 @@
         <w:spacing w:after="60" w:line="276" w:lineRule="auto"/>
       </w:pPr>
       <w:r>
-        <w:t xml:space="preserve">Điền chuỗi “None” cho 219 ô khuyết ở cột Sleep Disorder, để khôi phục giá trị gốc.</w:t>
+        <w:t xml:space="preserve">Điền chuỗi “None” cho 219 ô khuyết ở cột </w:t>
+      </w:r>
+      <w:proofErr w:type="gramStart"/>
+      <w:r>
+        <w:t>Sleep Disorder</w:t>
+      </w:r>
+      <w:proofErr w:type="gramEnd"/>
+      <w:r>
+        <w:t>, để khôi phục giá trị gốc.</w:t>
       </w:r>
     </w:p>
     <w:p>
@@ -2509,7 +925,8 @@
         <w:spacing w:after="60" w:line="276" w:lineRule="auto"/>
       </w:pPr>
       <w:r>
-        <w:t xml:space="preserve">Gộp nhãn “Normal Weight” vào “Normal” ở cột BMI Category vì hai nhãn cùng nghĩa. Sau khi gộp có 216 người Normal, 148 người Overweight và 10 người Obese.</w:t>
+        <w:lastRenderedPageBreak/>
+        <w:t>Gộp nhãn “Normal Weight” vào “Normal” ở cột BMI Category vì hai nhãn cùng nghĩa. Sau khi gộp có 216 người Normal, 148 người Overweight và 10 người Obese.</w:t>
       </w:r>
     </w:p>
     <w:p>
@@ -2518,7 +935,7 @@
         <w:spacing w:after="60" w:line="276" w:lineRule="auto"/>
       </w:pPr>
       <w:r>
-        <w:t xml:space="preserve">Tách cột Blood Pressure dạng chuỗi (ví dụ “126/83”) thành hai cột số là huyết áp tâm thu và huyết áp tâm trương.</w:t>
+        <w:t>Tách cột Blood Pressure dạng chuỗi (ví dụ “126/83”) thành hai cột số là huyết áp tâm thu và huyết áp tâm trương.</w:t>
       </w:r>
     </w:p>
     <w:p>
@@ -2527,7 +944,52 @@
         <w:spacing w:after="60" w:line="276" w:lineRule="auto"/>
       </w:pPr>
       <w:r>
-        <w:t xml:space="preserve">Chia tuổi thành ba nhóm 20–35, 36–50 và 51–65 để so sánh giữa các độ tuổi.</w:t>
+        <w:t>Chia tuổi thành ba nhóm 20–35, 36–50 và 51–65 để so sánh giữa các độ tuổi.</w:t>
+      </w:r>
+    </w:p>
+    <w:p>
+      <w:pPr>
+        <w:spacing w:after="160" w:line="259" w:lineRule="auto"/>
+        <w:jc w:val="left"/>
+        <w:rPr>
+          <w:rFonts w:eastAsiaTheme="majorEastAsia" w:cstheme="majorBidi"/>
+          <w:b/>
+          <w:color w:val="FF0000"/>
+          <w:szCs w:val="32"/>
+          <w:lang w:val="vi-VN"/>
+        </w:rPr>
+      </w:pPr>
+      <w:r>
+        <w:br w:type="page"/>
+      </w:r>
+    </w:p>
+    <w:p>
+      <w:pPr>
+        <w:pStyle w:val="Heading1"/>
+        <w:spacing w:before="240" w:after="120"/>
+      </w:pPr>
+      <w:r>
+        <w:rPr>
+          <w:lang w:val="en-US"/>
+        </w:rPr>
+        <w:lastRenderedPageBreak/>
+        <w:tab/>
+      </w:r>
+      <w:r>
+        <w:rPr>
+          <w:lang w:val="en-US"/>
+        </w:rPr>
+        <w:t>TRỰC QUAN HÓA DỮ LI</w:t>
+      </w:r>
+      <w:r>
+        <w:rPr>
+          <w:lang w:val="en-US"/>
+        </w:rPr>
+        <w:t>ỆU</w:t>
+      </w:r>
+      <w:r>
+        <w:tab/>
+        <w:t xml:space="preserve"> </w:t>
       </w:r>
     </w:p>
     <w:p>
@@ -2536,95 +998,30 @@
         <w:spacing w:before="120" w:after="60"/>
         <w:rPr>
           <w:sz w:val="26"/>
+          <w:lang w:val="vi-VN"/>
         </w:rPr>
       </w:pPr>
       <w:r>
         <w:rPr>
           <w:sz w:val="26"/>
-        </w:rPr>
-        <w:t xml:space="preserve">Xây dựng và đánh giá mô hình</w:t>
+          <w:lang w:val="vi-VN"/>
+        </w:rPr>
+        <w:t>Thể trạng và rối loạn giấc ngủ</w:t>
       </w:r>
     </w:p>
     <w:p>
       <w:pPr>
         <w:pStyle w:val="BT"/>
-        <w:spacing w:before="0" w:after="120" w:line="276" w:lineRule="auto"/>
-        <w:jc w:val="both"/>
-      </w:pPr>
-      <w:r>
-        <w:t xml:space="preserve">Biến mục tiêu là Quality of Sleep. Bốn biến đầu vào gồm Sleep Duration, Stress Level, Heart Rate và Physical Activity Level. Nhóm xây dựng lần lượt hồi quy tuyến tính đơn, hồi quy đa thức, hồi quy tuyến tính đa biến và hồi quy Ridge trên đặc trưng đa thức bậc 3 đã chuẩn hóa.</w:t>
-      </w:r>
-    </w:p>
-    <w:p>
-      <w:pPr>
-        <w:pStyle w:val="BT"/>
-        <w:spacing w:before="0" w:after="120" w:line="276" w:lineRule="auto"/>
-        <w:jc w:val="both"/>
-      </w:pPr>
-      <w:r>
-        <w:t xml:space="preserve">Vì dữ liệu trùng lặp nhiều, nếu chia tập huấn luyện và tập kiểm tra ngẫu nhiên theo dòng với tỷ lệ 70/30 thì 100 trên 113 dòng của tập kiểm tra có bản sao giống hệt trong tập huấn luyện, khiến R² trên tập kiểm tra không còn phản ánh khả năng dự đoán dữ liệu mới. Để tránh rò rỉ dữ liệu, nhóm chia theo hồ sơ: các dòng giống hệt nhau luôn nằm cùng một tập (GroupShuffleSplit của scikit-learn [2], random_state = 42), cho 274 dòng huấn luyện và 100 dòng kiểm tra. Kiểm định chéo 5 phần cũng chia theo hồ sơ (GroupKFold). Hệ số điều chuẩn alpha của Ridge được chọn bằng kiểm định chéo trên tập huấn luyện; tập kiểm tra chỉ dùng một lần để báo cáo kết quả cuối cùng.</w:t>
-      </w:r>
-    </w:p>
-    <w:p>
-      <w:pPr>
-        <w:pStyle w:val="Heading2"/>
-        <w:spacing w:before="120" w:after="60"/>
-        <w:rPr>
-          <w:sz w:val="26"/>
-        </w:rPr>
-      </w:pPr>
-      <w:r>
-        <w:rPr>
-          <w:sz w:val="26"/>
-        </w:rPr>
-        <w:t xml:space="preserve">Công cụ và cách tái lập kết quả</w:t>
-      </w:r>
-    </w:p>
-    <w:p>
-      <w:pPr>
-        <w:pStyle w:val="BT"/>
-        <w:spacing w:before="0" w:after="120" w:line="276" w:lineRule="auto"/>
-        <w:jc w:val="both"/>
-      </w:pPr>
-      <w:r>
-        <w:t xml:space="preserve">Đề tài sử dụng Python với các thư viện pandas, NumPy, Matplotlib, Seaborn, Plotly, SciPy, scikit-learn [2] và Streamlit [3]. Sản phẩm gồm một dashboard Streamlit bảy trang (tổng quan, tiền xử lý, trực quan hóa, công cụ trực quan, phân tích thăm dò, mô hình hồi quy, đánh giá mô hình) có bộ lọc theo giới tính và nhóm BMI, cùng một notebook minh họa từng bước. Để tái lập kết quả, cài các thư viện liệt kê trong file requirements.txt rồi chạy file app.py bằng Streamlit từ thư mục gốc của mã nguồn; mọi con số trong báo cáo tương ứng với trạng thái không áp dụng bộ lọc trên dashboard và cũng được in ra khi chạy lại notebook Code_demo.ipynb.</w:t>
-      </w:r>
-    </w:p>
-    <w:p>
-      <w:pPr>
-        <w:pStyle w:val="Heading1"/>
-        <w:spacing w:before="240" w:after="120"/>
-      </w:pPr>
-      <w:r>
-        <w:tab/>
-      </w:r>
-      <w:r>
-        <w:t xml:space="preserve">KẾT QUẢ PHÂN TÍCH THĂM DÒ</w:t>
-      </w:r>
-    </w:p>
-    <w:p>
-      <w:pPr>
-        <w:pStyle w:val="Heading2"/>
-        <w:spacing w:before="120" w:after="60"/>
-        <w:rPr>
-          <w:sz w:val="26"/>
-        </w:rPr>
-      </w:pPr>
-      <w:r>
-        <w:rPr>
-          <w:sz w:val="26"/>
-        </w:rPr>
-        <w:t xml:space="preserve">Thể trạng và rối loạn giấc ngủ</w:t>
-      </w:r>
-    </w:p>
-    <w:p>
-      <w:pPr>
-        <w:pStyle w:val="BT"/>
-        <w:spacing w:before="0" w:after="120" w:line="276" w:lineRule="auto"/>
-        <w:jc w:val="both"/>
-      </w:pPr>
-      <w:r>
-        <w:t xml:space="preserve">Trong toàn bộ dữ liệu, 58.6% số người không mắc rối loạn giấc ngủ, 20.9% mắc Sleep Apnea và 20.6% mắc Insomnia. Hình 2 cho thấy tỷ lệ này khác nhau rất rõ giữa các nhóm BMI.</w:t>
+        <w:spacing w:before="0" w:line="276" w:lineRule="auto"/>
+        <w:rPr>
+          <w:lang w:val="vi-VN"/>
+        </w:rPr>
+      </w:pPr>
+      <w:r>
+        <w:rPr>
+          <w:lang w:val="vi-VN"/>
+        </w:rPr>
+        <w:t>Trong toàn bộ dữ liệu, 58.6% số người không mắc rối loạn giấc ngủ, 20.9% mắc Sleep Apnea và 20.6% mắc Insomnia. Hình 2 cho thấy tỷ lệ này khác nhau rất rõ giữa các nhóm BMI.</w:t>
       </w:r>
     </w:p>
     <w:p>
@@ -2636,8 +1033,11 @@
         <w:jc w:val="center"/>
       </w:pPr>
       <w:r>
+        <w:rPr>
+          <w:noProof/>
+        </w:rPr>
         <w:drawing>
-          <wp:inline distT="0" distB="0" distL="0" distR="0">
+          <wp:inline distT="0" distB="0" distL="0" distR="0" wp14:anchorId="779591C0" wp14:editId="40056E62">
             <wp:extent cx="3780000" cy="2548923"/>
             <wp:effectExtent l="0" t="0" r="0" b="0"/>
             <wp:docPr id="202" name="Hinh 2"/>
@@ -2652,7 +1052,7 @@
                     <pic:cNvPicPr/>
                   </pic:nvPicPr>
                   <pic:blipFill>
-                    <a:blip r:embed="rId902"/>
+                    <a:blip r:embed="rId16"/>
                     <a:stretch>
                       <a:fillRect/>
                     </a:stretch>
@@ -2689,17 +1089,16 @@
           <w:i/>
           <w:iCs/>
         </w:rPr>
-        <w:t xml:space="preserve">Hình 2. Số người theo tình trạng rối loạn giấc ngủ ở từng nhóm BMI</w:t>
+        <w:t>Hình 2. Số người theo tình trạng rối loạn giấc ngủ ở từng nhóm BMI</w:t>
       </w:r>
     </w:p>
     <w:p>
       <w:pPr>
         <w:pStyle w:val="BT"/>
-        <w:spacing w:before="0" w:after="120" w:line="276" w:lineRule="auto"/>
-        <w:jc w:val="both"/>
-      </w:pPr>
-      <w:r>
-        <w:t xml:space="preserve">Ở nhóm Normal, 200 trên 216 người (93%) không mắc rối loạn. Ở nhóm Overweight, 129 trên 148 người (87%) mắc rối loạn, trong đó Insomnia (64 người) và Sleep Apnea (65 người) gần như ngang nhau. Cả 10 người thuộc nhóm Obese đều mắc một dạng rối loạn. Đây là mối liên hệ rõ nhất mà nhóm tìm thấy trong dữ liệu.</w:t>
+        <w:spacing w:before="0" w:line="276" w:lineRule="auto"/>
+      </w:pPr>
+      <w:r>
+        <w:t>Ở nhóm Normal, 200 trên 216 người (93%) không mắc rối loạn. Ở nhóm Overweight, 129 trên 148 người (87%) mắc rối loạn, trong đó Insomnia (64 người) và Sleep Apnea (65 người) gần như ngang nhau. Cả 10 người thuộc nhóm Obese đều mắc một dạng rối loạn. Đây là mối liên hệ rõ nhất mà nhóm tìm thấy trong dữ liệu.</w:t>
       </w:r>
     </w:p>
     <w:p>
@@ -2714,17 +1113,16 @@
         <w:rPr>
           <w:sz w:val="26"/>
         </w:rPr>
-        <w:t xml:space="preserve">Độ tuổi và rối loạn giấc ngủ</w:t>
+        <w:t>Độ tuổi và rối loạn giấc ngủ</w:t>
       </w:r>
     </w:p>
     <w:p>
       <w:pPr>
         <w:pStyle w:val="BT"/>
-        <w:spacing w:before="0" w:after="120" w:line="276" w:lineRule="auto"/>
-        <w:jc w:val="both"/>
-      </w:pPr>
-      <w:r>
-        <w:t xml:space="preserve">Hình 3 trình bày số người theo tình trạng rối loạn giấc ngủ ở ba nhóm tuổi.</w:t>
+        <w:spacing w:before="0" w:line="276" w:lineRule="auto"/>
+      </w:pPr>
+      <w:r>
+        <w:t>Hình 3 trình bày số người theo tình trạng rối loạn giấc ngủ ở ba nhóm tuổi.</w:t>
       </w:r>
     </w:p>
     <w:p>
@@ -2736,8 +1134,11 @@
         <w:jc w:val="center"/>
       </w:pPr>
       <w:r>
+        <w:rPr>
+          <w:noProof/>
+        </w:rPr>
         <w:drawing>
-          <wp:inline distT="0" distB="0" distL="0" distR="0">
+          <wp:inline distT="0" distB="0" distL="0" distR="0" wp14:anchorId="2B68745A" wp14:editId="614476DC">
             <wp:extent cx="4068000" cy="2523189"/>
             <wp:effectExtent l="0" t="0" r="0" b="0"/>
             <wp:docPr id="203" name="Hinh 3"/>
@@ -2752,7 +1153,7 @@
                     <pic:cNvPicPr/>
                   </pic:nvPicPr>
                   <pic:blipFill>
-                    <a:blip r:embed="rId903"/>
+                    <a:blip r:embed="rId17"/>
                     <a:stretch>
                       <a:fillRect/>
                     </a:stretch>
@@ -2789,17 +1190,17 @@
           <w:i/>
           <w:iCs/>
         </w:rPr>
-        <w:t xml:space="preserve">Hình 3. Rối loạn giấc ngủ theo nhóm tuổi</w:t>
+        <w:t>Hình 3. Rối loạn giấc ngủ theo nhóm tuổi</w:t>
       </w:r>
     </w:p>
     <w:p>
       <w:pPr>
         <w:pStyle w:val="BT"/>
-        <w:spacing w:before="0" w:after="120" w:line="276" w:lineRule="auto"/>
-        <w:jc w:val="both"/>
-      </w:pPr>
-      <w:r>
-        <w:t xml:space="preserve">Nhóm 20–35 hầu hết không mắc rối loạn (80 trên 94 người). Insomnia tập trung ở nhóm 36–50 với 65 người, rồi giảm còn 7 người ở nhóm 51–65. Ngược lại, Sleep Apnea tăng dần theo tuổi và chiếm tỷ lệ cao nhất ở nhóm 51–65 (33 trên 76 người). Như vậy hai dạng rối loạn có phân bố theo tuổi khác nhau.</w:t>
+        <w:spacing w:before="0" w:line="276" w:lineRule="auto"/>
+      </w:pPr>
+      <w:r>
+        <w:lastRenderedPageBreak/>
+        <w:t>Nhóm 20–35 hầu hết không mắc rối loạn (80 trên 94 người). Insomnia tập trung ở nhóm 36–50 với 65 người, rồi giảm còn 7 người ở nhóm 51–65. Ngược lại, Sleep Apnea tăng dần theo tuổi và chiếm tỷ lệ cao nhất ở nhóm 51–65 (33 trên 76 người). Như vậy hai dạng rối loạn có phân bố theo tuổi khác nhau.</w:t>
       </w:r>
     </w:p>
     <w:p>
@@ -2814,17 +1215,16 @@
         <w:rPr>
           <w:sz w:val="26"/>
         </w:rPr>
-        <w:t xml:space="preserve">Các yếu tố liên hệ với chất lượng giấc ngủ</w:t>
+        <w:t>Các yếu tố liên hệ với chất lượng giấc ngủ</w:t>
       </w:r>
     </w:p>
     <w:p>
       <w:pPr>
         <w:pStyle w:val="BT"/>
-        <w:spacing w:before="0" w:after="120" w:line="276" w:lineRule="auto"/>
-        <w:jc w:val="both"/>
-      </w:pPr>
-      <w:r>
-        <w:t xml:space="preserve">Hình 4 là ma trận hệ số tương quan Pearson giữa các biến số.</w:t>
+        <w:spacing w:before="0" w:line="276" w:lineRule="auto"/>
+      </w:pPr>
+      <w:r>
+        <w:t>Hình 4 là ma trận hệ số tương quan Pearson giữa các biến số.</w:t>
       </w:r>
     </w:p>
     <w:p>
@@ -2836,8 +1236,11 @@
         <w:jc w:val="center"/>
       </w:pPr>
       <w:r>
+        <w:rPr>
+          <w:noProof/>
+        </w:rPr>
         <w:drawing>
-          <wp:inline distT="0" distB="0" distL="0" distR="0">
+          <wp:inline distT="0" distB="0" distL="0" distR="0" wp14:anchorId="1A90D1C8" wp14:editId="40CCA2CC">
             <wp:extent cx="4140000" cy="3323661"/>
             <wp:effectExtent l="0" t="0" r="0" b="0"/>
             <wp:docPr id="204" name="Hinh 4"/>
@@ -2852,7 +1255,7 @@
                     <pic:cNvPicPr/>
                   </pic:nvPicPr>
                   <pic:blipFill>
-                    <a:blip r:embed="rId904"/>
+                    <a:blip r:embed="rId18"/>
                     <a:stretch>
                       <a:fillRect/>
                     </a:stretch>
@@ -2889,17 +1292,16 @@
           <w:i/>
           <w:iCs/>
         </w:rPr>
-        <w:t xml:space="preserve">Hình 4. Ma trận hệ số tương quan Pearson giữa các biến số</w:t>
+        <w:t>Hình 4. Ma trận hệ số tương quan Pearson giữa các biến số</w:t>
       </w:r>
     </w:p>
     <w:p>
       <w:pPr>
         <w:pStyle w:val="BT"/>
-        <w:spacing w:before="0" w:after="120" w:line="276" w:lineRule="auto"/>
-        <w:jc w:val="both"/>
-      </w:pPr>
-      <w:r>
-        <w:t xml:space="preserve">Chất lượng giấc ngủ tương quan nghịch mạnh với mức độ căng thẳng (r = −0.90) và tương quan thuận mạnh với thời lượng ngủ (r = 0.88); bản thân căng thẳng và thời lượng ngủ cũng tương quan nghịch (r = −0.81). Chất lượng giấc ngủ trung bình giảm từ 8.97 ở mức căng thẳng 3 xuống 5.86 ở mức căng thẳng 8. Hai biến này vì vậy được chọn làm biến đầu vào chính cho mô hình hồi quy ở phần sau.</w:t>
+        <w:spacing w:before="0" w:line="276" w:lineRule="auto"/>
+      </w:pPr>
+      <w:r>
+        <w:t>Chất lượng giấc ngủ tương quan nghịch mạnh với mức độ căng thẳng (r = −0.90) và tương quan thuận mạnh với thời lượng ngủ (r = 0.88); bản thân căng thẳng và thời lượng ngủ cũng tương quan nghịch (r = −0.81). Chất lượng giấc ngủ trung bình giảm từ 8.97 ở mức căng thẳng 3 xuống 5.86 ở mức căng thẳng 8. Hai biến này vì vậy được chọn làm biến đầu vào chính cho mô hình hồi quy ở phần sau.</w:t>
       </w:r>
     </w:p>
     <w:p>
@@ -2914,17 +1316,16 @@
         <w:rPr>
           <w:sz w:val="26"/>
         </w:rPr>
-        <w:t xml:space="preserve">Nghề nghiệp, huyết áp và thời lượng ngủ</w:t>
+        <w:t>Nghề nghiệp, huyết áp và thời lượng ngủ</w:t>
       </w:r>
     </w:p>
     <w:p>
       <w:pPr>
         <w:pStyle w:val="BT"/>
-        <w:spacing w:before="0" w:after="120" w:line="276" w:lineRule="auto"/>
-        <w:jc w:val="both"/>
-      </w:pPr>
-      <w:r>
-        <w:t xml:space="preserve">Hình 5 so sánh phân bố thời lượng ngủ giữa các nghề.</w:t>
+        <w:spacing w:before="0" w:line="276" w:lineRule="auto"/>
+      </w:pPr>
+      <w:r>
+        <w:t>Hình 5 so sánh phân bố thời lượng ngủ giữa các nghề.</w:t>
       </w:r>
     </w:p>
     <w:p>
@@ -2936,8 +1337,12 @@
         <w:jc w:val="center"/>
       </w:pPr>
       <w:r>
+        <w:rPr>
+          <w:noProof/>
+        </w:rPr>
+        <w:lastRenderedPageBreak/>
         <w:drawing>
-          <wp:inline distT="0" distB="0" distL="0" distR="0">
+          <wp:inline distT="0" distB="0" distL="0" distR="0" wp14:anchorId="058E4E58" wp14:editId="3F603E77">
             <wp:extent cx="4680000" cy="2789090"/>
             <wp:effectExtent l="0" t="0" r="0" b="0"/>
             <wp:docPr id="205" name="Hinh 5"/>
@@ -2952,7 +1357,7 @@
                     <pic:cNvPicPr/>
                   </pic:nvPicPr>
                   <pic:blipFill>
-                    <a:blip r:embed="rId905"/>
+                    <a:blip r:embed="rId19"/>
                     <a:stretch>
                       <a:fillRect/>
                     </a:stretch>
@@ -2989,29 +1394,49 @@
           <w:i/>
           <w:iCs/>
         </w:rPr>
-        <w:t xml:space="preserve">Hình 5. Phân bố thời lượng ngủ theo nghề nghiệp</w:t>
+        <w:t>Hình 5. Phân bố thời lượng ngủ theo nghề nghiệp</w:t>
       </w:r>
     </w:p>
     <w:p>
       <w:pPr>
         <w:pStyle w:val="BT"/>
-        <w:spacing w:before="0" w:after="120" w:line="276" w:lineRule="auto"/>
-        <w:jc w:val="both"/>
-      </w:pPr>
-      <w:r>
-        <w:t xml:space="preserve">Xét các nghề có từ 30 người trở lên, Engineer có trung vị thời lượng ngủ cao nhất (8.3 giờ) và Salesperson thấp nhất (6.4 giờ); Doctor và Nurse có độ phân tán rộng nhất. Tuy nhiên nghề nghiệp và giới tính trong dữ liệu gần như trùng nhau (toàn bộ 73 Nurse là nữ, 69 trên 71 Doctor là nam), nên khác biệt giữa các nghề không tách riêng được khỏi khác biệt giữa hai giới.</w:t>
+        <w:spacing w:before="0" w:line="276" w:lineRule="auto"/>
+      </w:pPr>
+      <w:r>
+        <w:t>Xét các nghề có từ 30 người trở lên, Engineer có trung vị thời lượng ngủ cao nhất (8.3 giờ) và Salesperson thấp nhất (6.4 giờ); Doctor và Nurse có độ phân tán rộng nhất. Tuy nhiên nghề nghiệp và giới tính trong dữ liệu gần như trùng nhau (toàn bộ 73 Nurse là nữ, 69 trên 71 Doctor là nam), nên khác biệt giữa các nghề không tách riêng được khỏi khác biệt giữa hai giới.</w:t>
       </w:r>
     </w:p>
     <w:p>
       <w:pPr>
         <w:pStyle w:val="BT"/>
-        <w:spacing w:before="0" w:after="120" w:line="276" w:lineRule="auto"/>
-        <w:jc w:val="both"/>
-      </w:pPr>
-      <w:r>
-        <w:t xml:space="preserve">Về huyết áp, nhóm Sleep Apnea có huyết áp trung bình cao nhất (137.8/92.7 mmHg), tiếp theo là Insomnia (132.0/86.9) và nhóm không mắc rối loạn (124.0/81.0). Thời lượng ngủ trung bình của ba nhóm không mắc, Insomnia và Sleep Apnea lần lượt là 7.36, 6.59 và 7.03 giờ; kiểm định ANOVA một yếu tố cho F = 31.91, p ≈ 1.6 × 10⁻¹³, tức sự khác biệt này có ý nghĩa thống kê ở mức 0.05.</w:t>
-      </w:r>
-    </w:p>
+        <w:spacing w:before="0" w:line="276" w:lineRule="auto"/>
+      </w:pPr>
+      <w:r>
+        <w:t>Về huyết áp, nhóm Sleep Apnea có huyết áp trung bình cao nhất (137.8/92.7 mmHg), tiếp theo là Insomnia (132.0/86.9) và nhóm không mắc rối loạn (124.0/81.0). Thời lượng ngủ trung bình của ba nhóm không mắc, Insomnia và Sleep Apnea lần lượt là 7.36, 6.59 và 7.03 giờ; kiểm định ANOVA một yếu tố cho F = 31.91, p ≈ 1.6 × 10⁻¹³, tức sự khác biệt này có ý nghĩa thống kê ở mức 0.05.</w:t>
+      </w:r>
+    </w:p>
+    <w:p>
+      <w:pPr>
+        <w:pStyle w:val="Heading1"/>
+        <w:rPr>
+          <w:lang w:val="en-US"/>
+        </w:rPr>
+      </w:pPr>
+      <w:r>
+        <w:rPr>
+          <w:lang w:val="en-US"/>
+        </w:rPr>
+        <w:t xml:space="preserve"> </w:t>
+      </w:r>
+      <w:r>
+        <w:rPr>
+          <w:lang w:val="en-US"/>
+        </w:rPr>
+        <w:tab/>
+        <w:t>PHÂN TÍCH THĂM DÒ</w:t>
+      </w:r>
+    </w:p>
+    <w:p/>
     <w:p>
       <w:pPr>
         <w:pStyle w:val="Heading1"/>
@@ -3019,9 +1444,7 @@
       </w:pPr>
       <w:r>
         <w:tab/>
-      </w:r>
-      <w:r>
-        <w:t xml:space="preserve">KẾT QUẢ MÔ HÌNH HỒI QUY</w:t>
+        <w:t>MÔ HÌNH HỒI QUY</w:t>
       </w:r>
     </w:p>
     <w:p>
@@ -3030,23 +1453,30 @@
         <w:spacing w:before="120" w:after="60"/>
         <w:rPr>
           <w:sz w:val="26"/>
+          <w:lang w:val="vi-VN"/>
         </w:rPr>
       </w:pPr>
       <w:r>
         <w:rPr>
           <w:sz w:val="26"/>
-        </w:rPr>
-        <w:t xml:space="preserve">Các mô hình trên toàn bộ dữ liệu</w:t>
+          <w:lang w:val="vi-VN"/>
+        </w:rPr>
+        <w:t>Các mô hình trên toàn bộ dữ liệu</w:t>
       </w:r>
     </w:p>
     <w:p>
       <w:pPr>
         <w:pStyle w:val="BT"/>
-        <w:spacing w:before="0" w:after="120" w:line="276" w:lineRule="auto"/>
-        <w:jc w:val="both"/>
-      </w:pPr>
-      <w:r>
-        <w:t xml:space="preserve">Trước tiên, nhóm huấn luyện bốn mô hình trên toàn bộ dữ liệu để so sánh mức độ khớp. Kết quả được trình bày ở Bảng 2.</w:t>
+        <w:spacing w:before="0" w:line="276" w:lineRule="auto"/>
+      </w:pPr>
+      <w:r>
+        <w:rPr>
+          <w:lang w:val="vi-VN"/>
+        </w:rPr>
+        <w:t xml:space="preserve">Trước tiên, nhóm huấn luyện bốn mô hình trên toàn bộ dữ liệu để so sánh mức độ khớp. </w:t>
+      </w:r>
+      <w:r>
+        <w:t>Kết quả được trình bày ở Bảng 2.</w:t>
       </w:r>
     </w:p>
     <w:tbl>
@@ -3064,8 +1494,10 @@
       </w:tblGrid>
       <w:tr>
         <w:trPr>
+          <w:cnfStyle w:val="100000000000" w:firstRow="1" w:lastRow="0" w:firstColumn="0" w:lastColumn="0" w:oddVBand="0" w:evenVBand="0" w:oddHBand="0" w:evenHBand="0" w:firstRowFirstColumn="0" w:firstRowLastColumn="0" w:lastRowFirstColumn="0" w:lastRowLastColumn="0"/>
           <w:cantSplit/>
           <w:tblHeader/>
+          <w:jc w:val="center"/>
         </w:trPr>
         <w:tc>
           <w:tcPr>
@@ -3083,7 +1515,7 @@
                 <w:b/>
                 <w:sz w:val="24"/>
               </w:rPr>
-              <w:t xml:space="preserve">Mô hình</w:t>
+              <w:t>Mô hình</w:t>
             </w:r>
           </w:p>
         </w:tc>
@@ -3103,7 +1535,7 @@
                 <w:b/>
                 <w:sz w:val="24"/>
               </w:rPr>
-              <w:t xml:space="preserve">Biến đầu vào</w:t>
+              <w:t>Biến đầu vào</w:t>
             </w:r>
           </w:p>
         </w:tc>
@@ -3123,7 +1555,7 @@
                 <w:b/>
                 <w:sz w:val="24"/>
               </w:rPr>
-              <w:t xml:space="preserve">R²</w:t>
+              <w:t>R²</w:t>
             </w:r>
           </w:p>
         </w:tc>
@@ -3143,7 +1575,7 @@
                 <w:b/>
                 <w:sz w:val="24"/>
               </w:rPr>
-              <w:t xml:space="preserve">MSE</w:t>
+              <w:t>MSE</w:t>
             </w:r>
           </w:p>
         </w:tc>
@@ -3151,6 +1583,7 @@
       <w:tr>
         <w:trPr>
           <w:cantSplit/>
+          <w:jc w:val="center"/>
         </w:trPr>
         <w:tc>
           <w:tcPr>
@@ -3167,7 +1600,7 @@
               <w:rPr>
                 <w:sz w:val="24"/>
               </w:rPr>
-              <w:t xml:space="preserve">Tuyến tính đơn</w:t>
+              <w:t>Tuyến tính đơn</w:t>
             </w:r>
           </w:p>
         </w:tc>
@@ -3186,7 +1619,7 @@
               <w:rPr>
                 <w:sz w:val="24"/>
               </w:rPr>
-              <w:t xml:space="preserve">Sleep Duration</w:t>
+              <w:t>Sleep Duration</w:t>
             </w:r>
           </w:p>
         </w:tc>
@@ -3205,7 +1638,7 @@
               <w:rPr>
                 <w:sz w:val="24"/>
               </w:rPr>
-              <w:t xml:space="preserve">0.780</w:t>
+              <w:t>0.780</w:t>
             </w:r>
           </w:p>
         </w:tc>
@@ -3224,7 +1657,7 @@
               <w:rPr>
                 <w:sz w:val="24"/>
               </w:rPr>
-              <w:t xml:space="preserve">0.314</w:t>
+              <w:t>0.314</w:t>
             </w:r>
           </w:p>
         </w:tc>
@@ -3232,6 +1665,7 @@
       <w:tr>
         <w:trPr>
           <w:cantSplit/>
+          <w:jc w:val="center"/>
         </w:trPr>
         <w:tc>
           <w:tcPr>
@@ -3248,7 +1682,7 @@
               <w:rPr>
                 <w:sz w:val="24"/>
               </w:rPr>
-              <w:t xml:space="preserve">Đa thức bậc 2</w:t>
+              <w:t>Đa thức bậc 2</w:t>
             </w:r>
           </w:p>
         </w:tc>
@@ -3267,7 +1701,7 @@
               <w:rPr>
                 <w:sz w:val="24"/>
               </w:rPr>
-              <w:t xml:space="preserve">Stress Level</w:t>
+              <w:t>Stress Level</w:t>
             </w:r>
           </w:p>
         </w:tc>
@@ -3286,7 +1720,7 @@
               <w:rPr>
                 <w:sz w:val="24"/>
               </w:rPr>
-              <w:t xml:space="preserve">0.809</w:t>
+              <w:t>0.809</w:t>
             </w:r>
           </w:p>
         </w:tc>
@@ -3305,7 +1739,7 @@
               <w:rPr>
                 <w:sz w:val="24"/>
               </w:rPr>
-              <w:t xml:space="preserve">0.273</w:t>
+              <w:t>0.273</w:t>
             </w:r>
           </w:p>
         </w:tc>
@@ -3313,6 +1747,7 @@
       <w:tr>
         <w:trPr>
           <w:cantSplit/>
+          <w:jc w:val="center"/>
         </w:trPr>
         <w:tc>
           <w:tcPr>
@@ -3329,7 +1764,7 @@
               <w:rPr>
                 <w:sz w:val="24"/>
               </w:rPr>
-              <w:t xml:space="preserve">Tuyến tính đa biến</w:t>
+              <w:t>Tuyến tính đa biến</w:t>
             </w:r>
           </w:p>
         </w:tc>
@@ -3348,7 +1783,7 @@
               <w:rPr>
                 <w:sz w:val="24"/>
               </w:rPr>
-              <w:t xml:space="preserve">Bốn biến</w:t>
+              <w:t>Bốn biến</w:t>
             </w:r>
           </w:p>
         </w:tc>
@@ -3367,7 +1802,7 @@
               <w:rPr>
                 <w:sz w:val="24"/>
               </w:rPr>
-              <w:t xml:space="preserve">0.897</w:t>
+              <w:t>0.897</w:t>
             </w:r>
           </w:p>
         </w:tc>
@@ -3386,7 +1821,7 @@
               <w:rPr>
                 <w:sz w:val="24"/>
               </w:rPr>
-              <w:t xml:space="preserve">0.147</w:t>
+              <w:t>0.147</w:t>
             </w:r>
           </w:p>
         </w:tc>
@@ -3394,6 +1829,7 @@
       <w:tr>
         <w:trPr>
           <w:cantSplit/>
+          <w:jc w:val="center"/>
         </w:trPr>
         <w:tc>
           <w:tcPr>
@@ -3410,7 +1846,7 @@
               <w:rPr>
                 <w:sz w:val="24"/>
               </w:rPr>
-              <w:t xml:space="preserve">Chuẩn hóa + đa thức bậc 2 + tuyến tính</w:t>
+              <w:t>Chuẩn hóa + đa thức bậc 2 + tuyến tính</w:t>
             </w:r>
           </w:p>
         </w:tc>
@@ -3429,7 +1865,7 @@
               <w:rPr>
                 <w:sz w:val="24"/>
               </w:rPr>
-              <w:t xml:space="preserve">Bốn biến</w:t>
+              <w:t>Bốn biến</w:t>
             </w:r>
           </w:p>
         </w:tc>
@@ -3448,7 +1884,7 @@
               <w:rPr>
                 <w:sz w:val="24"/>
               </w:rPr>
-              <w:t xml:space="preserve">0.959</w:t>
+              <w:t>0.959</w:t>
             </w:r>
           </w:p>
         </w:tc>
@@ -3467,7 +1903,7 @@
               <w:rPr>
                 <w:sz w:val="24"/>
               </w:rPr>
-              <w:t xml:space="preserve">0.059</w:t>
+              <w:t>0.059</w:t>
             </w:r>
           </w:p>
         </w:tc>
@@ -3489,17 +1925,17 @@
           <w:i/>
           <w:iCs/>
         </w:rPr>
-        <w:t xml:space="preserve">Bảng 2. Mức độ khớp của các mô hình trên toàn bộ dữ liệu</w:t>
+        <w:t>Bảng 2. Mức độ khớp của các mô hình trên toàn bộ dữ liệu</w:t>
       </w:r>
     </w:p>
     <w:p>
       <w:pPr>
         <w:pStyle w:val="BT"/>
-        <w:spacing w:before="0" w:after="120" w:line="276" w:lineRule="auto"/>
-        <w:jc w:val="both"/>
-      </w:pPr>
-      <w:r>
-        <w:t xml:space="preserve">Mô hình tuyến tính đơn có phương trình Quality of Sleep = −2.163 + 1.329 × Sleep Duration. Trong mô hình đa biến, hệ số của Sleep Duration là 0.605 và của Stress Level là −0.313, cùng chiều với tương quan đã thấy ở phần phân tích thăm dò. R² tăng dần theo độ phức tạp, nhưng các chỉ số này được tính trên chính dữ liệu huấn luyện nên chưa cho biết mô hình nào dự đoán dữ liệu mới tốt hơn.</w:t>
+        <w:spacing w:before="0" w:line="276" w:lineRule="auto"/>
+      </w:pPr>
+      <w:r>
+        <w:lastRenderedPageBreak/>
+        <w:t>Mô hình tuyến tính đơn có phương trình Quality of Sleep = −2.163 + 1.329 × Sleep Duration. Trong mô hình đa biến, hệ số của Sleep Duration là 0.605 và của Stress Level là −0.313, cùng chiều với tương quan đã thấy ở phần phân tích thăm dò. R² tăng dần theo độ phức tạp, nhưng các chỉ số này được tính trên chính dữ liệu huấn luyện nên chưa cho biết mô hình nào dự đoán dữ liệu mới tốt hơn.</w:t>
       </w:r>
     </w:p>
     <w:p>
@@ -3514,17 +1950,16 @@
         <w:rPr>
           <w:sz w:val="26"/>
         </w:rPr>
-        <w:t xml:space="preserve">Đánh giá trên dữ liệu chưa từng thấy</w:t>
+        <w:t>Đánh giá trên dữ liệu chưa từng thấy</w:t>
       </w:r>
     </w:p>
     <w:p>
       <w:pPr>
         <w:pStyle w:val="BT"/>
-        <w:spacing w:before="0" w:after="120" w:line="276" w:lineRule="auto"/>
-        <w:jc w:val="both"/>
-      </w:pPr>
-      <w:r>
-        <w:t xml:space="preserve">Bảng 3 trình bày kết quả đánh giá theo phương pháp chia theo hồ sơ cho hai mô hình dùng cả bốn biến; với Ridge, kiểm định chéo được thực hiện trên tập huấn luyện để chọn alpha.</w:t>
+        <w:spacing w:before="0" w:line="276" w:lineRule="auto"/>
+      </w:pPr>
+      <w:r>
+        <w:t>Bảng 3 trình bày kết quả đánh giá theo phương pháp chia theo hồ sơ cho hai mô hình dùng cả bốn biến; với Ridge, kiểm định chéo được thực hiện trên tập huấn luyện để chọn alpha.</w:t>
       </w:r>
     </w:p>
     <w:tbl>
@@ -3542,8 +1977,10 @@
       </w:tblGrid>
       <w:tr>
         <w:trPr>
+          <w:cnfStyle w:val="100000000000" w:firstRow="1" w:lastRow="0" w:firstColumn="0" w:lastColumn="0" w:oddVBand="0" w:evenVBand="0" w:oddHBand="0" w:evenHBand="0" w:firstRowFirstColumn="0" w:firstRowLastColumn="0" w:lastRowFirstColumn="0" w:lastRowLastColumn="0"/>
           <w:cantSplit/>
           <w:tblHeader/>
+          <w:jc w:val="center"/>
         </w:trPr>
         <w:tc>
           <w:tcPr>
@@ -3561,7 +1998,7 @@
                 <w:b/>
                 <w:sz w:val="24"/>
               </w:rPr>
-              <w:t xml:space="preserve">Mô hình</w:t>
+              <w:t>Mô hình</w:t>
             </w:r>
           </w:p>
         </w:tc>
@@ -3581,7 +2018,7 @@
                 <w:b/>
                 <w:sz w:val="24"/>
               </w:rPr>
-              <w:t xml:space="preserve">R² huấn luyện</w:t>
+              <w:t>R² huấn luyện</w:t>
             </w:r>
           </w:p>
         </w:tc>
@@ -3601,7 +2038,7 @@
                 <w:b/>
                 <w:sz w:val="24"/>
               </w:rPr>
-              <w:t xml:space="preserve">R² kiểm tra</w:t>
+              <w:t>R² kiểm tra</w:t>
             </w:r>
           </w:p>
         </w:tc>
@@ -3621,7 +2058,7 @@
                 <w:b/>
                 <w:sz w:val="24"/>
               </w:rPr>
-              <w:t xml:space="preserve">R² kiểm định chéo</w:t>
+              <w:t>R² kiểm định chéo</w:t>
             </w:r>
           </w:p>
         </w:tc>
@@ -3629,6 +2066,7 @@
       <w:tr>
         <w:trPr>
           <w:cantSplit/>
+          <w:jc w:val="center"/>
         </w:trPr>
         <w:tc>
           <w:tcPr>
@@ -3645,7 +2083,7 @@
               <w:rPr>
                 <w:sz w:val="24"/>
               </w:rPr>
-              <w:t xml:space="preserve">Tuyến tính bốn biến</w:t>
+              <w:t>Tuyến tính bốn biến</w:t>
             </w:r>
           </w:p>
         </w:tc>
@@ -3664,7 +2102,7 @@
               <w:rPr>
                 <w:sz w:val="24"/>
               </w:rPr>
-              <w:t xml:space="preserve">0.889</w:t>
+              <w:t>0.889</w:t>
             </w:r>
           </w:p>
         </w:tc>
@@ -3683,7 +2121,7 @@
               <w:rPr>
                 <w:sz w:val="24"/>
               </w:rPr>
-              <w:t xml:space="preserve">0.914</w:t>
+              <w:t>0.914</w:t>
             </w:r>
           </w:p>
         </w:tc>
@@ -3702,7 +2140,7 @@
               <w:rPr>
                 <w:sz w:val="24"/>
               </w:rPr>
-              <w:t xml:space="preserve">0.875 (0.826–0.925)</w:t>
+              <w:t>0.875 (0.826–0.925)</w:t>
             </w:r>
           </w:p>
         </w:tc>
@@ -3710,6 +2148,7 @@
       <w:tr>
         <w:trPr>
           <w:cantSplit/>
+          <w:jc w:val="center"/>
         </w:trPr>
         <w:tc>
           <w:tcPr>
@@ -3726,7 +2165,7 @@
               <w:rPr>
                 <w:sz w:val="24"/>
               </w:rPr>
-              <w:t xml:space="preserve">Ridge, đa thức bậc 3, alpha = 8.69</w:t>
+              <w:t>Ridge, đa thức bậc 3, alpha = 8.69</w:t>
             </w:r>
           </w:p>
         </w:tc>
@@ -3745,7 +2184,7 @@
               <w:rPr>
                 <w:sz w:val="24"/>
               </w:rPr>
-              <w:t xml:space="preserve">0.958</w:t>
+              <w:t>0.958</w:t>
             </w:r>
           </w:p>
         </w:tc>
@@ -3764,7 +2203,7 @@
               <w:rPr>
                 <w:sz w:val="24"/>
               </w:rPr>
-              <w:t xml:space="preserve">0.953</w:t>
+              <w:t>0.953</w:t>
             </w:r>
           </w:p>
         </w:tc>
@@ -3783,7 +2222,7 @@
               <w:rPr>
                 <w:sz w:val="24"/>
               </w:rPr>
-              <w:t xml:space="preserve">0.910</w:t>
+              <w:t>0.910</w:t>
             </w:r>
           </w:p>
         </w:tc>
@@ -3805,27 +2244,25 @@
           <w:i/>
           <w:iCs/>
         </w:rPr>
-        <w:t xml:space="preserve">Bảng 3. Kết quả đánh giá trên tập huấn luyện, tập kiểm tra và kiểm định chéo</w:t>
+        <w:t>Bảng 3. Kết quả đánh giá trên tập huấn luyện, tập kiểm tra và kiểm định chéo</w:t>
       </w:r>
     </w:p>
     <w:p>
       <w:pPr>
         <w:pStyle w:val="BT"/>
-        <w:spacing w:before="0" w:after="120" w:line="276" w:lineRule="auto"/>
-        <w:jc w:val="both"/>
-      </w:pPr>
-      <w:r>
-        <w:t xml:space="preserve">Với mô hình tuyến tính, R² trên tập huấn luyện và tập kiểm tra gần nhau, và R² qua năm phần kiểm định chéo dao động trong khoảng hẹp, nên mô hình không có dấu hiệu overfitting. Riêng với mô hình đa thức một biến theo Stress Level, R² kiểm tra tăng từ 0.804 ở bậc 1 lên 0.878 ở bậc 5 và không giảm khi tăng bậc, vì biến này chỉ có 6 giá trị khác nhau nên đa thức bậc 5 đã là mức phức tạp tối đa.</w:t>
+        <w:spacing w:before="0" w:line="276" w:lineRule="auto"/>
+      </w:pPr>
+      <w:r>
+        <w:t>Với mô hình tuyến tính, R² trên tập huấn luyện và tập kiểm tra gần nhau, và R² qua năm phần kiểm định chéo dao động trong khoảng hẹp, nên mô hình không có dấu hiệu overfitting. Riêng với mô hình đa thức một biến theo Stress Level, R² kiểm tra tăng từ 0.804 ở bậc 1 lên 0.878 ở bậc 5 và không giảm khi tăng bậc, vì biến này chỉ có 6 giá trị khác nhau nên đa thức bậc 5 đã là mức phức tạp tối đa.</w:t>
       </w:r>
     </w:p>
     <w:p>
       <w:pPr>
         <w:pStyle w:val="BT"/>
-        <w:spacing w:before="0" w:after="120" w:line="276" w:lineRule="auto"/>
-        <w:jc w:val="both"/>
-      </w:pPr>
-      <w:r>
-        <w:t xml:space="preserve">Với mô hình Ridge, Hình 6 cho thấy ảnh hưởng của hệ số điều chuẩn alpha đến R².</w:t>
+        <w:spacing w:before="0" w:line="276" w:lineRule="auto"/>
+      </w:pPr>
+      <w:r>
+        <w:t>Với mô hình Ridge, Hình 6 cho thấy ảnh hưởng của hệ số điều chuẩn alpha đến R².</w:t>
       </w:r>
     </w:p>
     <w:p>
@@ -3837,8 +2274,11 @@
         <w:jc w:val="center"/>
       </w:pPr>
       <w:r>
+        <w:rPr>
+          <w:noProof/>
+        </w:rPr>
         <w:drawing>
-          <wp:inline distT="0" distB="0" distL="0" distR="0">
+          <wp:inline distT="0" distB="0" distL="0" distR="0" wp14:anchorId="6A49336B" wp14:editId="1546880F">
             <wp:extent cx="4428000" cy="2424380"/>
             <wp:effectExtent l="0" t="0" r="0" b="0"/>
             <wp:docPr id="206" name="Hinh 6"/>
@@ -3853,7 +2293,7 @@
                     <pic:cNvPicPr/>
                   </pic:nvPicPr>
                   <pic:blipFill>
-                    <a:blip r:embed="rId906"/>
+                    <a:blip r:embed="rId20"/>
                     <a:stretch>
                       <a:fillRect/>
                     </a:stretch>
@@ -3890,17 +2330,16 @@
           <w:i/>
           <w:iCs/>
         </w:rPr>
-        <w:t xml:space="preserve">Hình 6. R² của mô hình Ridge theo hệ số điều chuẩn alpha</w:t>
+        <w:t>Hình 6. R² của mô hình Ridge theo hệ số điều chuẩn alpha</w:t>
       </w:r>
     </w:p>
     <w:p>
       <w:pPr>
         <w:pStyle w:val="BT"/>
-        <w:spacing w:before="0" w:after="120" w:line="276" w:lineRule="auto"/>
-        <w:jc w:val="both"/>
-      </w:pPr>
-      <w:r>
-        <w:t xml:space="preserve">Khi alpha nhỏ (0.01), R² huấn luyện rất cao (khoảng 0.98) nhưng R² kiểm định chỉ khoảng 0.24, tức mô hình overfitting nặng. Khi alpha quá lớn, các hệ số bị phạt quá mạnh và R² giảm trên cả hai tập. Giá trị tối ưu là alpha = 8.69. Với giá trị này, Ridge đạt R² = 0.953 trên tập kiểm tra, cao hơn mô hình tuyến tính (0.914).</w:t>
+        <w:spacing w:before="0" w:line="276" w:lineRule="auto"/>
+      </w:pPr>
+      <w:r>
+        <w:t>Khi alpha nhỏ (0.01), R² huấn luyện rất cao (khoảng 0.98) nhưng R² kiểm định chỉ khoảng 0.24, tức mô hình overfitting nặng. Khi alpha quá lớn, các hệ số bị phạt quá mạnh và R² giảm trên cả hai tập. Giá trị tối ưu là alpha = 8.69. Với giá trị này, Ridge đạt R² = 0.953 trên tập kiểm tra, cao hơn mô hình tuyến tính (0.914).</w:t>
       </w:r>
     </w:p>
     <w:p>
@@ -3915,17 +2354,17 @@
         <w:rPr>
           <w:sz w:val="26"/>
         </w:rPr>
-        <w:t xml:space="preserve">Độ ổn định của kết quả</w:t>
+        <w:lastRenderedPageBreak/>
+        <w:t>Độ ổn định của kết quả</w:t>
       </w:r>
     </w:p>
     <w:p>
       <w:pPr>
         <w:pStyle w:val="BT"/>
-        <w:spacing w:before="0" w:after="120" w:line="276" w:lineRule="auto"/>
-        <w:jc w:val="both"/>
-      </w:pPr>
-      <w:r>
-        <w:t xml:space="preserve">Vì dữ liệu chỉ có 132 hồ sơ khác nhau, nhóm lặp lại việc chia dữ liệu 30 lần với các cách chia khác nhau để kiểm tra độ ổn định. Ridge bậc 3 cho R² kiểm tra cao hơn mô hình tuyến tính ở 23 trên 30 lần, nhưng R² trung bình lại thấp hơn (0.855 so với 0.877) vì ở một số lần chia mô hình này giảm rất mạnh, thấp nhất xuống dưới 0. Mô hình tuyến tính ổn định hơn, với R² thấp nhất trong 30 lần vẫn đạt 0.795.</w:t>
+        <w:spacing w:before="0" w:line="276" w:lineRule="auto"/>
+      </w:pPr>
+      <w:r>
+        <w:t>Vì dữ liệu chỉ có 132 hồ sơ khác nhau, nhóm lặp lại việc chia dữ liệu 30 lần với các cách chia khác nhau để kiểm tra độ ổn định. Ridge bậc 3 cho R² kiểm tra cao hơn mô hình tuyến tính ở 23 trên 30 lần, nhưng R² trung bình lại thấp hơn (0.855 so với 0.877) vì ở một số lần chia mô hình này giảm rất mạnh, thấp nhất xuống dưới 0. Mô hình tuyến tính ổn định hơn, với R² thấp nhất trong 30 lần vẫn đạt 0.795.</w:t>
       </w:r>
     </w:p>
     <w:p>
@@ -3935,29 +2374,34 @@
       </w:pPr>
       <w:r>
         <w:tab/>
-      </w:r>
-      <w:r>
-        <w:t xml:space="preserve">KẾT LUẬN</w:t>
+        <w:t>KẾT LUẬN</w:t>
       </w:r>
     </w:p>
     <w:p>
       <w:pPr>
         <w:pStyle w:val="BT"/>
-        <w:spacing w:before="0" w:after="120" w:line="276" w:lineRule="auto"/>
-        <w:jc w:val="both"/>
-      </w:pPr>
-      <w:r>
-        <w:t xml:space="preserve">Đề tài đã phân tích thăm dò bộ dữ liệu Sleep Health and Lifestyle và xây dựng mô hình hồi quy dự đoán chất lượng giấc ngủ, theo quy trình tiền xử lý, trực quan hóa, xây dựng và đánh giá mô hình, với kết quả được trình bày trên dashboard Streamlit. Về phân tích thăm dò, chất lượng giấc ngủ liên hệ mạnh nhất với mức độ căng thẳng (r = −0.90) và thời lượng ngủ (r = 0.88); thể trạng liên hệ rất rõ với rối loạn giấc ngủ; Insomnia tập trung ở nhóm 36–50 tuổi còn Sleep Apnea chiếm tỷ lệ cao nhất ở nhóm 51–65 tuổi. Về mô hình, hồi quy tuyến tính bốn biến đạt R² = 0.914 trên tập kiểm tra và Ridge trên đa thức bậc 3 đạt 0.953.</w:t>
+        <w:spacing w:before="0" w:line="276" w:lineRule="auto"/>
+        <w:rPr>
+          <w:lang w:val="vi-VN"/>
+        </w:rPr>
+      </w:pPr>
+      <w:r>
+        <w:rPr>
+          <w:lang w:val="vi-VN"/>
+        </w:rPr>
+        <w:t>Đề tài đã phân tích thăm dò bộ dữ liệu Sleep Health and Lifestyle và xây dựng mô hình hồi quy dự đoán chất lượng giấc ngủ, theo quy trình tiền xử lý, trực quan hóa, xây dựng và đánh giá mô hình, với kết quả được trình bày trên dashboard Streamlit. Về phân tích thăm dò, chất lượng giấc ngủ liên hệ mạnh nhất với mức độ căng thẳng (r = −0.90) và thời lượng ngủ (r = 0.88); thể trạng liên hệ rất rõ với rối loạn giấc ngủ; Insomnia tập trung ở nhóm 36–50 tuổi còn Sleep Apnea chiếm tỷ lệ cao nhất ở nhóm 51–65 tuổi. Về mô hình, hồi quy tuyến tính bốn biến đạt R² = 0.914 trên tập kiểm tra và Ridge trên đa thức bậc 3 đạt 0.953.</w:t>
       </w:r>
     </w:p>
     <w:p>
       <w:pPr>
         <w:pStyle w:val="BT"/>
-        <w:spacing w:before="0" w:after="120" w:line="276" w:lineRule="auto"/>
-        <w:jc w:val="both"/>
+        <w:spacing w:before="0" w:line="276" w:lineRule="auto"/>
+        <w:rPr>
+          <w:lang w:val="vi-VN"/>
+        </w:rPr>
         <w:sectPr>
-          <w:headerReference w:type="default" r:id="rId24"/>
-          <w:footerReference w:type="default" r:id="rId25"/>
+          <w:headerReference w:type="default" r:id="rId21"/>
+          <w:footerReference w:type="default" r:id="rId22"/>
           <w:type w:val="continuous"/>
           <w:pgSz w:w="11907" w:h="16840" w:code="9"/>
           <w:pgMar w:top="1440" w:right="1134" w:bottom="1440" w:left="1701" w:header="709" w:footer="709" w:gutter="0"/>
@@ -3967,7 +2411,10 @@
         </w:sectPr>
       </w:pPr>
       <w:r>
-        <w:t xml:space="preserve">Nhóm đánh giá mô hình tuyến tính bốn biến là lựa chọn phù hợp nhất với bộ dữ liệu này: mô hình đơn giản, dễ giải thích và cho kết quả ổn định qua các cách chia dữ liệu, trong khi mô hình Ridge bậc 3 thường nhỉnh hơn nhưng có lần giảm mạnh. Các kết quả cần được hiểu trong giới hạn của dữ liệu: chỉ có 132 hồ sơ khác nhau, nghề nghiệp gần như trùng với giới tính, và dữ liệu thu thập tại một thời điểm nên chỉ cho thấy mối liên hệ chứ không chứng minh quan hệ nhân quả. Điểm nhóm rút ra được rõ nhất là cách chia dữ liệu quyết định độ tin cậy của kết quả đánh giá: nếu để các dòng trùng lặp rơi vào cả hai tập thì R² trên tập kiểm tra bị thổi phồng.</w:t>
+        <w:rPr>
+          <w:lang w:val="vi-VN"/>
+        </w:rPr>
+        <w:t>Nhóm đánh giá mô hình tuyến tính bốn biến là lựa chọn phù hợp nhất với bộ dữ liệu này: mô hình đơn giản, dễ giải thích và cho kết quả ổn định qua các cách chia dữ liệu, trong khi mô hình Ridge bậc 3 thường nhỉnh hơn nhưng có lần giảm mạnh. Các kết quả cần được hiểu trong giới hạn của dữ liệu: chỉ có 132 hồ sơ khác nhau, nghề nghiệp gần như trùng với giới tính, và dữ liệu thu thập tại một thời điểm nên chỉ cho thấy mối liên hệ chứ không chứng minh quan hệ nhân quả. Điểm nhóm rút ra được rõ nhất là cách chia dữ liệu quyết định độ tin cậy của kết quả đánh giá: nếu để các dòng trùng lặp rơi vào cả hai tập thì R² trên tập kiểm tra bị thổi phồng.</w:t>
       </w:r>
     </w:p>
     <w:p>
@@ -4003,7 +2450,7 @@
         <w:rPr>
           <w:lang w:val="vi-VN"/>
         </w:rPr>
-        <w:t xml:space="preserve">Sleep Health and Lifestyle Dataset. Link: https://www.kaggle.com/datasets/uom190346a/sleep-health-and-lifestyle-dataset (Ngày truy cập: 11/10/2026).</w:t>
+        <w:t>Sleep Health and Lifestyle Dataset. Link: https://www.kaggle.com/datasets/uom190346a/sleep-health-and-lifestyle-dataset (Ngày truy cập: 11/10/2026).</w:t>
       </w:r>
     </w:p>
     <w:p>
@@ -4017,7 +2464,7 @@
         <w:rPr>
           <w:lang w:val="vi-VN"/>
         </w:rPr>
-        <w:t xml:space="preserve">scikit-learn: Cross-validation – evaluating estimator performance. Link: https://scikit-learn.org/stable/modules/cross_validation.html (Ngày truy cập: 11/10/2026).</w:t>
+        <w:t>scikit-learn: Cross-validation – evaluating estimator performance. Link: https://scikit-learn.org/stable/modules/cross_validation.html (Ngày truy cập: 11/10/2026).</w:t>
       </w:r>
     </w:p>
     <w:p>
@@ -4031,7 +2478,7 @@
         <w:rPr>
           <w:lang w:val="vi-VN"/>
         </w:rPr>
-        <w:t xml:space="preserve">Streamlit documentation. Link: https://docs.streamlit.io (Ngày truy cập: 11/10/2026).</w:t>
+        <w:t>Streamlit documentation. Link: https://docs.streamlit.io (Ngày truy cập: 11/10/2026).</w:t>
       </w:r>
     </w:p>
     <w:p>
@@ -4177,7 +2624,7 @@
               <w:rPr>
                 <w:lang w:val="vi-VN"/>
               </w:rPr>
-              <w:t xml:space="preserve">1</w:t>
+              <w:t>1</w:t>
             </w:r>
           </w:p>
         </w:tc>
@@ -4190,7 +2637,7 @@
               <w:spacing w:before="60" w:after="0" w:line="276" w:lineRule="auto"/>
             </w:pPr>
             <w:r>
-              <w:t xml:space="preserve">Lê Đình Tiến Anh</w:t>
+              <w:t>Lê Đình Tiến Anh</w:t>
             </w:r>
           </w:p>
         </w:tc>
@@ -4202,9 +2649,6 @@
             <w:pPr>
               <w:spacing w:before="60" w:after="0" w:line="276" w:lineRule="auto"/>
             </w:pPr>
-            <w:r>
-              <w:t xml:space="preserve">Dựng khung dashboard Streamlit (điều hướng, bộ lọc, nạp dữ liệu); làm trang tổng quan và trang tiền xử lý dữ liệu; quản lý kho mã nguồn và file hướng dẫn chạy; viết phần mô tả bộ dữ liệu; tham gia kiểm tra chéo số liệu.</w:t>
-            </w:r>
           </w:p>
         </w:tc>
       </w:tr>
@@ -4225,7 +2669,7 @@
               <w:rPr>
                 <w:lang w:val="vi-VN"/>
               </w:rPr>
-              <w:t xml:space="preserve">2</w:t>
+              <w:t>2</w:t>
             </w:r>
           </w:p>
         </w:tc>
@@ -4238,7 +2682,7 @@
               <w:spacing w:before="60" w:after="0" w:line="276" w:lineRule="auto"/>
             </w:pPr>
             <w:r>
-              <w:t xml:space="preserve">Nguyễn Đức Nghĩa</w:t>
+              <w:t>Nguyễn Đức Nghĩa</w:t>
             </w:r>
           </w:p>
         </w:tc>
@@ -4250,9 +2694,6 @@
             <w:pPr>
               <w:spacing w:before="60" w:after="0" w:line="276" w:lineRule="auto"/>
             </w:pPr>
-            <w:r>
-              <w:t xml:space="preserve">Xây dựng các mô hình hồi quy và phần đánh giá mô hình (chia dữ liệu theo hồ sơ, kiểm định chéo, Ridge); rà soát số liệu của toàn bộ dashboard và báo cáo; viết phần phương pháp và kết quả mô hình; tổng hợp báo cáo.</w:t>
-            </w:r>
           </w:p>
         </w:tc>
       </w:tr>
@@ -4273,7 +2714,7 @@
               <w:rPr>
                 <w:lang w:val="vi-VN"/>
               </w:rPr>
-              <w:t xml:space="preserve">3</w:t>
+              <w:t>3</w:t>
             </w:r>
           </w:p>
         </w:tc>
@@ -4286,7 +2727,7 @@
               <w:spacing w:before="60" w:after="0" w:line="276" w:lineRule="auto"/>
             </w:pPr>
             <w:r>
-              <w:t xml:space="preserve">Dương Hồng Luyến</w:t>
+              <w:t>Dương Hồng Luyến</w:t>
             </w:r>
           </w:p>
         </w:tc>
@@ -4298,9 +2739,6 @@
             <w:pPr>
               <w:spacing w:before="60" w:after="0" w:line="276" w:lineRule="auto"/>
             </w:pPr>
-            <w:r>
-              <w:t xml:space="preserve">Làm các trang trực quan hóa và công cụ trực quan (rối loạn theo tuổi, huyết áp, nghề nghiệp, ma trận tương quan, radar); viết nhận xét cho các biểu đồ này; viết phần kết quả phân tích thăm dò; tham gia làm slide thuyết trình.</w:t>
-            </w:r>
           </w:p>
         </w:tc>
       </w:tr>
@@ -4321,7 +2759,7 @@
               <w:rPr>
                 <w:lang w:val="vi-VN"/>
               </w:rPr>
-              <w:t xml:space="preserve">4</w:t>
+              <w:t>4</w:t>
             </w:r>
           </w:p>
         </w:tc>
@@ -4334,7 +2772,7 @@
               <w:spacing w:before="60" w:after="0" w:line="276" w:lineRule="auto"/>
             </w:pPr>
             <w:r>
-              <w:t xml:space="preserve">Nguyễn Thị Ngọc Nhung</w:t>
+              <w:t>Nguyễn Thị Ngọc Nhung</w:t>
             </w:r>
           </w:p>
         </w:tc>
@@ -4346,15 +2784,13 @@
             <w:pPr>
               <w:spacing w:before="60" w:after="0" w:line="276" w:lineRule="auto"/>
             </w:pPr>
-            <w:r>
-              <w:t xml:space="preserve">Làm trang phân tích thăm dò (rối loạn theo BMI, nhịp tim, số bước chân) và kiểm định ANOVA; cập nhật notebook minh họa; viết phần giới thiệu và kết luận; tham gia làm slide thuyết trình và kiểm tra chéo số liệu.</w:t>
-            </w:r>
           </w:p>
         </w:tc>
       </w:tr>
     </w:tbl>
+    <w:p/>
     <w:sectPr>
-      <w:footerReference w:type="default" r:id="rId27"/>
+      <w:footerReference w:type="default" r:id="rId23"/>
       <w:pgSz w:w="11907" w:h="16840" w:code="9"/>
       <w:pgMar w:top="1440" w:right="1134" w:bottom="1440" w:left="1701" w:header="709" w:footer="709" w:gutter="0"/>
       <w:pgNumType w:start="0"/>

</xml_diff>